<commit_message>
Finalize round 3 paper results
</commit_message>
<xml_diff>
--- a/paper/final/final_draft.docx
+++ b/paper/final/final_draft.docx
@@ -14,7 +14,7 @@
           <w:i w:val="0"/>
           <w:sz w:val="26"/>
         </w:rPr>
-        <w:t>철도 운영 규정 질의응답을 위한 승인 링크 기반 선택적 Graph RAG</w:t>
+        <w:t>사람 승인 교차문서 링크를 이용한 철도 규정 근거 검색 향상</w:t>
       </w:r>
     </w:p>
     <w:p>
@@ -29,7 +29,7 @@
           <w:i/>
           <w:sz w:val="18"/>
         </w:rPr>
-        <w:t>Selective Graph RAG with Human-Approved Cross-Document Links for Railway Operation Regulation QA</w:t>
+        <w:t>Improving Evidence Retrieval for Railway Regulation QA with Human-Approved Cross-Document Links</w:t>
       </w:r>
     </w:p>
     <w:p>
@@ -60,7 +60,7 @@
           <w:i w:val="0"/>
           <w:sz w:val="18"/>
         </w:rPr>
-        <w:t>철도 운전 질문에는 일반 규정과 현장 길라잡이의 노선별 조치가 함께 필요하다.</w:t>
+        <w:t>철도 규정 질의는 일반 규정과 현장 길라잡이의 노선별 조치를 함께 요구할 수 있다.</w:t>
       </w:r>
       <w:r>
         <w:rPr>
@@ -77,7 +77,7 @@
           <w:i w:val="0"/>
           <w:sz w:val="18"/>
         </w:rPr>
-        <w:t>본 연구는 관리자 승인 문서 구간 링크를 따라 근거를 확장하고 연결 근거만 질문별로 다시 고르는 Graph RAG 운영 설계를 다룬다.</w:t>
+        <w:t>본 연구는 사람이 승인한 교차문서 구간 링크를 검색 확장 경계로 평가하고, 링크 근거만 다시 고르는 선택 재정렬을 부차 기여로 분석한다.</w:t>
       </w:r>
       <w:r>
         <w:rPr>
@@ -94,7 +94,7 @@
           <w:i w:val="0"/>
           <w:sz w:val="18"/>
         </w:rPr>
-        <w:t>신규 그래프 사례 15건에서 제안법의 검색 Precision/Recall은 0.800/0.889, Context Precision/Recall은 0.968/0.944였다.</w:t>
+        <w:t>그래프 질의 20건에서 링크 기반 두 방식은 `hybrid_rerank`보다 Recall을 0.253–0.264, 링크 정답 Recall을 0.475–0.517 높였다.</w:t>
       </w:r>
       <w:r>
         <w:rPr>
@@ -111,7 +111,7 @@
           <w:i w:val="0"/>
           <w:sz w:val="18"/>
         </w:rPr>
-        <w:t>신규 정답 라벨은 미검수이고 비교군도 부분 실행이므로 이 수치는 탐색 결과이며, 성능 우월성이나 현장 안전성의 근거가 아니다.</w:t>
+        <w:t>다만 20건 중 15건은 해당 링크에서 LLM이 초안한 미검수 사례이므로, 결과는 탐색적 파이프라인 평가로 한정한다.</w:t>
       </w:r>
     </w:p>
     <w:p>
@@ -155,7 +155,7 @@
           <w:i w:val="0"/>
           <w:sz w:val="18"/>
         </w:rPr>
-        <w:t>기관사와 관제원이 설비 고장 대응을 확인할 때는 길라잡이의 구체 조치와 규정의 보고·운전 조건을 함께 찾아야 한다. 예를 들어 보조전원장치 기동불능 질의는 연장급전·부하감소 절차와 관제 보고 의무를 함께 확인한다. 본 연구의 범위는 오프라인 근거 확인·검토 지원이며, 운전 지시를 제공하거나 대체하지 않는다.</w:t>
+        <w:t>기관사와 관제원이 설비 고장 대응을 확인할 때는 길라잡이의 구체 조치와 규정의 보고·운전 조건을 함께 찾아야 한다. 예를 들어 보조전원장치 기동불능 질의에는 연장급전·부하감소 절차와 관제 보고 의무가 모두 필요할 수 있다. 본 연구가 다루는 범위는 오프라인 근거 확인·검토 지원이며, 운전 지시를 제공하거나 대체하지 않는다.</w:t>
       </w:r>
     </w:p>
     <w:p>
@@ -170,7 +170,7 @@
           <w:i w:val="0"/>
           <w:sz w:val="18"/>
         </w:rPr>
-        <w:t>검색 증강 생성은 외부 근거를 답변에 연결하고[1], LLM 재정렬은 검색 후보의 질의 관련 순서를 조정한다[2]. GraphRAG와 LightRAG는 문서에서 관계 그래프를 구성하며[3,4], KG²RAG는 검색 seed와 연결된 문단을 그래프로 확장한다[5]. 철도 QA의 CARAG는 공간·사례 지식 그래프를 탐색하고, 도시철도 출입문 RAG는 고장 이력·하이브리드 검색·재정렬을 이용한다[6,7]. LegalBench-RAG는 평가용 전문가 근거 구간을 제공하고[8], 한국어 법률 하이브리드 RAG는 검색 조합을 최적화한다[9]. 이 연구들은 각각 그래프 구성, 검색 확장, 평가 주석을 다룬다. 본 연구는 새 검색 알고리즘의 우월성을 주장하지 않고, 관리자가 승인한 규정–길라잡이 구간 링크를 확장 경계로 삼아 링크 유래 근거만 질문별로 선택하는 운영 설계에 한정한다.</w:t>
+        <w:t>검색 증강 생성은 외부 근거를 답변에 연결하고[1], LLM 재정렬은 검색 후보의 질의 관련 순서를 조정한다[2]. GraphRAG와 LightRAG는 문서에서 관계 그래프를 구성하며[3,4], KG²RAG는 검색 seed와 연결된 문단을 확장한다[5]. 철도 QA의 CARAG는 공간·사례 그래프를 탐색하고, 도시철도 출입문 RAG는 고장 이력과 재정렬을 이용한다[6,7]. LegalBench-RAG는 평가용 전문가 근거 주석을 제공하며[8], 한국어 법률 하이브리드 RAG는 검색 조합을 최적화한다[9]. 본 연구는 새 검색 알고리즘의 우월성을 주장하지 않고, 사람이 승인한 규정–길라잡이 구간 링크를 확장 경계로 삼는 운영 설계를 평가한다.</w:t>
       </w:r>
     </w:p>
     <w:p>
@@ -186,7 +186,7 @@
           <w:i w:val="0"/>
           <w:sz w:val="20"/>
         </w:rPr>
-        <w:t>2. 제안 방법</w:t>
+        <w:t>2. 방법</w:t>
       </w:r>
     </w:p>
     <w:p>
@@ -201,7 +201,7 @@
           <w:i w:val="0"/>
           <w:sz w:val="18"/>
         </w:rPr>
-        <w:t>하이브리드 검색과 1차 재정렬로 직접 근거를 고른 뒤, 직접 근거는 보존하고 승인 링크를 따라 연결 구간을 가져온다. 연결 구간만 다시 재정렬해 답변 문맥에 추가하며, 선택 결과가 없거나 재정렬이 실패하면 연결 근거를 넣지 않는다. 이때 직접 근거만으로 답변이 생성될 수 있어 필요한 특칙이 빠질 수 있다. 연결 링크는 관리자 승인 상태로 조회하지만, 승인 기준·담당자·폐기 기록 및 실행 시 링크 스냅샷은 이 평가 자료에서 추적되지 않는다.</w:t>
+        <w:t>하이브리드 검색과 1차 재정렬로 직접 근거를 고른 뒤, 직접 근거는 보존하고 승인 링크로 연결 구간을 확장한다. `link_all`은 연결 근거를 모두 포함하고, `proposed`는 그 연결 근거만 질문별로 다시 재정렬해 선택한다. 선택 결과가 없거나 재정렬에 실패하면 연결 근거를 넣지 않으므로 직접 근거만으로 답변할 수 있다.</w:t>
       </w:r>
     </w:p>
     <w:p>
@@ -272,7 +272,7 @@
           <w:i w:val="0"/>
           <w:sz w:val="20"/>
         </w:rPr>
-        <w:t>3. 평가</w:t>
+        <w:t>3. 평가 및 결과</w:t>
       </w:r>
     </w:p>
     <w:p>
@@ -287,7 +287,12 @@
           <w:i w:val="0"/>
           <w:sz w:val="18"/>
         </w:rPr>
-        <w:t>평가셋 v3의 기존 사례 17건은 개발 자료로 분리하고, LLM 초안 신규 사례 20건은 별도 집계했다. 아래 그래프 지표는 기존 그래프 사례 5건과 신규 그래프 사례 15건의 결과를 나눠 보인다. 신규 사례는 서로 다른 승인 링크를 하나씩 골라 양쪽 원문으로 작성했으며, 검색 결과를 보고 고르지는 않았다. 검색 정답은 문서 버전과 조항 또는 페이지·슬라이드가 일치할 때 한 번만 센다. Precision의 분모는 최종 근거 수다. 답변 지표는 RAGAS 자동 평가이며[10], 생성·평가 judge는 `gpt-5.6-luna`, 검색 임베딩은 `text-embedding-3-small`, 평가 임베딩은 `text-embedding-3-large`를 사용했다. 같은 생성 모델과 judge에 의존하므로 독립 검증으로 보지 않는다.</w:t>
+        <w:t>평가셋 v3의 `existing_v2` 17건(문서형 12, 그래프형 5)은 개발 자료로, `llm_drafted` 20건(문서형 5, 그래프형 15)은 별도로 보고했다. 6개 변형을 모두 37건에서 3회 완주했다. 표의 값은 반복별 사례 평균의 평균 ± 반복 간 표본 표준편차이다. 검색 Recall은 정답 근거 중 검색된 비율, Precision은 검색 근거 중 정답 비율이며, linked-gold recall은 링크 경유 정답 근거의 Recall이다. CP/CR/AC는 RAGAS Context Precision/Recall/Answer Correctness이다[10]. 생성·평가 judge는 같은 `gpt-5.6-luna` 모델이고 검색·평가 임베딩은 각각 `text-embedding-3-small`, `text-embedding-3-large`를 사용했다.</w:t>
+      </w:r>
+    </w:p>
+    <w:p>
+      <w:r>
+        <w:br w:type="column"/>
       </w:r>
     </w:p>
     <w:p>
@@ -303,12 +308,1397 @@
           <w:i w:val="0"/>
           <w:sz w:val="18"/>
         </w:rPr>
-        <w:t>표 1. 그래프형 검색 결과 (반복별 사례 평균의 평균 ± 반복 간 표본 표준편차)</w:t>
+        <w:t>표 1. 그래프 질의 검색 결과 (n=20, `hybrid_rr`=`hybrid_rerank`)</w:t>
       </w:r>
     </w:p>
     <w:tbl>
       <w:tblPr>
-        <w:tblW w:type="dxa" w:w="4763"/>
+        <w:tblW w:type="dxa" w:w="4875"/>
+        <w:tblLayout w:type="fixed"/>
+        <w:tblLook w:firstColumn="1" w:firstRow="1" w:lastColumn="0" w:lastRow="0" w:noHBand="0" w:noVBand="1" w:val="04A0"/>
+        <w:jc w:val="left"/>
+        <w:tblBorders>
+          <w:top w:val="single" w:sz="4" w:space="0" w:color="000000"/>
+          <w:left w:val="single" w:sz="4" w:space="0" w:color="000000"/>
+          <w:bottom w:val="single" w:sz="4" w:space="0" w:color="000000"/>
+          <w:right w:val="single" w:sz="4" w:space="0" w:color="000000"/>
+          <w:insideH w:val="single" w:sz="4" w:space="0" w:color="000000"/>
+          <w:insideV w:val="single" w:sz="4" w:space="0" w:color="000000"/>
+        </w:tblBorders>
+      </w:tblPr>
+      <w:tblGrid>
+        <w:gridCol w:w="1134"/>
+        <w:gridCol w:w="1247"/>
+        <w:gridCol w:w="1247"/>
+        <w:gridCol w:w="1247"/>
+      </w:tblGrid>
+      <w:tr>
+        <w:trPr>
+          <w:cantSplit/>
+          <w:tblHeader w:val="true"/>
+        </w:trPr>
+        <w:tc>
+          <w:tcPr>
+            <w:tcW w:type="dxa" w:w="1134"/>
+            <w:vAlign w:val="center"/>
+          </w:tcPr>
+          <w:p>
+            <w:pPr>
+              <w:spacing w:after="0" w:line="240" w:lineRule="auto"/>
+              <w:jc w:val="left"/>
+            </w:pPr>
+            <w:r/>
+            <w:r>
+              <w:rPr>
+                <w:rFonts w:ascii="Malgun Gothic" w:hAnsi="Malgun Gothic" w:eastAsia="Malgun Gothic" w:cs="Malgun Gothic"/>
+                <w:b/>
+                <w:i w:val="0"/>
+                <w:sz w:val="16"/>
+              </w:rPr>
+              <w:t>변형</w:t>
+            </w:r>
+          </w:p>
+        </w:tc>
+        <w:tc>
+          <w:tcPr>
+            <w:tcW w:type="dxa" w:w="1247"/>
+            <w:vAlign w:val="center"/>
+          </w:tcPr>
+          <w:p>
+            <w:pPr>
+              <w:spacing w:after="0" w:line="240" w:lineRule="auto"/>
+              <w:jc w:val="center"/>
+            </w:pPr>
+            <w:r/>
+            <w:r>
+              <w:rPr>
+                <w:rFonts w:ascii="Malgun Gothic" w:hAnsi="Malgun Gothic" w:eastAsia="Malgun Gothic" w:cs="Malgun Gothic"/>
+                <w:b/>
+                <w:i w:val="0"/>
+                <w:sz w:val="16"/>
+              </w:rPr>
+              <w:t>Recall</w:t>
+            </w:r>
+          </w:p>
+        </w:tc>
+        <w:tc>
+          <w:tcPr>
+            <w:tcW w:type="dxa" w:w="1247"/>
+            <w:vAlign w:val="center"/>
+          </w:tcPr>
+          <w:p>
+            <w:pPr>
+              <w:spacing w:after="0" w:line="240" w:lineRule="auto"/>
+              <w:jc w:val="center"/>
+            </w:pPr>
+            <w:r/>
+            <w:r>
+              <w:rPr>
+                <w:rFonts w:ascii="Malgun Gothic" w:hAnsi="Malgun Gothic" w:eastAsia="Malgun Gothic" w:cs="Malgun Gothic"/>
+                <w:b/>
+                <w:i w:val="0"/>
+                <w:sz w:val="16"/>
+              </w:rPr>
+              <w:t>Precision</w:t>
+            </w:r>
+          </w:p>
+        </w:tc>
+        <w:tc>
+          <w:tcPr>
+            <w:tcW w:type="dxa" w:w="1247"/>
+            <w:vAlign w:val="center"/>
+          </w:tcPr>
+          <w:p>
+            <w:pPr>
+              <w:spacing w:after="0" w:line="240" w:lineRule="auto"/>
+              <w:jc w:val="center"/>
+            </w:pPr>
+            <w:r/>
+            <w:r>
+              <w:rPr>
+                <w:rFonts w:ascii="Malgun Gothic" w:hAnsi="Malgun Gothic" w:eastAsia="Malgun Gothic" w:cs="Malgun Gothic"/>
+                <w:b/>
+                <w:i w:val="0"/>
+                <w:sz w:val="16"/>
+              </w:rPr>
+              <w:t>링크 정답 Recall</w:t>
+            </w:r>
+          </w:p>
+        </w:tc>
+      </w:tr>
+      <w:tr>
+        <w:trPr>
+          <w:cantSplit/>
+        </w:trPr>
+        <w:tc>
+          <w:tcPr>
+            <w:tcW w:type="dxa" w:w="1134"/>
+            <w:vAlign w:val="center"/>
+          </w:tcPr>
+          <w:p>
+            <w:pPr>
+              <w:spacing w:after="0" w:line="240" w:lineRule="auto"/>
+              <w:jc w:val="left"/>
+            </w:pPr>
+            <w:r/>
+            <w:r>
+              <w:rPr>
+                <w:rFonts w:ascii="Malgun Gothic" w:hAnsi="Malgun Gothic" w:eastAsia="Malgun Gothic" w:cs="Malgun Gothic"/>
+                <w:b w:val="0"/>
+                <w:i w:val="0"/>
+                <w:sz w:val="16"/>
+              </w:rPr>
+              <w:t>bm25</w:t>
+            </w:r>
+          </w:p>
+        </w:tc>
+        <w:tc>
+          <w:tcPr>
+            <w:tcW w:type="dxa" w:w="1247"/>
+            <w:vAlign w:val="center"/>
+          </w:tcPr>
+          <w:p>
+            <w:pPr>
+              <w:spacing w:after="0" w:line="240" w:lineRule="auto"/>
+              <w:jc w:val="center"/>
+            </w:pPr>
+            <w:r/>
+            <w:r>
+              <w:rPr>
+                <w:rFonts w:ascii="Malgun Gothic" w:hAnsi="Malgun Gothic" w:eastAsia="Malgun Gothic" w:cs="Malgun Gothic"/>
+                <w:b w:val="0"/>
+                <w:i w:val="0"/>
+                <w:sz w:val="16"/>
+              </w:rPr>
+              <w:t>0.592±0.000</w:t>
+            </w:r>
+          </w:p>
+        </w:tc>
+        <w:tc>
+          <w:tcPr>
+            <w:tcW w:type="dxa" w:w="1247"/>
+            <w:vAlign w:val="center"/>
+          </w:tcPr>
+          <w:p>
+            <w:pPr>
+              <w:spacing w:after="0" w:line="240" w:lineRule="auto"/>
+              <w:jc w:val="center"/>
+            </w:pPr>
+            <w:r/>
+            <w:r>
+              <w:rPr>
+                <w:rFonts w:ascii="Malgun Gothic" w:hAnsi="Malgun Gothic" w:eastAsia="Malgun Gothic" w:cs="Malgun Gothic"/>
+                <w:b w:val="0"/>
+                <w:i w:val="0"/>
+                <w:sz w:val="16"/>
+              </w:rPr>
+              <w:t>0.260±0.000</w:t>
+            </w:r>
+          </w:p>
+        </w:tc>
+        <w:tc>
+          <w:tcPr>
+            <w:tcW w:type="dxa" w:w="1247"/>
+            <w:vAlign w:val="center"/>
+          </w:tcPr>
+          <w:p>
+            <w:pPr>
+              <w:spacing w:after="0" w:line="240" w:lineRule="auto"/>
+              <w:jc w:val="center"/>
+            </w:pPr>
+            <w:r/>
+            <w:r>
+              <w:rPr>
+                <w:rFonts w:ascii="Malgun Gothic" w:hAnsi="Malgun Gothic" w:eastAsia="Malgun Gothic" w:cs="Malgun Gothic"/>
+                <w:b w:val="0"/>
+                <w:i w:val="0"/>
+                <w:sz w:val="16"/>
+              </w:rPr>
+              <w:t>0.275±0.000</w:t>
+            </w:r>
+          </w:p>
+        </w:tc>
+      </w:tr>
+      <w:tr>
+        <w:trPr>
+          <w:cantSplit/>
+        </w:trPr>
+        <w:tc>
+          <w:tcPr>
+            <w:tcW w:type="dxa" w:w="1134"/>
+            <w:vAlign w:val="center"/>
+          </w:tcPr>
+          <w:p>
+            <w:pPr>
+              <w:spacing w:after="0" w:line="240" w:lineRule="auto"/>
+              <w:jc w:val="left"/>
+            </w:pPr>
+            <w:r/>
+            <w:r>
+              <w:rPr>
+                <w:rFonts w:ascii="Malgun Gothic" w:hAnsi="Malgun Gothic" w:eastAsia="Malgun Gothic" w:cs="Malgun Gothic"/>
+                <w:b w:val="0"/>
+                <w:i w:val="0"/>
+                <w:sz w:val="16"/>
+              </w:rPr>
+              <w:t>dense</w:t>
+            </w:r>
+          </w:p>
+        </w:tc>
+        <w:tc>
+          <w:tcPr>
+            <w:tcW w:type="dxa" w:w="1247"/>
+            <w:vAlign w:val="center"/>
+          </w:tcPr>
+          <w:p>
+            <w:pPr>
+              <w:spacing w:after="0" w:line="240" w:lineRule="auto"/>
+              <w:jc w:val="center"/>
+            </w:pPr>
+            <w:r/>
+            <w:r>
+              <w:rPr>
+                <w:rFonts w:ascii="Malgun Gothic" w:hAnsi="Malgun Gothic" w:eastAsia="Malgun Gothic" w:cs="Malgun Gothic"/>
+                <w:b w:val="0"/>
+                <w:i w:val="0"/>
+                <w:sz w:val="16"/>
+              </w:rPr>
+              <w:t>0.383±0.000</w:t>
+            </w:r>
+          </w:p>
+        </w:tc>
+        <w:tc>
+          <w:tcPr>
+            <w:tcW w:type="dxa" w:w="1247"/>
+            <w:vAlign w:val="center"/>
+          </w:tcPr>
+          <w:p>
+            <w:pPr>
+              <w:spacing w:after="0" w:line="240" w:lineRule="auto"/>
+              <w:jc w:val="center"/>
+            </w:pPr>
+            <w:r/>
+            <w:r>
+              <w:rPr>
+                <w:rFonts w:ascii="Malgun Gothic" w:hAnsi="Malgun Gothic" w:eastAsia="Malgun Gothic" w:cs="Malgun Gothic"/>
+                <w:b w:val="0"/>
+                <w:i w:val="0"/>
+                <w:sz w:val="16"/>
+              </w:rPr>
+              <w:t>0.170±0.000</w:t>
+            </w:r>
+          </w:p>
+        </w:tc>
+        <w:tc>
+          <w:tcPr>
+            <w:tcW w:type="dxa" w:w="1247"/>
+            <w:vAlign w:val="center"/>
+          </w:tcPr>
+          <w:p>
+            <w:pPr>
+              <w:spacing w:after="0" w:line="240" w:lineRule="auto"/>
+              <w:jc w:val="center"/>
+            </w:pPr>
+            <w:r/>
+            <w:r>
+              <w:rPr>
+                <w:rFonts w:ascii="Malgun Gothic" w:hAnsi="Malgun Gothic" w:eastAsia="Malgun Gothic" w:cs="Malgun Gothic"/>
+                <w:b w:val="0"/>
+                <w:i w:val="0"/>
+                <w:sz w:val="16"/>
+              </w:rPr>
+              <w:t>0.000±0.000</w:t>
+            </w:r>
+          </w:p>
+        </w:tc>
+      </w:tr>
+      <w:tr>
+        <w:trPr>
+          <w:cantSplit/>
+        </w:trPr>
+        <w:tc>
+          <w:tcPr>
+            <w:tcW w:type="dxa" w:w="1134"/>
+            <w:vAlign w:val="center"/>
+          </w:tcPr>
+          <w:p>
+            <w:pPr>
+              <w:spacing w:after="0" w:line="240" w:lineRule="auto"/>
+              <w:jc w:val="left"/>
+            </w:pPr>
+            <w:r/>
+            <w:r>
+              <w:rPr>
+                <w:rFonts w:ascii="Malgun Gothic" w:hAnsi="Malgun Gothic" w:eastAsia="Malgun Gothic" w:cs="Malgun Gothic"/>
+                <w:b w:val="0"/>
+                <w:i w:val="0"/>
+                <w:sz w:val="16"/>
+              </w:rPr>
+              <w:t>hybrid</w:t>
+            </w:r>
+          </w:p>
+        </w:tc>
+        <w:tc>
+          <w:tcPr>
+            <w:tcW w:type="dxa" w:w="1247"/>
+            <w:vAlign w:val="center"/>
+          </w:tcPr>
+          <w:p>
+            <w:pPr>
+              <w:spacing w:after="0" w:line="240" w:lineRule="auto"/>
+              <w:jc w:val="center"/>
+            </w:pPr>
+            <w:r/>
+            <w:r>
+              <w:rPr>
+                <w:rFonts w:ascii="Malgun Gothic" w:hAnsi="Malgun Gothic" w:eastAsia="Malgun Gothic" w:cs="Malgun Gothic"/>
+                <w:b w:val="0"/>
+                <w:i w:val="0"/>
+                <w:sz w:val="16"/>
+              </w:rPr>
+              <w:t>0.521±0.000</w:t>
+            </w:r>
+          </w:p>
+        </w:tc>
+        <w:tc>
+          <w:tcPr>
+            <w:tcW w:type="dxa" w:w="1247"/>
+            <w:vAlign w:val="center"/>
+          </w:tcPr>
+          <w:p>
+            <w:pPr>
+              <w:spacing w:after="0" w:line="240" w:lineRule="auto"/>
+              <w:jc w:val="center"/>
+            </w:pPr>
+            <w:r/>
+            <w:r>
+              <w:rPr>
+                <w:rFonts w:ascii="Malgun Gothic" w:hAnsi="Malgun Gothic" w:eastAsia="Malgun Gothic" w:cs="Malgun Gothic"/>
+                <w:b w:val="0"/>
+                <w:i w:val="0"/>
+                <w:sz w:val="16"/>
+              </w:rPr>
+              <w:t>0.230±0.000</w:t>
+            </w:r>
+          </w:p>
+        </w:tc>
+        <w:tc>
+          <w:tcPr>
+            <w:tcW w:type="dxa" w:w="1247"/>
+            <w:vAlign w:val="center"/>
+          </w:tcPr>
+          <w:p>
+            <w:pPr>
+              <w:spacing w:after="0" w:line="240" w:lineRule="auto"/>
+              <w:jc w:val="center"/>
+            </w:pPr>
+            <w:r/>
+            <w:r>
+              <w:rPr>
+                <w:rFonts w:ascii="Malgun Gothic" w:hAnsi="Malgun Gothic" w:eastAsia="Malgun Gothic" w:cs="Malgun Gothic"/>
+                <w:b w:val="0"/>
+                <w:i w:val="0"/>
+                <w:sz w:val="16"/>
+              </w:rPr>
+              <w:t>0.150±0.000</w:t>
+            </w:r>
+          </w:p>
+        </w:tc>
+      </w:tr>
+      <w:tr>
+        <w:trPr>
+          <w:cantSplit/>
+        </w:trPr>
+        <w:tc>
+          <w:tcPr>
+            <w:tcW w:type="dxa" w:w="1134"/>
+            <w:vAlign w:val="center"/>
+          </w:tcPr>
+          <w:p>
+            <w:pPr>
+              <w:spacing w:after="0" w:line="240" w:lineRule="auto"/>
+              <w:jc w:val="left"/>
+            </w:pPr>
+            <w:r/>
+            <w:r>
+              <w:rPr>
+                <w:rFonts w:ascii="Malgun Gothic" w:hAnsi="Malgun Gothic" w:eastAsia="Malgun Gothic" w:cs="Malgun Gothic"/>
+                <w:b w:val="0"/>
+                <w:i w:val="0"/>
+                <w:sz w:val="16"/>
+              </w:rPr>
+              <w:t>hybrid_rr</w:t>
+            </w:r>
+          </w:p>
+        </w:tc>
+        <w:tc>
+          <w:tcPr>
+            <w:tcW w:type="dxa" w:w="1247"/>
+            <w:vAlign w:val="center"/>
+          </w:tcPr>
+          <w:p>
+            <w:pPr>
+              <w:spacing w:after="0" w:line="240" w:lineRule="auto"/>
+              <w:jc w:val="center"/>
+            </w:pPr>
+            <w:r/>
+            <w:r>
+              <w:rPr>
+                <w:rFonts w:ascii="Malgun Gothic" w:hAnsi="Malgun Gothic" w:eastAsia="Malgun Gothic" w:cs="Malgun Gothic"/>
+                <w:b w:val="0"/>
+                <w:i w:val="0"/>
+                <w:sz w:val="16"/>
+              </w:rPr>
+              <w:t>0.586±0.019</w:t>
+            </w:r>
+          </w:p>
+        </w:tc>
+        <w:tc>
+          <w:tcPr>
+            <w:tcW w:type="dxa" w:w="1247"/>
+            <w:vAlign w:val="center"/>
+          </w:tcPr>
+          <w:p>
+            <w:pPr>
+              <w:spacing w:after="0" w:line="240" w:lineRule="auto"/>
+              <w:jc w:val="center"/>
+            </w:pPr>
+            <w:r/>
+            <w:r>
+              <w:rPr>
+                <w:rFonts w:ascii="Malgun Gothic" w:hAnsi="Malgun Gothic" w:eastAsia="Malgun Gothic" w:cs="Malgun Gothic"/>
+                <w:b w:val="0"/>
+                <w:i w:val="0"/>
+                <w:sz w:val="16"/>
+              </w:rPr>
+              <w:t>0.781±0.038</w:t>
+            </w:r>
+          </w:p>
+        </w:tc>
+        <w:tc>
+          <w:tcPr>
+            <w:tcW w:type="dxa" w:w="1247"/>
+            <w:vAlign w:val="center"/>
+          </w:tcPr>
+          <w:p>
+            <w:pPr>
+              <w:spacing w:after="0" w:line="240" w:lineRule="auto"/>
+              <w:jc w:val="center"/>
+            </w:pPr>
+            <w:r/>
+            <w:r>
+              <w:rPr>
+                <w:rFonts w:ascii="Malgun Gothic" w:hAnsi="Malgun Gothic" w:eastAsia="Malgun Gothic" w:cs="Malgun Gothic"/>
+                <w:b w:val="0"/>
+                <w:i w:val="0"/>
+                <w:sz w:val="16"/>
+              </w:rPr>
+              <w:t>0.233±0.014</w:t>
+            </w:r>
+          </w:p>
+        </w:tc>
+      </w:tr>
+      <w:tr>
+        <w:trPr>
+          <w:cantSplit/>
+        </w:trPr>
+        <w:tc>
+          <w:tcPr>
+            <w:tcW w:type="dxa" w:w="1134"/>
+            <w:vAlign w:val="center"/>
+          </w:tcPr>
+          <w:p>
+            <w:pPr>
+              <w:spacing w:after="0" w:line="240" w:lineRule="auto"/>
+              <w:jc w:val="left"/>
+            </w:pPr>
+            <w:r/>
+            <w:r>
+              <w:rPr>
+                <w:rFonts w:ascii="Malgun Gothic" w:hAnsi="Malgun Gothic" w:eastAsia="Malgun Gothic" w:cs="Malgun Gothic"/>
+                <w:b w:val="0"/>
+                <w:i w:val="0"/>
+                <w:sz w:val="16"/>
+              </w:rPr>
+              <w:t>link_all</w:t>
+            </w:r>
+          </w:p>
+        </w:tc>
+        <w:tc>
+          <w:tcPr>
+            <w:tcW w:type="dxa" w:w="1247"/>
+            <w:vAlign w:val="center"/>
+          </w:tcPr>
+          <w:p>
+            <w:pPr>
+              <w:spacing w:after="0" w:line="240" w:lineRule="auto"/>
+              <w:jc w:val="center"/>
+            </w:pPr>
+            <w:r/>
+            <w:r>
+              <w:rPr>
+                <w:rFonts w:ascii="Malgun Gothic" w:hAnsi="Malgun Gothic" w:eastAsia="Malgun Gothic" w:cs="Malgun Gothic"/>
+                <w:b w:val="0"/>
+                <w:i w:val="0"/>
+                <w:sz w:val="16"/>
+              </w:rPr>
+              <w:t>0.850±0.014</w:t>
+            </w:r>
+          </w:p>
+        </w:tc>
+        <w:tc>
+          <w:tcPr>
+            <w:tcW w:type="dxa" w:w="1247"/>
+            <w:vAlign w:val="center"/>
+          </w:tcPr>
+          <w:p>
+            <w:pPr>
+              <w:spacing w:after="0" w:line="240" w:lineRule="auto"/>
+              <w:jc w:val="center"/>
+            </w:pPr>
+            <w:r/>
+            <w:r>
+              <w:rPr>
+                <w:rFonts w:ascii="Malgun Gothic" w:hAnsi="Malgun Gothic" w:eastAsia="Malgun Gothic" w:cs="Malgun Gothic"/>
+                <w:b w:val="0"/>
+                <w:i w:val="0"/>
+                <w:sz w:val="16"/>
+              </w:rPr>
+              <w:t>0.721±0.002</w:t>
+            </w:r>
+          </w:p>
+        </w:tc>
+        <w:tc>
+          <w:tcPr>
+            <w:tcW w:type="dxa" w:w="1247"/>
+            <w:vAlign w:val="center"/>
+          </w:tcPr>
+          <w:p>
+            <w:pPr>
+              <w:spacing w:after="0" w:line="240" w:lineRule="auto"/>
+              <w:jc w:val="center"/>
+            </w:pPr>
+            <w:r/>
+            <w:r>
+              <w:rPr>
+                <w:rFonts w:ascii="Malgun Gothic" w:hAnsi="Malgun Gothic" w:eastAsia="Malgun Gothic" w:cs="Malgun Gothic"/>
+                <w:b w:val="0"/>
+                <w:i w:val="0"/>
+                <w:sz w:val="16"/>
+              </w:rPr>
+              <w:t>0.750±0.000</w:t>
+            </w:r>
+          </w:p>
+        </w:tc>
+      </w:tr>
+      <w:tr>
+        <w:trPr>
+          <w:cantSplit/>
+        </w:trPr>
+        <w:tc>
+          <w:tcPr>
+            <w:tcW w:type="dxa" w:w="1134"/>
+            <w:vAlign w:val="center"/>
+          </w:tcPr>
+          <w:p>
+            <w:pPr>
+              <w:spacing w:after="0" w:line="240" w:lineRule="auto"/>
+              <w:jc w:val="left"/>
+            </w:pPr>
+            <w:r/>
+            <w:r>
+              <w:rPr>
+                <w:rFonts w:ascii="Malgun Gothic" w:hAnsi="Malgun Gothic" w:eastAsia="Malgun Gothic" w:cs="Malgun Gothic"/>
+                <w:b w:val="0"/>
+                <w:i w:val="0"/>
+                <w:sz w:val="16"/>
+              </w:rPr>
+              <w:t>proposed</w:t>
+            </w:r>
+          </w:p>
+        </w:tc>
+        <w:tc>
+          <w:tcPr>
+            <w:tcW w:type="dxa" w:w="1247"/>
+            <w:vAlign w:val="center"/>
+          </w:tcPr>
+          <w:p>
+            <w:pPr>
+              <w:spacing w:after="0" w:line="240" w:lineRule="auto"/>
+              <w:jc w:val="center"/>
+            </w:pPr>
+            <w:r/>
+            <w:r>
+              <w:rPr>
+                <w:rFonts w:ascii="Malgun Gothic" w:hAnsi="Malgun Gothic" w:eastAsia="Malgun Gothic" w:cs="Malgun Gothic"/>
+                <w:b w:val="0"/>
+                <w:i w:val="0"/>
+                <w:sz w:val="16"/>
+              </w:rPr>
+              <w:t>0.839±0.046</w:t>
+            </w:r>
+          </w:p>
+        </w:tc>
+        <w:tc>
+          <w:tcPr>
+            <w:tcW w:type="dxa" w:w="1247"/>
+            <w:vAlign w:val="center"/>
+          </w:tcPr>
+          <w:p>
+            <w:pPr>
+              <w:spacing w:after="0" w:line="240" w:lineRule="auto"/>
+              <w:jc w:val="center"/>
+            </w:pPr>
+            <w:r/>
+            <w:r>
+              <w:rPr>
+                <w:rFonts w:ascii="Malgun Gothic" w:hAnsi="Malgun Gothic" w:eastAsia="Malgun Gothic" w:cs="Malgun Gothic"/>
+                <w:b w:val="0"/>
+                <w:i w:val="0"/>
+                <w:sz w:val="16"/>
+              </w:rPr>
+              <w:t>0.742±0.022</w:t>
+            </w:r>
+          </w:p>
+        </w:tc>
+        <w:tc>
+          <w:tcPr>
+            <w:tcW w:type="dxa" w:w="1247"/>
+            <w:vAlign w:val="center"/>
+          </w:tcPr>
+          <w:p>
+            <w:pPr>
+              <w:spacing w:after="0" w:line="240" w:lineRule="auto"/>
+              <w:jc w:val="center"/>
+            </w:pPr>
+            <w:r/>
+            <w:r>
+              <w:rPr>
+                <w:rFonts w:ascii="Malgun Gothic" w:hAnsi="Malgun Gothic" w:eastAsia="Malgun Gothic" w:cs="Malgun Gothic"/>
+                <w:b w:val="0"/>
+                <w:i w:val="0"/>
+                <w:sz w:val="16"/>
+              </w:rPr>
+              <w:t>0.708±0.063</w:t>
+            </w:r>
+          </w:p>
+        </w:tc>
+      </w:tr>
+    </w:tbl>
+    <w:p>
+      <w:pPr>
+        <w:keepNext/>
+        <w:spacing w:before="0" w:after="40" w:line="240" w:lineRule="auto"/>
+        <w:jc w:val="left"/>
+      </w:pPr>
+      <w:r>
+        <w:rPr>
+          <w:rFonts w:ascii="Malgun Gothic" w:hAnsi="Malgun Gothic" w:eastAsia="Malgun Gothic" w:cs="Malgun Gothic"/>
+          <w:b/>
+          <w:i w:val="0"/>
+          <w:sz w:val="18"/>
+        </w:rPr>
+        <w:t>표 2. 그래프 질의 문맥·답변 결과 (n=20)</w:t>
+      </w:r>
+    </w:p>
+    <w:tbl>
+      <w:tblPr>
+        <w:tblW w:type="dxa" w:w="4875"/>
+        <w:tblLayout w:type="fixed"/>
+        <w:tblLook w:firstColumn="1" w:firstRow="1" w:lastColumn="0" w:lastRow="0" w:noHBand="0" w:noVBand="1" w:val="04A0"/>
+        <w:jc w:val="left"/>
+        <w:tblBorders>
+          <w:top w:val="single" w:sz="4" w:space="0" w:color="000000"/>
+          <w:left w:val="single" w:sz="4" w:space="0" w:color="000000"/>
+          <w:bottom w:val="single" w:sz="4" w:space="0" w:color="000000"/>
+          <w:right w:val="single" w:sz="4" w:space="0" w:color="000000"/>
+          <w:insideH w:val="single" w:sz="4" w:space="0" w:color="000000"/>
+          <w:insideV w:val="single" w:sz="4" w:space="0" w:color="000000"/>
+        </w:tblBorders>
+      </w:tblPr>
+      <w:tblGrid>
+        <w:gridCol w:w="1134"/>
+        <w:gridCol w:w="1247"/>
+        <w:gridCol w:w="1247"/>
+        <w:gridCol w:w="1247"/>
+      </w:tblGrid>
+      <w:tr>
+        <w:trPr>
+          <w:cantSplit/>
+          <w:tblHeader w:val="true"/>
+        </w:trPr>
+        <w:tc>
+          <w:tcPr>
+            <w:tcW w:type="dxa" w:w="1134"/>
+            <w:vAlign w:val="center"/>
+          </w:tcPr>
+          <w:p>
+            <w:pPr>
+              <w:spacing w:after="0" w:line="240" w:lineRule="auto"/>
+              <w:jc w:val="left"/>
+            </w:pPr>
+            <w:r/>
+            <w:r>
+              <w:rPr>
+                <w:rFonts w:ascii="Malgun Gothic" w:hAnsi="Malgun Gothic" w:eastAsia="Malgun Gothic" w:cs="Malgun Gothic"/>
+                <w:b/>
+                <w:i w:val="0"/>
+                <w:sz w:val="16"/>
+              </w:rPr>
+              <w:t>변형</w:t>
+            </w:r>
+          </w:p>
+        </w:tc>
+        <w:tc>
+          <w:tcPr>
+            <w:tcW w:type="dxa" w:w="1247"/>
+            <w:vAlign w:val="center"/>
+          </w:tcPr>
+          <w:p>
+            <w:pPr>
+              <w:spacing w:after="0" w:line="240" w:lineRule="auto"/>
+              <w:jc w:val="center"/>
+            </w:pPr>
+            <w:r/>
+            <w:r>
+              <w:rPr>
+                <w:rFonts w:ascii="Malgun Gothic" w:hAnsi="Malgun Gothic" w:eastAsia="Malgun Gothic" w:cs="Malgun Gothic"/>
+                <w:b/>
+                <w:i w:val="0"/>
+                <w:sz w:val="16"/>
+              </w:rPr>
+              <w:t>CP</w:t>
+            </w:r>
+          </w:p>
+        </w:tc>
+        <w:tc>
+          <w:tcPr>
+            <w:tcW w:type="dxa" w:w="1247"/>
+            <w:vAlign w:val="center"/>
+          </w:tcPr>
+          <w:p>
+            <w:pPr>
+              <w:spacing w:after="0" w:line="240" w:lineRule="auto"/>
+              <w:jc w:val="center"/>
+            </w:pPr>
+            <w:r/>
+            <w:r>
+              <w:rPr>
+                <w:rFonts w:ascii="Malgun Gothic" w:hAnsi="Malgun Gothic" w:eastAsia="Malgun Gothic" w:cs="Malgun Gothic"/>
+                <w:b/>
+                <w:i w:val="0"/>
+                <w:sz w:val="16"/>
+              </w:rPr>
+              <w:t>CR</w:t>
+            </w:r>
+          </w:p>
+        </w:tc>
+        <w:tc>
+          <w:tcPr>
+            <w:tcW w:type="dxa" w:w="1247"/>
+            <w:vAlign w:val="center"/>
+          </w:tcPr>
+          <w:p>
+            <w:pPr>
+              <w:spacing w:after="0" w:line="240" w:lineRule="auto"/>
+              <w:jc w:val="center"/>
+            </w:pPr>
+            <w:r/>
+            <w:r>
+              <w:rPr>
+                <w:rFonts w:ascii="Malgun Gothic" w:hAnsi="Malgun Gothic" w:eastAsia="Malgun Gothic" w:cs="Malgun Gothic"/>
+                <w:b/>
+                <w:i w:val="0"/>
+                <w:sz w:val="16"/>
+              </w:rPr>
+              <w:t>AC</w:t>
+            </w:r>
+          </w:p>
+        </w:tc>
+      </w:tr>
+      <w:tr>
+        <w:trPr>
+          <w:cantSplit/>
+        </w:trPr>
+        <w:tc>
+          <w:tcPr>
+            <w:tcW w:type="dxa" w:w="1134"/>
+            <w:vAlign w:val="center"/>
+          </w:tcPr>
+          <w:p>
+            <w:pPr>
+              <w:spacing w:after="0" w:line="240" w:lineRule="auto"/>
+              <w:jc w:val="left"/>
+            </w:pPr>
+            <w:r/>
+            <w:r>
+              <w:rPr>
+                <w:rFonts w:ascii="Malgun Gothic" w:hAnsi="Malgun Gothic" w:eastAsia="Malgun Gothic" w:cs="Malgun Gothic"/>
+                <w:b w:val="0"/>
+                <w:i w:val="0"/>
+                <w:sz w:val="16"/>
+              </w:rPr>
+              <w:t>bm25</w:t>
+            </w:r>
+          </w:p>
+        </w:tc>
+        <w:tc>
+          <w:tcPr>
+            <w:tcW w:type="dxa" w:w="1247"/>
+            <w:vAlign w:val="center"/>
+          </w:tcPr>
+          <w:p>
+            <w:pPr>
+              <w:spacing w:after="0" w:line="240" w:lineRule="auto"/>
+              <w:jc w:val="center"/>
+            </w:pPr>
+            <w:r/>
+            <w:r>
+              <w:rPr>
+                <w:rFonts w:ascii="Malgun Gothic" w:hAnsi="Malgun Gothic" w:eastAsia="Malgun Gothic" w:cs="Malgun Gothic"/>
+                <w:b w:val="0"/>
+                <w:i w:val="0"/>
+                <w:sz w:val="16"/>
+              </w:rPr>
+              <w:t>0.794±0.028</w:t>
+            </w:r>
+          </w:p>
+        </w:tc>
+        <w:tc>
+          <w:tcPr>
+            <w:tcW w:type="dxa" w:w="1247"/>
+            <w:vAlign w:val="center"/>
+          </w:tcPr>
+          <w:p>
+            <w:pPr>
+              <w:spacing w:after="0" w:line="240" w:lineRule="auto"/>
+              <w:jc w:val="center"/>
+            </w:pPr>
+            <w:r/>
+            <w:r>
+              <w:rPr>
+                <w:rFonts w:ascii="Malgun Gothic" w:hAnsi="Malgun Gothic" w:eastAsia="Malgun Gothic" w:cs="Malgun Gothic"/>
+                <w:b w:val="0"/>
+                <w:i w:val="0"/>
+                <w:sz w:val="16"/>
+              </w:rPr>
+              <w:t>0.778±0.012</w:t>
+            </w:r>
+          </w:p>
+        </w:tc>
+        <w:tc>
+          <w:tcPr>
+            <w:tcW w:type="dxa" w:w="1247"/>
+            <w:vAlign w:val="center"/>
+          </w:tcPr>
+          <w:p>
+            <w:pPr>
+              <w:spacing w:after="0" w:line="240" w:lineRule="auto"/>
+              <w:jc w:val="center"/>
+            </w:pPr>
+            <w:r/>
+            <w:r>
+              <w:rPr>
+                <w:rFonts w:ascii="Malgun Gothic" w:hAnsi="Malgun Gothic" w:eastAsia="Malgun Gothic" w:cs="Malgun Gothic"/>
+                <w:b w:val="0"/>
+                <w:i w:val="0"/>
+                <w:sz w:val="16"/>
+              </w:rPr>
+              <w:t>0.734±0.006</w:t>
+            </w:r>
+          </w:p>
+        </w:tc>
+      </w:tr>
+      <w:tr>
+        <w:trPr>
+          <w:cantSplit/>
+        </w:trPr>
+        <w:tc>
+          <w:tcPr>
+            <w:tcW w:type="dxa" w:w="1134"/>
+            <w:vAlign w:val="center"/>
+          </w:tcPr>
+          <w:p>
+            <w:pPr>
+              <w:spacing w:after="0" w:line="240" w:lineRule="auto"/>
+              <w:jc w:val="left"/>
+            </w:pPr>
+            <w:r/>
+            <w:r>
+              <w:rPr>
+                <w:rFonts w:ascii="Malgun Gothic" w:hAnsi="Malgun Gothic" w:eastAsia="Malgun Gothic" w:cs="Malgun Gothic"/>
+                <w:b w:val="0"/>
+                <w:i w:val="0"/>
+                <w:sz w:val="16"/>
+              </w:rPr>
+              <w:t>dense</w:t>
+            </w:r>
+          </w:p>
+        </w:tc>
+        <w:tc>
+          <w:tcPr>
+            <w:tcW w:type="dxa" w:w="1247"/>
+            <w:vAlign w:val="center"/>
+          </w:tcPr>
+          <w:p>
+            <w:pPr>
+              <w:spacing w:after="0" w:line="240" w:lineRule="auto"/>
+              <w:jc w:val="center"/>
+            </w:pPr>
+            <w:r/>
+            <w:r>
+              <w:rPr>
+                <w:rFonts w:ascii="Malgun Gothic" w:hAnsi="Malgun Gothic" w:eastAsia="Malgun Gothic" w:cs="Malgun Gothic"/>
+                <w:b w:val="0"/>
+                <w:i w:val="0"/>
+                <w:sz w:val="16"/>
+              </w:rPr>
+              <w:t>0.511±0.050</w:t>
+            </w:r>
+          </w:p>
+        </w:tc>
+        <w:tc>
+          <w:tcPr>
+            <w:tcW w:type="dxa" w:w="1247"/>
+            <w:vAlign w:val="center"/>
+          </w:tcPr>
+          <w:p>
+            <w:pPr>
+              <w:spacing w:after="0" w:line="240" w:lineRule="auto"/>
+              <w:jc w:val="center"/>
+            </w:pPr>
+            <w:r/>
+            <w:r>
+              <w:rPr>
+                <w:rFonts w:ascii="Malgun Gothic" w:hAnsi="Malgun Gothic" w:eastAsia="Malgun Gothic" w:cs="Malgun Gothic"/>
+                <w:b w:val="0"/>
+                <w:i w:val="0"/>
+                <w:sz w:val="16"/>
+              </w:rPr>
+              <w:t>0.625±0.003</w:t>
+            </w:r>
+          </w:p>
+        </w:tc>
+        <w:tc>
+          <w:tcPr>
+            <w:tcW w:type="dxa" w:w="1247"/>
+            <w:vAlign w:val="center"/>
+          </w:tcPr>
+          <w:p>
+            <w:pPr>
+              <w:spacing w:after="0" w:line="240" w:lineRule="auto"/>
+              <w:jc w:val="center"/>
+            </w:pPr>
+            <w:r/>
+            <w:r>
+              <w:rPr>
+                <w:rFonts w:ascii="Malgun Gothic" w:hAnsi="Malgun Gothic" w:eastAsia="Malgun Gothic" w:cs="Malgun Gothic"/>
+                <w:b w:val="0"/>
+                <w:i w:val="0"/>
+                <w:sz w:val="16"/>
+              </w:rPr>
+              <w:t>0.662±0.021</w:t>
+            </w:r>
+          </w:p>
+        </w:tc>
+      </w:tr>
+      <w:tr>
+        <w:trPr>
+          <w:cantSplit/>
+        </w:trPr>
+        <w:tc>
+          <w:tcPr>
+            <w:tcW w:type="dxa" w:w="1134"/>
+            <w:vAlign w:val="center"/>
+          </w:tcPr>
+          <w:p>
+            <w:pPr>
+              <w:spacing w:after="0" w:line="240" w:lineRule="auto"/>
+              <w:jc w:val="left"/>
+            </w:pPr>
+            <w:r/>
+            <w:r>
+              <w:rPr>
+                <w:rFonts w:ascii="Malgun Gothic" w:hAnsi="Malgun Gothic" w:eastAsia="Malgun Gothic" w:cs="Malgun Gothic"/>
+                <w:b w:val="0"/>
+                <w:i w:val="0"/>
+                <w:sz w:val="16"/>
+              </w:rPr>
+              <w:t>hybrid</w:t>
+            </w:r>
+          </w:p>
+        </w:tc>
+        <w:tc>
+          <w:tcPr>
+            <w:tcW w:type="dxa" w:w="1247"/>
+            <w:vAlign w:val="center"/>
+          </w:tcPr>
+          <w:p>
+            <w:pPr>
+              <w:spacing w:after="0" w:line="240" w:lineRule="auto"/>
+              <w:jc w:val="center"/>
+            </w:pPr>
+            <w:r/>
+            <w:r>
+              <w:rPr>
+                <w:rFonts w:ascii="Malgun Gothic" w:hAnsi="Malgun Gothic" w:eastAsia="Malgun Gothic" w:cs="Malgun Gothic"/>
+                <w:b w:val="0"/>
+                <w:i w:val="0"/>
+                <w:sz w:val="16"/>
+              </w:rPr>
+              <w:t>0.759±0.052</w:t>
+            </w:r>
+          </w:p>
+        </w:tc>
+        <w:tc>
+          <w:tcPr>
+            <w:tcW w:type="dxa" w:w="1247"/>
+            <w:vAlign w:val="center"/>
+          </w:tcPr>
+          <w:p>
+            <w:pPr>
+              <w:spacing w:after="0" w:line="240" w:lineRule="auto"/>
+              <w:jc w:val="center"/>
+            </w:pPr>
+            <w:r/>
+            <w:r>
+              <w:rPr>
+                <w:rFonts w:ascii="Malgun Gothic" w:hAnsi="Malgun Gothic" w:eastAsia="Malgun Gothic" w:cs="Malgun Gothic"/>
+                <w:b w:val="0"/>
+                <w:i w:val="0"/>
+                <w:sz w:val="16"/>
+              </w:rPr>
+              <w:t>0.714±0.000</w:t>
+            </w:r>
+          </w:p>
+        </w:tc>
+        <w:tc>
+          <w:tcPr>
+            <w:tcW w:type="dxa" w:w="1247"/>
+            <w:vAlign w:val="center"/>
+          </w:tcPr>
+          <w:p>
+            <w:pPr>
+              <w:spacing w:after="0" w:line="240" w:lineRule="auto"/>
+              <w:jc w:val="center"/>
+            </w:pPr>
+            <w:r/>
+            <w:r>
+              <w:rPr>
+                <w:rFonts w:ascii="Malgun Gothic" w:hAnsi="Malgun Gothic" w:eastAsia="Malgun Gothic" w:cs="Malgun Gothic"/>
+                <w:b w:val="0"/>
+                <w:i w:val="0"/>
+                <w:sz w:val="16"/>
+              </w:rPr>
+              <w:t>0.683±0.028</w:t>
+            </w:r>
+          </w:p>
+        </w:tc>
+      </w:tr>
+      <w:tr>
+        <w:trPr>
+          <w:cantSplit/>
+        </w:trPr>
+        <w:tc>
+          <w:tcPr>
+            <w:tcW w:type="dxa" w:w="1134"/>
+            <w:vAlign w:val="center"/>
+          </w:tcPr>
+          <w:p>
+            <w:pPr>
+              <w:spacing w:after="0" w:line="240" w:lineRule="auto"/>
+              <w:jc w:val="left"/>
+            </w:pPr>
+            <w:r/>
+            <w:r>
+              <w:rPr>
+                <w:rFonts w:ascii="Malgun Gothic" w:hAnsi="Malgun Gothic" w:eastAsia="Malgun Gothic" w:cs="Malgun Gothic"/>
+                <w:b w:val="0"/>
+                <w:i w:val="0"/>
+                <w:sz w:val="16"/>
+              </w:rPr>
+              <w:t>hybrid_rr</w:t>
+            </w:r>
+          </w:p>
+        </w:tc>
+        <w:tc>
+          <w:tcPr>
+            <w:tcW w:type="dxa" w:w="1247"/>
+            <w:vAlign w:val="center"/>
+          </w:tcPr>
+          <w:p>
+            <w:pPr>
+              <w:spacing w:after="0" w:line="240" w:lineRule="auto"/>
+              <w:jc w:val="center"/>
+            </w:pPr>
+            <w:r/>
+            <w:r>
+              <w:rPr>
+                <w:rFonts w:ascii="Malgun Gothic" w:hAnsi="Malgun Gothic" w:eastAsia="Malgun Gothic" w:cs="Malgun Gothic"/>
+                <w:b w:val="0"/>
+                <w:i w:val="0"/>
+                <w:sz w:val="16"/>
+              </w:rPr>
+              <w:t>0.946±0.053</w:t>
+            </w:r>
+          </w:p>
+        </w:tc>
+        <w:tc>
+          <w:tcPr>
+            <w:tcW w:type="dxa" w:w="1247"/>
+            <w:vAlign w:val="center"/>
+          </w:tcPr>
+          <w:p>
+            <w:pPr>
+              <w:spacing w:after="0" w:line="240" w:lineRule="auto"/>
+              <w:jc w:val="center"/>
+            </w:pPr>
+            <w:r/>
+            <w:r>
+              <w:rPr>
+                <w:rFonts w:ascii="Malgun Gothic" w:hAnsi="Malgun Gothic" w:eastAsia="Malgun Gothic" w:cs="Malgun Gothic"/>
+                <w:b w:val="0"/>
+                <w:i w:val="0"/>
+                <w:sz w:val="16"/>
+              </w:rPr>
+              <w:t>0.785±0.016</w:t>
+            </w:r>
+          </w:p>
+        </w:tc>
+        <w:tc>
+          <w:tcPr>
+            <w:tcW w:type="dxa" w:w="1247"/>
+            <w:vAlign w:val="center"/>
+          </w:tcPr>
+          <w:p>
+            <w:pPr>
+              <w:spacing w:after="0" w:line="240" w:lineRule="auto"/>
+              <w:jc w:val="center"/>
+            </w:pPr>
+            <w:r/>
+            <w:r>
+              <w:rPr>
+                <w:rFonts w:ascii="Malgun Gothic" w:hAnsi="Malgun Gothic" w:eastAsia="Malgun Gothic" w:cs="Malgun Gothic"/>
+                <w:b w:val="0"/>
+                <w:i w:val="0"/>
+                <w:sz w:val="16"/>
+              </w:rPr>
+              <w:t>0.745±0.016</w:t>
+            </w:r>
+          </w:p>
+        </w:tc>
+      </w:tr>
+      <w:tr>
+        <w:trPr>
+          <w:cantSplit/>
+        </w:trPr>
+        <w:tc>
+          <w:tcPr>
+            <w:tcW w:type="dxa" w:w="1134"/>
+            <w:vAlign w:val="center"/>
+          </w:tcPr>
+          <w:p>
+            <w:pPr>
+              <w:spacing w:after="0" w:line="240" w:lineRule="auto"/>
+              <w:jc w:val="left"/>
+            </w:pPr>
+            <w:r/>
+            <w:r>
+              <w:rPr>
+                <w:rFonts w:ascii="Malgun Gothic" w:hAnsi="Malgun Gothic" w:eastAsia="Malgun Gothic" w:cs="Malgun Gothic"/>
+                <w:b w:val="0"/>
+                <w:i w:val="0"/>
+                <w:sz w:val="16"/>
+              </w:rPr>
+              <w:t>link_all</w:t>
+            </w:r>
+          </w:p>
+        </w:tc>
+        <w:tc>
+          <w:tcPr>
+            <w:tcW w:type="dxa" w:w="1247"/>
+            <w:vAlign w:val="center"/>
+          </w:tcPr>
+          <w:p>
+            <w:pPr>
+              <w:spacing w:after="0" w:line="240" w:lineRule="auto"/>
+              <w:jc w:val="center"/>
+            </w:pPr>
+            <w:r/>
+            <w:r>
+              <w:rPr>
+                <w:rFonts w:ascii="Malgun Gothic" w:hAnsi="Malgun Gothic" w:eastAsia="Malgun Gothic" w:cs="Malgun Gothic"/>
+                <w:b w:val="0"/>
+                <w:i w:val="0"/>
+                <w:sz w:val="16"/>
+              </w:rPr>
+              <w:t>0.877±0.008</w:t>
+            </w:r>
+          </w:p>
+        </w:tc>
+        <w:tc>
+          <w:tcPr>
+            <w:tcW w:type="dxa" w:w="1247"/>
+            <w:vAlign w:val="center"/>
+          </w:tcPr>
+          <w:p>
+            <w:pPr>
+              <w:spacing w:after="0" w:line="240" w:lineRule="auto"/>
+              <w:jc w:val="center"/>
+            </w:pPr>
+            <w:r/>
+            <w:r>
+              <w:rPr>
+                <w:rFonts w:ascii="Malgun Gothic" w:hAnsi="Malgun Gothic" w:eastAsia="Malgun Gothic" w:cs="Malgun Gothic"/>
+                <w:b w:val="0"/>
+                <w:i w:val="0"/>
+                <w:sz w:val="16"/>
+              </w:rPr>
+              <w:t>0.938±0.007</w:t>
+            </w:r>
+          </w:p>
+        </w:tc>
+        <w:tc>
+          <w:tcPr>
+            <w:tcW w:type="dxa" w:w="1247"/>
+            <w:vAlign w:val="center"/>
+          </w:tcPr>
+          <w:p>
+            <w:pPr>
+              <w:spacing w:after="0" w:line="240" w:lineRule="auto"/>
+              <w:jc w:val="center"/>
+            </w:pPr>
+            <w:r/>
+            <w:r>
+              <w:rPr>
+                <w:rFonts w:ascii="Malgun Gothic" w:hAnsi="Malgun Gothic" w:eastAsia="Malgun Gothic" w:cs="Malgun Gothic"/>
+                <w:b w:val="0"/>
+                <w:i w:val="0"/>
+                <w:sz w:val="16"/>
+              </w:rPr>
+              <w:t>0.758±0.029</w:t>
+            </w:r>
+          </w:p>
+        </w:tc>
+      </w:tr>
+      <w:tr>
+        <w:trPr>
+          <w:cantSplit/>
+        </w:trPr>
+        <w:tc>
+          <w:tcPr>
+            <w:tcW w:type="dxa" w:w="1134"/>
+            <w:vAlign w:val="center"/>
+          </w:tcPr>
+          <w:p>
+            <w:pPr>
+              <w:spacing w:after="0" w:line="240" w:lineRule="auto"/>
+              <w:jc w:val="left"/>
+            </w:pPr>
+            <w:r/>
+            <w:r>
+              <w:rPr>
+                <w:rFonts w:ascii="Malgun Gothic" w:hAnsi="Malgun Gothic" w:eastAsia="Malgun Gothic" w:cs="Malgun Gothic"/>
+                <w:b w:val="0"/>
+                <w:i w:val="0"/>
+                <w:sz w:val="16"/>
+              </w:rPr>
+              <w:t>proposed</w:t>
+            </w:r>
+          </w:p>
+        </w:tc>
+        <w:tc>
+          <w:tcPr>
+            <w:tcW w:type="dxa" w:w="1247"/>
+            <w:vAlign w:val="center"/>
+          </w:tcPr>
+          <w:p>
+            <w:pPr>
+              <w:spacing w:after="0" w:line="240" w:lineRule="auto"/>
+              <w:jc w:val="center"/>
+            </w:pPr>
+            <w:r/>
+            <w:r>
+              <w:rPr>
+                <w:rFonts w:ascii="Malgun Gothic" w:hAnsi="Malgun Gothic" w:eastAsia="Malgun Gothic" w:cs="Malgun Gothic"/>
+                <w:b w:val="0"/>
+                <w:i w:val="0"/>
+                <w:sz w:val="16"/>
+              </w:rPr>
+              <w:t>0.923±0.033</w:t>
+            </w:r>
+          </w:p>
+        </w:tc>
+        <w:tc>
+          <w:tcPr>
+            <w:tcW w:type="dxa" w:w="1247"/>
+            <w:vAlign w:val="center"/>
+          </w:tcPr>
+          <w:p>
+            <w:pPr>
+              <w:spacing w:after="0" w:line="240" w:lineRule="auto"/>
+              <w:jc w:val="center"/>
+            </w:pPr>
+            <w:r/>
+            <w:r>
+              <w:rPr>
+                <w:rFonts w:ascii="Malgun Gothic" w:hAnsi="Malgun Gothic" w:eastAsia="Malgun Gothic" w:cs="Malgun Gothic"/>
+                <w:b w:val="0"/>
+                <w:i w:val="0"/>
+                <w:sz w:val="16"/>
+              </w:rPr>
+              <w:t>0.916±0.011</w:t>
+            </w:r>
+          </w:p>
+        </w:tc>
+        <w:tc>
+          <w:tcPr>
+            <w:tcW w:type="dxa" w:w="1247"/>
+            <w:vAlign w:val="center"/>
+          </w:tcPr>
+          <w:p>
+            <w:pPr>
+              <w:spacing w:after="0" w:line="240" w:lineRule="auto"/>
+              <w:jc w:val="center"/>
+            </w:pPr>
+            <w:r/>
+            <w:r>
+              <w:rPr>
+                <w:rFonts w:ascii="Malgun Gothic" w:hAnsi="Malgun Gothic" w:eastAsia="Malgun Gothic" w:cs="Malgun Gothic"/>
+                <w:b w:val="0"/>
+                <w:i w:val="0"/>
+                <w:sz w:val="16"/>
+              </w:rPr>
+              <w:t>0.756±0.012</w:t>
+            </w:r>
+          </w:p>
+        </w:tc>
+      </w:tr>
+    </w:tbl>
+    <w:p>
+      <w:r>
+        <w:br w:type="column"/>
+      </w:r>
+    </w:p>
+    <w:p>
+      <w:pPr>
+        <w:keepNext/>
+        <w:spacing w:before="0" w:after="40" w:line="240" w:lineRule="auto"/>
+        <w:jc w:val="left"/>
+      </w:pPr>
+      <w:r>
+        <w:rPr>
+          <w:rFonts w:ascii="Malgun Gothic" w:hAnsi="Malgun Gothic" w:eastAsia="Malgun Gothic" w:cs="Malgun Gothic"/>
+          <w:b/>
+          <w:i w:val="0"/>
+          <w:sz w:val="18"/>
+        </w:rPr>
+        <w:t>표 3. 그래프 사례별 paired 차이 (LA=`link_all`, HR=`hybrid_rerank`, P=`proposed`; R=Recall, LGR=링크 정답 Recall)</w:t>
+      </w:r>
+    </w:p>
+    <w:tbl>
+      <w:tblPr>
+        <w:tblW w:type="dxa" w:w="4819"/>
         <w:tblLayout w:type="fixed"/>
         <w:tblLook w:firstColumn="1" w:firstRow="1" w:lastColumn="0" w:lastRow="0" w:noHBand="0" w:noVBand="1" w:val="04A0"/>
         <w:jc w:val="left"/>
@@ -323,9 +1713,9 @@
       </w:tblPr>
       <w:tblGrid>
         <w:gridCol w:w="1361"/>
-        <w:gridCol w:w="1134"/>
-        <w:gridCol w:w="1134"/>
-        <w:gridCol w:w="1134"/>
+        <w:gridCol w:w="1814"/>
+        <w:gridCol w:w="794"/>
+        <w:gridCol w:w="850"/>
       </w:tblGrid>
       <w:tr>
         <w:trPr>
@@ -348,15 +1738,15 @@
                 <w:rFonts w:ascii="Malgun Gothic" w:hAnsi="Malgun Gothic" w:eastAsia="Malgun Gothic" w:cs="Malgun Gothic"/>
                 <w:b/>
                 <w:i w:val="0"/>
-                <w:sz w:val="18"/>
-              </w:rPr>
-              <w:t>집합·방법</w:t>
-            </w:r>
-          </w:p>
-        </w:tc>
-        <w:tc>
-          <w:tcPr>
-            <w:tcW w:type="dxa" w:w="1134"/>
+                <w:sz w:val="15"/>
+              </w:rPr>
+              <w:t>비교 / 지표</w:t>
+            </w:r>
+          </w:p>
+        </w:tc>
+        <w:tc>
+          <w:tcPr>
+            <w:tcW w:type="dxa" w:w="1814"/>
             <w:vAlign w:val="center"/>
           </w:tcPr>
           <w:p>
@@ -370,15 +1760,15 @@
                 <w:rFonts w:ascii="Malgun Gothic" w:hAnsi="Malgun Gothic" w:eastAsia="Malgun Gothic" w:cs="Malgun Gothic"/>
                 <w:b/>
                 <w:i w:val="0"/>
-                <w:sz w:val="18"/>
-              </w:rPr>
-              <w:t>Precision</w:t>
-            </w:r>
-          </w:p>
-        </w:tc>
-        <w:tc>
-          <w:tcPr>
-            <w:tcW w:type="dxa" w:w="1134"/>
+                <w:sz w:val="15"/>
+              </w:rPr>
+              <w:t>Δ [95% CI]</w:t>
+            </w:r>
+          </w:p>
+        </w:tc>
+        <w:tc>
+          <w:tcPr>
+            <w:tcW w:type="dxa" w:w="794"/>
             <w:vAlign w:val="center"/>
           </w:tcPr>
           <w:p>
@@ -392,15 +1782,15 @@
                 <w:rFonts w:ascii="Malgun Gothic" w:hAnsi="Malgun Gothic" w:eastAsia="Malgun Gothic" w:cs="Malgun Gothic"/>
                 <w:b/>
                 <w:i w:val="0"/>
-                <w:sz w:val="18"/>
-              </w:rPr>
-              <w:t>Recall</w:t>
-            </w:r>
-          </w:p>
-        </w:tc>
-        <w:tc>
-          <w:tcPr>
-            <w:tcW w:type="dxa" w:w="1134"/>
+                <w:sz w:val="15"/>
+              </w:rPr>
+              <w:t>p</w:t>
+            </w:r>
+          </w:p>
+        </w:tc>
+        <w:tc>
+          <w:tcPr>
+            <w:tcW w:type="dxa" w:w="850"/>
             <w:vAlign w:val="center"/>
           </w:tcPr>
           <w:p>
@@ -414,9 +1804,9 @@
                 <w:rFonts w:ascii="Malgun Gothic" w:hAnsi="Malgun Gothic" w:eastAsia="Malgun Gothic" w:cs="Malgun Gothic"/>
                 <w:b/>
                 <w:i w:val="0"/>
-                <w:sz w:val="18"/>
-              </w:rPr>
-              <w:t>MRR</w:t>
+                <w:sz w:val="15"/>
+              </w:rPr>
+              <w:t>쌍 / 비영</w:t>
             </w:r>
           </w:p>
         </w:tc>
@@ -441,75 +1831,75 @@
                 <w:rFonts w:ascii="Malgun Gothic" w:hAnsi="Malgun Gothic" w:eastAsia="Malgun Gothic" w:cs="Malgun Gothic"/>
                 <w:b w:val="0"/>
                 <w:i w:val="0"/>
-                <w:sz w:val="18"/>
-              </w:rPr>
-              <w:t>개발 제안법</w:t>
-            </w:r>
-          </w:p>
-        </w:tc>
-        <w:tc>
-          <w:tcPr>
-            <w:tcW w:type="dxa" w:w="1134"/>
-            <w:vAlign w:val="center"/>
-          </w:tcPr>
-          <w:p>
-            <w:pPr>
-              <w:spacing w:after="0" w:line="240" w:lineRule="auto"/>
-              <w:jc w:val="center"/>
-            </w:pPr>
-            <w:r/>
-            <w:r>
-              <w:rPr>
-                <w:rFonts w:ascii="Malgun Gothic" w:hAnsi="Malgun Gothic" w:eastAsia="Malgun Gothic" w:cs="Malgun Gothic"/>
-                <w:b w:val="0"/>
-                <w:i w:val="0"/>
-                <w:sz w:val="18"/>
-              </w:rPr>
-              <w:t>0.57±0.04</w:t>
-            </w:r>
-          </w:p>
-        </w:tc>
-        <w:tc>
-          <w:tcPr>
-            <w:tcW w:type="dxa" w:w="1134"/>
-            <w:vAlign w:val="center"/>
-          </w:tcPr>
-          <w:p>
-            <w:pPr>
-              <w:spacing w:after="0" w:line="240" w:lineRule="auto"/>
-              <w:jc w:val="center"/>
-            </w:pPr>
-            <w:r/>
-            <w:r>
-              <w:rPr>
-                <w:rFonts w:ascii="Malgun Gothic" w:hAnsi="Malgun Gothic" w:eastAsia="Malgun Gothic" w:cs="Malgun Gothic"/>
-                <w:b w:val="0"/>
-                <w:i w:val="0"/>
-                <w:sz w:val="18"/>
-              </w:rPr>
-              <w:t>0.69±0.04</w:t>
-            </w:r>
-          </w:p>
-        </w:tc>
-        <w:tc>
-          <w:tcPr>
-            <w:tcW w:type="dxa" w:w="1134"/>
-            <w:vAlign w:val="center"/>
-          </w:tcPr>
-          <w:p>
-            <w:pPr>
-              <w:spacing w:after="0" w:line="240" w:lineRule="auto"/>
-              <w:jc w:val="center"/>
-            </w:pPr>
-            <w:r/>
-            <w:r>
-              <w:rPr>
-                <w:rFonts w:ascii="Malgun Gothic" w:hAnsi="Malgun Gothic" w:eastAsia="Malgun Gothic" w:cs="Malgun Gothic"/>
-                <w:b w:val="0"/>
-                <w:i w:val="0"/>
-                <w:sz w:val="18"/>
-              </w:rPr>
-              <w:t>1.00±0.00</w:t>
+                <w:sz w:val="15"/>
+              </w:rPr>
+              <w:t>LA−HR / R</w:t>
+            </w:r>
+          </w:p>
+        </w:tc>
+        <w:tc>
+          <w:tcPr>
+            <w:tcW w:type="dxa" w:w="1814"/>
+            <w:vAlign w:val="center"/>
+          </w:tcPr>
+          <w:p>
+            <w:pPr>
+              <w:spacing w:after="0" w:line="240" w:lineRule="auto"/>
+              <w:jc w:val="center"/>
+            </w:pPr>
+            <w:r/>
+            <w:r>
+              <w:rPr>
+                <w:rFonts w:ascii="Malgun Gothic" w:hAnsi="Malgun Gothic" w:eastAsia="Malgun Gothic" w:cs="Malgun Gothic"/>
+                <w:b w:val="0"/>
+                <w:i w:val="0"/>
+                <w:sz w:val="15"/>
+              </w:rPr>
+              <w:t>+0.264 [0.158, 0.367]</w:t>
+            </w:r>
+          </w:p>
+        </w:tc>
+        <w:tc>
+          <w:tcPr>
+            <w:tcW w:type="dxa" w:w="794"/>
+            <w:vAlign w:val="center"/>
+          </w:tcPr>
+          <w:p>
+            <w:pPr>
+              <w:spacing w:after="0" w:line="240" w:lineRule="auto"/>
+              <w:jc w:val="center"/>
+            </w:pPr>
+            <w:r/>
+            <w:r>
+              <w:rPr>
+                <w:rFonts w:ascii="Malgun Gothic" w:hAnsi="Malgun Gothic" w:eastAsia="Malgun Gothic" w:cs="Malgun Gothic"/>
+                <w:b w:val="0"/>
+                <w:i w:val="0"/>
+                <w:sz w:val="15"/>
+              </w:rPr>
+              <w:t>&lt;.001</w:t>
+            </w:r>
+          </w:p>
+        </w:tc>
+        <w:tc>
+          <w:tcPr>
+            <w:tcW w:type="dxa" w:w="850"/>
+            <w:vAlign w:val="center"/>
+          </w:tcPr>
+          <w:p>
+            <w:pPr>
+              <w:spacing w:after="0" w:line="240" w:lineRule="auto"/>
+              <w:jc w:val="center"/>
+            </w:pPr>
+            <w:r/>
+            <w:r>
+              <w:rPr>
+                <w:rFonts w:ascii="Malgun Gothic" w:hAnsi="Malgun Gothic" w:eastAsia="Malgun Gothic" w:cs="Malgun Gothic"/>
+                <w:b w:val="0"/>
+                <w:i w:val="0"/>
+                <w:sz w:val="15"/>
+              </w:rPr>
+              <w:t>20/14</w:t>
             </w:r>
           </w:p>
         </w:tc>
@@ -534,75 +1924,75 @@
                 <w:rFonts w:ascii="Malgun Gothic" w:hAnsi="Malgun Gothic" w:eastAsia="Malgun Gothic" w:cs="Malgun Gothic"/>
                 <w:b w:val="0"/>
                 <w:i w:val="0"/>
-                <w:sz w:val="18"/>
-              </w:rPr>
-              <w:t>신규 제안법</w:t>
-            </w:r>
-          </w:p>
-        </w:tc>
-        <w:tc>
-          <w:tcPr>
-            <w:tcW w:type="dxa" w:w="1134"/>
-            <w:vAlign w:val="center"/>
-          </w:tcPr>
-          <w:p>
-            <w:pPr>
-              <w:spacing w:after="0" w:line="240" w:lineRule="auto"/>
-              <w:jc w:val="center"/>
-            </w:pPr>
-            <w:r/>
-            <w:r>
-              <w:rPr>
-                <w:rFonts w:ascii="Malgun Gothic" w:hAnsi="Malgun Gothic" w:eastAsia="Malgun Gothic" w:cs="Malgun Gothic"/>
-                <w:b w:val="0"/>
-                <w:i w:val="0"/>
-                <w:sz w:val="18"/>
-              </w:rPr>
-              <w:t>0.80±0.02</w:t>
-            </w:r>
-          </w:p>
-        </w:tc>
-        <w:tc>
-          <w:tcPr>
-            <w:tcW w:type="dxa" w:w="1134"/>
-            <w:vAlign w:val="center"/>
-          </w:tcPr>
-          <w:p>
-            <w:pPr>
-              <w:spacing w:after="0" w:line="240" w:lineRule="auto"/>
-              <w:jc w:val="center"/>
-            </w:pPr>
-            <w:r/>
-            <w:r>
-              <w:rPr>
-                <w:rFonts w:ascii="Malgun Gothic" w:hAnsi="Malgun Gothic" w:eastAsia="Malgun Gothic" w:cs="Malgun Gothic"/>
-                <w:b w:val="0"/>
-                <w:i w:val="0"/>
-                <w:sz w:val="18"/>
-              </w:rPr>
-              <w:t>0.89±0.05</w:t>
-            </w:r>
-          </w:p>
-        </w:tc>
-        <w:tc>
-          <w:tcPr>
-            <w:tcW w:type="dxa" w:w="1134"/>
-            <w:vAlign w:val="center"/>
-          </w:tcPr>
-          <w:p>
-            <w:pPr>
-              <w:spacing w:after="0" w:line="240" w:lineRule="auto"/>
-              <w:jc w:val="center"/>
-            </w:pPr>
-            <w:r/>
-            <w:r>
-              <w:rPr>
-                <w:rFonts w:ascii="Malgun Gothic" w:hAnsi="Malgun Gothic" w:eastAsia="Malgun Gothic" w:cs="Malgun Gothic"/>
-                <w:b w:val="0"/>
-                <w:i w:val="0"/>
-                <w:sz w:val="18"/>
-              </w:rPr>
-              <w:t>0.97±0.00</w:t>
+                <w:sz w:val="15"/>
+              </w:rPr>
+              <w:t>LA−HR / LGR</w:t>
+            </w:r>
+          </w:p>
+        </w:tc>
+        <w:tc>
+          <w:tcPr>
+            <w:tcW w:type="dxa" w:w="1814"/>
+            <w:vAlign w:val="center"/>
+          </w:tcPr>
+          <w:p>
+            <w:pPr>
+              <w:spacing w:after="0" w:line="240" w:lineRule="auto"/>
+              <w:jc w:val="center"/>
+            </w:pPr>
+            <w:r/>
+            <w:r>
+              <w:rPr>
+                <w:rFonts w:ascii="Malgun Gothic" w:hAnsi="Malgun Gothic" w:eastAsia="Malgun Gothic" w:cs="Malgun Gothic"/>
+                <w:b w:val="0"/>
+                <w:i w:val="0"/>
+                <w:sz w:val="15"/>
+              </w:rPr>
+              <w:t>+0.517 [0.308, 0.717]</w:t>
+            </w:r>
+          </w:p>
+        </w:tc>
+        <w:tc>
+          <w:tcPr>
+            <w:tcW w:type="dxa" w:w="794"/>
+            <w:vAlign w:val="center"/>
+          </w:tcPr>
+          <w:p>
+            <w:pPr>
+              <w:spacing w:after="0" w:line="240" w:lineRule="auto"/>
+              <w:jc w:val="center"/>
+            </w:pPr>
+            <w:r/>
+            <w:r>
+              <w:rPr>
+                <w:rFonts w:ascii="Malgun Gothic" w:hAnsi="Malgun Gothic" w:eastAsia="Malgun Gothic" w:cs="Malgun Gothic"/>
+                <w:b w:val="0"/>
+                <w:i w:val="0"/>
+                <w:sz w:val="15"/>
+              </w:rPr>
+              <w:t>&lt;.001</w:t>
+            </w:r>
+          </w:p>
+        </w:tc>
+        <w:tc>
+          <w:tcPr>
+            <w:tcW w:type="dxa" w:w="850"/>
+            <w:vAlign w:val="center"/>
+          </w:tcPr>
+          <w:p>
+            <w:pPr>
+              <w:spacing w:after="0" w:line="240" w:lineRule="auto"/>
+              <w:jc w:val="center"/>
+            </w:pPr>
+            <w:r/>
+            <w:r>
+              <w:rPr>
+                <w:rFonts w:ascii="Malgun Gothic" w:hAnsi="Malgun Gothic" w:eastAsia="Malgun Gothic" w:cs="Malgun Gothic"/>
+                <w:b w:val="0"/>
+                <w:i w:val="0"/>
+                <w:sz w:val="15"/>
+              </w:rPr>
+              <w:t>20/12</w:t>
             </w:r>
           </w:p>
         </w:tc>
@@ -627,207 +2017,75 @@
                 <w:rFonts w:ascii="Malgun Gothic" w:hAnsi="Malgun Gothic" w:eastAsia="Malgun Gothic" w:cs="Malgun Gothic"/>
                 <w:b w:val="0"/>
                 <w:i w:val="0"/>
-                <w:sz w:val="18"/>
-              </w:rPr>
-              <w:t>신규 link_all*</w:t>
-            </w:r>
-          </w:p>
-        </w:tc>
-        <w:tc>
-          <w:tcPr>
-            <w:tcW w:type="dxa" w:w="1134"/>
-            <w:vAlign w:val="center"/>
-          </w:tcPr>
-          <w:p>
-            <w:pPr>
-              <w:spacing w:after="0" w:line="240" w:lineRule="auto"/>
-              <w:jc w:val="center"/>
-            </w:pPr>
-            <w:r/>
-            <w:r>
-              <w:rPr>
-                <w:rFonts w:ascii="Malgun Gothic" w:hAnsi="Malgun Gothic" w:eastAsia="Malgun Gothic" w:cs="Malgun Gothic"/>
-                <w:b w:val="0"/>
-                <w:i w:val="0"/>
-                <w:sz w:val="18"/>
-              </w:rPr>
-              <w:t>0.78±0.04</w:t>
-            </w:r>
-          </w:p>
-        </w:tc>
-        <w:tc>
-          <w:tcPr>
-            <w:tcW w:type="dxa" w:w="1134"/>
-            <w:vAlign w:val="center"/>
-          </w:tcPr>
-          <w:p>
-            <w:pPr>
-              <w:spacing w:after="0" w:line="240" w:lineRule="auto"/>
-              <w:jc w:val="center"/>
-            </w:pPr>
-            <w:r/>
-            <w:r>
-              <w:rPr>
-                <w:rFonts w:ascii="Malgun Gothic" w:hAnsi="Malgun Gothic" w:eastAsia="Malgun Gothic" w:cs="Malgun Gothic"/>
-                <w:b w:val="0"/>
-                <w:i w:val="0"/>
-                <w:sz w:val="18"/>
-              </w:rPr>
-              <w:t>0.92±0.02</w:t>
-            </w:r>
-          </w:p>
-        </w:tc>
-        <w:tc>
-          <w:tcPr>
-            <w:tcW w:type="dxa" w:w="1134"/>
-            <w:vAlign w:val="center"/>
-          </w:tcPr>
-          <w:p>
-            <w:pPr>
-              <w:spacing w:after="0" w:line="240" w:lineRule="auto"/>
-              <w:jc w:val="center"/>
-            </w:pPr>
-            <w:r/>
-            <w:r>
-              <w:rPr>
-                <w:rFonts w:ascii="Malgun Gothic" w:hAnsi="Malgun Gothic" w:eastAsia="Malgun Gothic" w:cs="Malgun Gothic"/>
-                <w:b w:val="0"/>
-                <w:i w:val="0"/>
-                <w:sz w:val="18"/>
-              </w:rPr>
-              <w:t>1.00±0.00</w:t>
-            </w:r>
-          </w:p>
-        </w:tc>
-      </w:tr>
-    </w:tbl>
-    <w:p>
-      <w:pPr>
-        <w:keepNext/>
-        <w:spacing w:before="0" w:after="40" w:line="240" w:lineRule="auto"/>
-        <w:jc w:val="left"/>
-      </w:pPr>
-      <w:r>
-        <w:rPr>
-          <w:rFonts w:ascii="Malgun Gothic" w:hAnsi="Malgun Gothic" w:eastAsia="Malgun Gothic" w:cs="Malgun Gothic"/>
-          <w:b/>
-          <w:i w:val="0"/>
-          <w:sz w:val="18"/>
-        </w:rPr>
-        <w:t>표 2. 그래프형 문맥·답변 결과</w:t>
-      </w:r>
-    </w:p>
-    <w:tbl>
-      <w:tblPr>
-        <w:tblW w:type="dxa" w:w="4763"/>
-        <w:tblLayout w:type="fixed"/>
-        <w:tblLook w:firstColumn="1" w:firstRow="1" w:lastColumn="0" w:lastRow="0" w:noHBand="0" w:noVBand="1" w:val="04A0"/>
-        <w:jc w:val="left"/>
-        <w:tblBorders>
-          <w:top w:val="single" w:sz="4" w:space="0" w:color="000000"/>
-          <w:left w:val="single" w:sz="4" w:space="0" w:color="000000"/>
-          <w:bottom w:val="single" w:sz="4" w:space="0" w:color="000000"/>
-          <w:right w:val="single" w:sz="4" w:space="0" w:color="000000"/>
-          <w:insideH w:val="single" w:sz="4" w:space="0" w:color="000000"/>
-          <w:insideV w:val="single" w:sz="4" w:space="0" w:color="000000"/>
-        </w:tblBorders>
-      </w:tblPr>
-      <w:tblGrid>
-        <w:gridCol w:w="1361"/>
-        <w:gridCol w:w="1134"/>
-        <w:gridCol w:w="1134"/>
-        <w:gridCol w:w="1134"/>
-      </w:tblGrid>
-      <w:tr>
-        <w:trPr>
-          <w:cantSplit/>
-          <w:tblHeader w:val="true"/>
-        </w:trPr>
-        <w:tc>
-          <w:tcPr>
-            <w:tcW w:type="dxa" w:w="1361"/>
-            <w:vAlign w:val="center"/>
-          </w:tcPr>
-          <w:p>
-            <w:pPr>
-              <w:spacing w:after="0" w:line="240" w:lineRule="auto"/>
-              <w:jc w:val="left"/>
-            </w:pPr>
-            <w:r/>
-            <w:r>
-              <w:rPr>
-                <w:rFonts w:ascii="Malgun Gothic" w:hAnsi="Malgun Gothic" w:eastAsia="Malgun Gothic" w:cs="Malgun Gothic"/>
-                <w:b/>
-                <w:i w:val="0"/>
-                <w:sz w:val="18"/>
-              </w:rPr>
-              <w:t>집합·방법</w:t>
-            </w:r>
-          </w:p>
-        </w:tc>
-        <w:tc>
-          <w:tcPr>
-            <w:tcW w:type="dxa" w:w="1134"/>
-            <w:vAlign w:val="center"/>
-          </w:tcPr>
-          <w:p>
-            <w:pPr>
-              <w:spacing w:after="0" w:line="240" w:lineRule="auto"/>
-              <w:jc w:val="center"/>
-            </w:pPr>
-            <w:r/>
-            <w:r>
-              <w:rPr>
-                <w:rFonts w:ascii="Malgun Gothic" w:hAnsi="Malgun Gothic" w:eastAsia="Malgun Gothic" w:cs="Malgun Gothic"/>
-                <w:b/>
-                <w:i w:val="0"/>
-                <w:sz w:val="18"/>
-              </w:rPr>
-              <w:t>CP</w:t>
-            </w:r>
-          </w:p>
-        </w:tc>
-        <w:tc>
-          <w:tcPr>
-            <w:tcW w:type="dxa" w:w="1134"/>
-            <w:vAlign w:val="center"/>
-          </w:tcPr>
-          <w:p>
-            <w:pPr>
-              <w:spacing w:after="0" w:line="240" w:lineRule="auto"/>
-              <w:jc w:val="center"/>
-            </w:pPr>
-            <w:r/>
-            <w:r>
-              <w:rPr>
-                <w:rFonts w:ascii="Malgun Gothic" w:hAnsi="Malgun Gothic" w:eastAsia="Malgun Gothic" w:cs="Malgun Gothic"/>
-                <w:b/>
-                <w:i w:val="0"/>
-                <w:sz w:val="18"/>
-              </w:rPr>
-              <w:t>CR</w:t>
-            </w:r>
-          </w:p>
-        </w:tc>
-        <w:tc>
-          <w:tcPr>
-            <w:tcW w:type="dxa" w:w="1134"/>
-            <w:vAlign w:val="center"/>
-          </w:tcPr>
-          <w:p>
-            <w:pPr>
-              <w:spacing w:after="0" w:line="240" w:lineRule="auto"/>
-              <w:jc w:val="center"/>
-            </w:pPr>
-            <w:r/>
-            <w:r>
-              <w:rPr>
-                <w:rFonts w:ascii="Malgun Gothic" w:hAnsi="Malgun Gothic" w:eastAsia="Malgun Gothic" w:cs="Malgun Gothic"/>
-                <w:b/>
-                <w:i w:val="0"/>
-                <w:sz w:val="18"/>
-              </w:rPr>
-              <w:t>AC</w:t>
+                <w:sz w:val="15"/>
+              </w:rPr>
+              <w:t>LA−HR / CP</w:t>
+            </w:r>
+          </w:p>
+        </w:tc>
+        <w:tc>
+          <w:tcPr>
+            <w:tcW w:type="dxa" w:w="1814"/>
+            <w:vAlign w:val="center"/>
+          </w:tcPr>
+          <w:p>
+            <w:pPr>
+              <w:spacing w:after="0" w:line="240" w:lineRule="auto"/>
+              <w:jc w:val="center"/>
+            </w:pPr>
+            <w:r/>
+            <w:r>
+              <w:rPr>
+                <w:rFonts w:ascii="Malgun Gothic" w:hAnsi="Malgun Gothic" w:eastAsia="Malgun Gothic" w:cs="Malgun Gothic"/>
+                <w:b w:val="0"/>
+                <w:i w:val="0"/>
+                <w:sz w:val="15"/>
+              </w:rPr>
+              <w:t>−0.069 [−0.136, −0.004]</w:t>
+            </w:r>
+          </w:p>
+        </w:tc>
+        <w:tc>
+          <w:tcPr>
+            <w:tcW w:type="dxa" w:w="794"/>
+            <w:vAlign w:val="center"/>
+          </w:tcPr>
+          <w:p>
+            <w:pPr>
+              <w:spacing w:after="0" w:line="240" w:lineRule="auto"/>
+              <w:jc w:val="center"/>
+            </w:pPr>
+            <w:r/>
+            <w:r>
+              <w:rPr>
+                <w:rFonts w:ascii="Malgun Gothic" w:hAnsi="Malgun Gothic" w:eastAsia="Malgun Gothic" w:cs="Malgun Gothic"/>
+                <w:b w:val="0"/>
+                <w:i w:val="0"/>
+                <w:sz w:val="15"/>
+              </w:rPr>
+              <w:t>.077</w:t>
+            </w:r>
+          </w:p>
+        </w:tc>
+        <w:tc>
+          <w:tcPr>
+            <w:tcW w:type="dxa" w:w="850"/>
+            <w:vAlign w:val="center"/>
+          </w:tcPr>
+          <w:p>
+            <w:pPr>
+              <w:spacing w:after="0" w:line="240" w:lineRule="auto"/>
+              <w:jc w:val="center"/>
+            </w:pPr>
+            <w:r/>
+            <w:r>
+              <w:rPr>
+                <w:rFonts w:ascii="Malgun Gothic" w:hAnsi="Malgun Gothic" w:eastAsia="Malgun Gothic" w:cs="Malgun Gothic"/>
+                <w:b w:val="0"/>
+                <w:i w:val="0"/>
+                <w:sz w:val="15"/>
+              </w:rPr>
+              <w:t>20/13</w:t>
             </w:r>
           </w:p>
         </w:tc>
@@ -852,75 +2110,75 @@
                 <w:rFonts w:ascii="Malgun Gothic" w:hAnsi="Malgun Gothic" w:eastAsia="Malgun Gothic" w:cs="Malgun Gothic"/>
                 <w:b w:val="0"/>
                 <w:i w:val="0"/>
-                <w:sz w:val="18"/>
-              </w:rPr>
-              <w:t>개발 제안법</w:t>
-            </w:r>
-          </w:p>
-        </w:tc>
-        <w:tc>
-          <w:tcPr>
-            <w:tcW w:type="dxa" w:w="1134"/>
-            <w:vAlign w:val="center"/>
-          </w:tcPr>
-          <w:p>
-            <w:pPr>
-              <w:spacing w:after="0" w:line="240" w:lineRule="auto"/>
-              <w:jc w:val="center"/>
-            </w:pPr>
-            <w:r/>
-            <w:r>
-              <w:rPr>
-                <w:rFonts w:ascii="Malgun Gothic" w:hAnsi="Malgun Gothic" w:eastAsia="Malgun Gothic" w:cs="Malgun Gothic"/>
-                <w:b w:val="0"/>
-                <w:i w:val="0"/>
-                <w:sz w:val="18"/>
-              </w:rPr>
-              <w:t>0.79±0.07</w:t>
-            </w:r>
-          </w:p>
-        </w:tc>
-        <w:tc>
-          <w:tcPr>
-            <w:tcW w:type="dxa" w:w="1134"/>
-            <w:vAlign w:val="center"/>
-          </w:tcPr>
-          <w:p>
-            <w:pPr>
-              <w:spacing w:after="0" w:line="240" w:lineRule="auto"/>
-              <w:jc w:val="center"/>
-            </w:pPr>
-            <w:r/>
-            <w:r>
-              <w:rPr>
-                <w:rFonts w:ascii="Malgun Gothic" w:hAnsi="Malgun Gothic" w:eastAsia="Malgun Gothic" w:cs="Malgun Gothic"/>
-                <w:b w:val="0"/>
-                <w:i w:val="0"/>
-                <w:sz w:val="18"/>
-              </w:rPr>
-              <w:t>0.83±0.02</w:t>
-            </w:r>
-          </w:p>
-        </w:tc>
-        <w:tc>
-          <w:tcPr>
-            <w:tcW w:type="dxa" w:w="1134"/>
-            <w:vAlign w:val="center"/>
-          </w:tcPr>
-          <w:p>
-            <w:pPr>
-              <w:spacing w:after="0" w:line="240" w:lineRule="auto"/>
-              <w:jc w:val="center"/>
-            </w:pPr>
-            <w:r/>
-            <w:r>
-              <w:rPr>
-                <w:rFonts w:ascii="Malgun Gothic" w:hAnsi="Malgun Gothic" w:eastAsia="Malgun Gothic" w:cs="Malgun Gothic"/>
-                <w:b w:val="0"/>
-                <w:i w:val="0"/>
-                <w:sz w:val="18"/>
-              </w:rPr>
-              <w:t>0.74±0.03</w:t>
+                <w:sz w:val="15"/>
+              </w:rPr>
+              <w:t>LA−HR / AC</w:t>
+            </w:r>
+          </w:p>
+        </w:tc>
+        <w:tc>
+          <w:tcPr>
+            <w:tcW w:type="dxa" w:w="1814"/>
+            <w:vAlign w:val="center"/>
+          </w:tcPr>
+          <w:p>
+            <w:pPr>
+              <w:spacing w:after="0" w:line="240" w:lineRule="auto"/>
+              <w:jc w:val="center"/>
+            </w:pPr>
+            <w:r/>
+            <w:r>
+              <w:rPr>
+                <w:rFonts w:ascii="Malgun Gothic" w:hAnsi="Malgun Gothic" w:eastAsia="Malgun Gothic" w:cs="Malgun Gothic"/>
+                <w:b w:val="0"/>
+                <w:i w:val="0"/>
+                <w:sz w:val="15"/>
+              </w:rPr>
+              <w:t>+0.013 [−0.030, 0.070]</w:t>
+            </w:r>
+          </w:p>
+        </w:tc>
+        <w:tc>
+          <w:tcPr>
+            <w:tcW w:type="dxa" w:w="794"/>
+            <w:vAlign w:val="center"/>
+          </w:tcPr>
+          <w:p>
+            <w:pPr>
+              <w:spacing w:after="0" w:line="240" w:lineRule="auto"/>
+              <w:jc w:val="center"/>
+            </w:pPr>
+            <w:r/>
+            <w:r>
+              <w:rPr>
+                <w:rFonts w:ascii="Malgun Gothic" w:hAnsi="Malgun Gothic" w:eastAsia="Malgun Gothic" w:cs="Malgun Gothic"/>
+                <w:b w:val="0"/>
+                <w:i w:val="0"/>
+                <w:sz w:val="15"/>
+              </w:rPr>
+              <w:t>.784</w:t>
+            </w:r>
+          </w:p>
+        </w:tc>
+        <w:tc>
+          <w:tcPr>
+            <w:tcW w:type="dxa" w:w="850"/>
+            <w:vAlign w:val="center"/>
+          </w:tcPr>
+          <w:p>
+            <w:pPr>
+              <w:spacing w:after="0" w:line="240" w:lineRule="auto"/>
+              <w:jc w:val="center"/>
+            </w:pPr>
+            <w:r/>
+            <w:r>
+              <w:rPr>
+                <w:rFonts w:ascii="Malgun Gothic" w:hAnsi="Malgun Gothic" w:eastAsia="Malgun Gothic" w:cs="Malgun Gothic"/>
+                <w:b w:val="0"/>
+                <w:i w:val="0"/>
+                <w:sz w:val="15"/>
+              </w:rPr>
+              <w:t>20/20</w:t>
             </w:r>
           </w:p>
         </w:tc>
@@ -945,75 +2203,75 @@
                 <w:rFonts w:ascii="Malgun Gothic" w:hAnsi="Malgun Gothic" w:eastAsia="Malgun Gothic" w:cs="Malgun Gothic"/>
                 <w:b w:val="0"/>
                 <w:i w:val="0"/>
-                <w:sz w:val="18"/>
-              </w:rPr>
-              <w:t>신규 제안법</w:t>
-            </w:r>
-          </w:p>
-        </w:tc>
-        <w:tc>
-          <w:tcPr>
-            <w:tcW w:type="dxa" w:w="1134"/>
-            <w:vAlign w:val="center"/>
-          </w:tcPr>
-          <w:p>
-            <w:pPr>
-              <w:spacing w:after="0" w:line="240" w:lineRule="auto"/>
-              <w:jc w:val="center"/>
-            </w:pPr>
-            <w:r/>
-            <w:r>
-              <w:rPr>
-                <w:rFonts w:ascii="Malgun Gothic" w:hAnsi="Malgun Gothic" w:eastAsia="Malgun Gothic" w:cs="Malgun Gothic"/>
-                <w:b w:val="0"/>
-                <w:i w:val="0"/>
-                <w:sz w:val="18"/>
-              </w:rPr>
-              <w:t>0.97±0.02</w:t>
-            </w:r>
-          </w:p>
-        </w:tc>
-        <w:tc>
-          <w:tcPr>
-            <w:tcW w:type="dxa" w:w="1134"/>
-            <w:vAlign w:val="center"/>
-          </w:tcPr>
-          <w:p>
-            <w:pPr>
-              <w:spacing w:after="0" w:line="240" w:lineRule="auto"/>
-              <w:jc w:val="center"/>
-            </w:pPr>
-            <w:r/>
-            <w:r>
-              <w:rPr>
-                <w:rFonts w:ascii="Malgun Gothic" w:hAnsi="Malgun Gothic" w:eastAsia="Malgun Gothic" w:cs="Malgun Gothic"/>
-                <w:b w:val="0"/>
-                <w:i w:val="0"/>
-                <w:sz w:val="18"/>
-              </w:rPr>
-              <w:t>0.94±0.02</w:t>
-            </w:r>
-          </w:p>
-        </w:tc>
-        <w:tc>
-          <w:tcPr>
-            <w:tcW w:type="dxa" w:w="1134"/>
-            <w:vAlign w:val="center"/>
-          </w:tcPr>
-          <w:p>
-            <w:pPr>
-              <w:spacing w:after="0" w:line="240" w:lineRule="auto"/>
-              <w:jc w:val="center"/>
-            </w:pPr>
-            <w:r/>
-            <w:r>
-              <w:rPr>
-                <w:rFonts w:ascii="Malgun Gothic" w:hAnsi="Malgun Gothic" w:eastAsia="Malgun Gothic" w:cs="Malgun Gothic"/>
-                <w:b w:val="0"/>
-                <w:i w:val="0"/>
-                <w:sz w:val="18"/>
-              </w:rPr>
-              <w:t>0.76±0.01</w:t>
+                <w:sz w:val="15"/>
+              </w:rPr>
+              <w:t>P−HR / R</w:t>
+            </w:r>
+          </w:p>
+        </w:tc>
+        <w:tc>
+          <w:tcPr>
+            <w:tcW w:type="dxa" w:w="1814"/>
+            <w:vAlign w:val="center"/>
+          </w:tcPr>
+          <w:p>
+            <w:pPr>
+              <w:spacing w:after="0" w:line="240" w:lineRule="auto"/>
+              <w:jc w:val="center"/>
+            </w:pPr>
+            <w:r/>
+            <w:r>
+              <w:rPr>
+                <w:rFonts w:ascii="Malgun Gothic" w:hAnsi="Malgun Gothic" w:eastAsia="Malgun Gothic" w:cs="Malgun Gothic"/>
+                <w:b w:val="0"/>
+                <w:i w:val="0"/>
+                <w:sz w:val="15"/>
+              </w:rPr>
+              <w:t>+0.253 [0.161, 0.344]</w:t>
+            </w:r>
+          </w:p>
+        </w:tc>
+        <w:tc>
+          <w:tcPr>
+            <w:tcW w:type="dxa" w:w="794"/>
+            <w:vAlign w:val="center"/>
+          </w:tcPr>
+          <w:p>
+            <w:pPr>
+              <w:spacing w:after="0" w:line="240" w:lineRule="auto"/>
+              <w:jc w:val="center"/>
+            </w:pPr>
+            <w:r/>
+            <w:r>
+              <w:rPr>
+                <w:rFonts w:ascii="Malgun Gothic" w:hAnsi="Malgun Gothic" w:eastAsia="Malgun Gothic" w:cs="Malgun Gothic"/>
+                <w:b w:val="0"/>
+                <w:i w:val="0"/>
+                <w:sz w:val="15"/>
+              </w:rPr>
+              <w:t>&lt;.001</w:t>
+            </w:r>
+          </w:p>
+        </w:tc>
+        <w:tc>
+          <w:tcPr>
+            <w:tcW w:type="dxa" w:w="850"/>
+            <w:vAlign w:val="center"/>
+          </w:tcPr>
+          <w:p>
+            <w:pPr>
+              <w:spacing w:after="0" w:line="240" w:lineRule="auto"/>
+              <w:jc w:val="center"/>
+            </w:pPr>
+            <w:r/>
+            <w:r>
+              <w:rPr>
+                <w:rFonts w:ascii="Malgun Gothic" w:hAnsi="Malgun Gothic" w:eastAsia="Malgun Gothic" w:cs="Malgun Gothic"/>
+                <w:b w:val="0"/>
+                <w:i w:val="0"/>
+                <w:sz w:val="15"/>
+              </w:rPr>
+              <w:t>20/13</w:t>
             </w:r>
           </w:p>
         </w:tc>
@@ -1038,75 +2296,633 @@
                 <w:rFonts w:ascii="Malgun Gothic" w:hAnsi="Malgun Gothic" w:eastAsia="Malgun Gothic" w:cs="Malgun Gothic"/>
                 <w:b w:val="0"/>
                 <w:i w:val="0"/>
-                <w:sz w:val="18"/>
-              </w:rPr>
-              <w:t>신규 link_all*</w:t>
-            </w:r>
-          </w:p>
-        </w:tc>
-        <w:tc>
-          <w:tcPr>
-            <w:tcW w:type="dxa" w:w="1134"/>
-            <w:vAlign w:val="center"/>
-          </w:tcPr>
-          <w:p>
-            <w:pPr>
-              <w:spacing w:after="0" w:line="240" w:lineRule="auto"/>
-              <w:jc w:val="center"/>
-            </w:pPr>
-            <w:r/>
-            <w:r>
-              <w:rPr>
-                <w:rFonts w:ascii="Malgun Gothic" w:hAnsi="Malgun Gothic" w:eastAsia="Malgun Gothic" w:cs="Malgun Gothic"/>
-                <w:b w:val="0"/>
-                <w:i w:val="0"/>
-                <w:sz w:val="18"/>
-              </w:rPr>
-              <w:t>0.95±0.04</w:t>
-            </w:r>
-          </w:p>
-        </w:tc>
-        <w:tc>
-          <w:tcPr>
-            <w:tcW w:type="dxa" w:w="1134"/>
-            <w:vAlign w:val="center"/>
-          </w:tcPr>
-          <w:p>
-            <w:pPr>
-              <w:spacing w:after="0" w:line="240" w:lineRule="auto"/>
-              <w:jc w:val="center"/>
-            </w:pPr>
-            <w:r/>
-            <w:r>
-              <w:rPr>
-                <w:rFonts w:ascii="Malgun Gothic" w:hAnsi="Malgun Gothic" w:eastAsia="Malgun Gothic" w:cs="Malgun Gothic"/>
-                <w:b w:val="0"/>
-                <w:i w:val="0"/>
-                <w:sz w:val="18"/>
-              </w:rPr>
-              <w:t>0.95±0.01</w:t>
-            </w:r>
-          </w:p>
-        </w:tc>
-        <w:tc>
-          <w:tcPr>
-            <w:tcW w:type="dxa" w:w="1134"/>
-            <w:vAlign w:val="center"/>
-          </w:tcPr>
-          <w:p>
-            <w:pPr>
-              <w:spacing w:after="0" w:line="240" w:lineRule="auto"/>
-              <w:jc w:val="center"/>
-            </w:pPr>
-            <w:r/>
-            <w:r>
-              <w:rPr>
-                <w:rFonts w:ascii="Malgun Gothic" w:hAnsi="Malgun Gothic" w:eastAsia="Malgun Gothic" w:cs="Malgun Gothic"/>
-                <w:b w:val="0"/>
-                <w:i w:val="0"/>
-                <w:sz w:val="18"/>
-              </w:rPr>
-              <w:t>0.77±0.03</w:t>
+                <w:sz w:val="15"/>
+              </w:rPr>
+              <w:t>P−HR / LGR</w:t>
+            </w:r>
+          </w:p>
+        </w:tc>
+        <w:tc>
+          <w:tcPr>
+            <w:tcW w:type="dxa" w:w="1814"/>
+            <w:vAlign w:val="center"/>
+          </w:tcPr>
+          <w:p>
+            <w:pPr>
+              <w:spacing w:after="0" w:line="240" w:lineRule="auto"/>
+              <w:jc w:val="center"/>
+            </w:pPr>
+            <w:r/>
+            <w:r>
+              <w:rPr>
+                <w:rFonts w:ascii="Malgun Gothic" w:hAnsi="Malgun Gothic" w:eastAsia="Malgun Gothic" w:cs="Malgun Gothic"/>
+                <w:b w:val="0"/>
+                <w:i w:val="0"/>
+                <w:sz w:val="15"/>
+              </w:rPr>
+              <w:t>+0.475 [0.283, 0.667]</w:t>
+            </w:r>
+          </w:p>
+        </w:tc>
+        <w:tc>
+          <w:tcPr>
+            <w:tcW w:type="dxa" w:w="794"/>
+            <w:vAlign w:val="center"/>
+          </w:tcPr>
+          <w:p>
+            <w:pPr>
+              <w:spacing w:after="0" w:line="240" w:lineRule="auto"/>
+              <w:jc w:val="center"/>
+            </w:pPr>
+            <w:r/>
+            <w:r>
+              <w:rPr>
+                <w:rFonts w:ascii="Malgun Gothic" w:hAnsi="Malgun Gothic" w:eastAsia="Malgun Gothic" w:cs="Malgun Gothic"/>
+                <w:b w:val="0"/>
+                <w:i w:val="0"/>
+                <w:sz w:val="15"/>
+              </w:rPr>
+              <w:t>&lt;.001</w:t>
+            </w:r>
+          </w:p>
+        </w:tc>
+        <w:tc>
+          <w:tcPr>
+            <w:tcW w:type="dxa" w:w="850"/>
+            <w:vAlign w:val="center"/>
+          </w:tcPr>
+          <w:p>
+            <w:pPr>
+              <w:spacing w:after="0" w:line="240" w:lineRule="auto"/>
+              <w:jc w:val="center"/>
+            </w:pPr>
+            <w:r/>
+            <w:r>
+              <w:rPr>
+                <w:rFonts w:ascii="Malgun Gothic" w:hAnsi="Malgun Gothic" w:eastAsia="Malgun Gothic" w:cs="Malgun Gothic"/>
+                <w:b w:val="0"/>
+                <w:i w:val="0"/>
+                <w:sz w:val="15"/>
+              </w:rPr>
+              <w:t>20/12</w:t>
+            </w:r>
+          </w:p>
+        </w:tc>
+      </w:tr>
+      <w:tr>
+        <w:trPr>
+          <w:cantSplit/>
+        </w:trPr>
+        <w:tc>
+          <w:tcPr>
+            <w:tcW w:type="dxa" w:w="1361"/>
+            <w:vAlign w:val="center"/>
+          </w:tcPr>
+          <w:p>
+            <w:pPr>
+              <w:spacing w:after="0" w:line="240" w:lineRule="auto"/>
+              <w:jc w:val="left"/>
+            </w:pPr>
+            <w:r/>
+            <w:r>
+              <w:rPr>
+                <w:rFonts w:ascii="Malgun Gothic" w:hAnsi="Malgun Gothic" w:eastAsia="Malgun Gothic" w:cs="Malgun Gothic"/>
+                <w:b w:val="0"/>
+                <w:i w:val="0"/>
+                <w:sz w:val="15"/>
+              </w:rPr>
+              <w:t>P−HR / CP</w:t>
+            </w:r>
+          </w:p>
+        </w:tc>
+        <w:tc>
+          <w:tcPr>
+            <w:tcW w:type="dxa" w:w="1814"/>
+            <w:vAlign w:val="center"/>
+          </w:tcPr>
+          <w:p>
+            <w:pPr>
+              <w:spacing w:after="0" w:line="240" w:lineRule="auto"/>
+              <w:jc w:val="center"/>
+            </w:pPr>
+            <w:r/>
+            <w:r>
+              <w:rPr>
+                <w:rFonts w:ascii="Malgun Gothic" w:hAnsi="Malgun Gothic" w:eastAsia="Malgun Gothic" w:cs="Malgun Gothic"/>
+                <w:b w:val="0"/>
+                <w:i w:val="0"/>
+                <w:sz w:val="15"/>
+              </w:rPr>
+              <w:t>−0.023 [−0.075, 0.031]</w:t>
+            </w:r>
+          </w:p>
+        </w:tc>
+        <w:tc>
+          <w:tcPr>
+            <w:tcW w:type="dxa" w:w="794"/>
+            <w:vAlign w:val="center"/>
+          </w:tcPr>
+          <w:p>
+            <w:pPr>
+              <w:spacing w:after="0" w:line="240" w:lineRule="auto"/>
+              <w:jc w:val="center"/>
+            </w:pPr>
+            <w:r/>
+            <w:r>
+              <w:rPr>
+                <w:rFonts w:ascii="Malgun Gothic" w:hAnsi="Malgun Gothic" w:eastAsia="Malgun Gothic" w:cs="Malgun Gothic"/>
+                <w:b w:val="0"/>
+                <w:i w:val="0"/>
+                <w:sz w:val="15"/>
+              </w:rPr>
+              <w:t>.774</w:t>
+            </w:r>
+          </w:p>
+        </w:tc>
+        <w:tc>
+          <w:tcPr>
+            <w:tcW w:type="dxa" w:w="850"/>
+            <w:vAlign w:val="center"/>
+          </w:tcPr>
+          <w:p>
+            <w:pPr>
+              <w:spacing w:after="0" w:line="240" w:lineRule="auto"/>
+              <w:jc w:val="center"/>
+            </w:pPr>
+            <w:r/>
+            <w:r>
+              <w:rPr>
+                <w:rFonts w:ascii="Malgun Gothic" w:hAnsi="Malgun Gothic" w:eastAsia="Malgun Gothic" w:cs="Malgun Gothic"/>
+                <w:b w:val="0"/>
+                <w:i w:val="0"/>
+                <w:sz w:val="15"/>
+              </w:rPr>
+              <w:t>20/13</w:t>
+            </w:r>
+          </w:p>
+        </w:tc>
+      </w:tr>
+      <w:tr>
+        <w:trPr>
+          <w:cantSplit/>
+        </w:trPr>
+        <w:tc>
+          <w:tcPr>
+            <w:tcW w:type="dxa" w:w="1361"/>
+            <w:vAlign w:val="center"/>
+          </w:tcPr>
+          <w:p>
+            <w:pPr>
+              <w:spacing w:after="0" w:line="240" w:lineRule="auto"/>
+              <w:jc w:val="left"/>
+            </w:pPr>
+            <w:r/>
+            <w:r>
+              <w:rPr>
+                <w:rFonts w:ascii="Malgun Gothic" w:hAnsi="Malgun Gothic" w:eastAsia="Malgun Gothic" w:cs="Malgun Gothic"/>
+                <w:b w:val="0"/>
+                <w:i w:val="0"/>
+                <w:sz w:val="15"/>
+              </w:rPr>
+              <w:t>P−HR / AC</w:t>
+            </w:r>
+          </w:p>
+        </w:tc>
+        <w:tc>
+          <w:tcPr>
+            <w:tcW w:type="dxa" w:w="1814"/>
+            <w:vAlign w:val="center"/>
+          </w:tcPr>
+          <w:p>
+            <w:pPr>
+              <w:spacing w:after="0" w:line="240" w:lineRule="auto"/>
+              <w:jc w:val="center"/>
+            </w:pPr>
+            <w:r/>
+            <w:r>
+              <w:rPr>
+                <w:rFonts w:ascii="Malgun Gothic" w:hAnsi="Malgun Gothic" w:eastAsia="Malgun Gothic" w:cs="Malgun Gothic"/>
+                <w:b w:val="0"/>
+                <w:i w:val="0"/>
+                <w:sz w:val="15"/>
+              </w:rPr>
+              <w:t>+0.011 [−0.034, 0.071]</w:t>
+            </w:r>
+          </w:p>
+        </w:tc>
+        <w:tc>
+          <w:tcPr>
+            <w:tcW w:type="dxa" w:w="794"/>
+            <w:vAlign w:val="center"/>
+          </w:tcPr>
+          <w:p>
+            <w:pPr>
+              <w:spacing w:after="0" w:line="240" w:lineRule="auto"/>
+              <w:jc w:val="center"/>
+            </w:pPr>
+            <w:r/>
+            <w:r>
+              <w:rPr>
+                <w:rFonts w:ascii="Malgun Gothic" w:hAnsi="Malgun Gothic" w:eastAsia="Malgun Gothic" w:cs="Malgun Gothic"/>
+                <w:b w:val="0"/>
+                <w:i w:val="0"/>
+                <w:sz w:val="15"/>
+              </w:rPr>
+              <w:t>.596</w:t>
+            </w:r>
+          </w:p>
+        </w:tc>
+        <w:tc>
+          <w:tcPr>
+            <w:tcW w:type="dxa" w:w="850"/>
+            <w:vAlign w:val="center"/>
+          </w:tcPr>
+          <w:p>
+            <w:pPr>
+              <w:spacing w:after="0" w:line="240" w:lineRule="auto"/>
+              <w:jc w:val="center"/>
+            </w:pPr>
+            <w:r/>
+            <w:r>
+              <w:rPr>
+                <w:rFonts w:ascii="Malgun Gothic" w:hAnsi="Malgun Gothic" w:eastAsia="Malgun Gothic" w:cs="Malgun Gothic"/>
+                <w:b w:val="0"/>
+                <w:i w:val="0"/>
+                <w:sz w:val="15"/>
+              </w:rPr>
+              <w:t>20/20</w:t>
+            </w:r>
+          </w:p>
+        </w:tc>
+      </w:tr>
+      <w:tr>
+        <w:trPr>
+          <w:cantSplit/>
+        </w:trPr>
+        <w:tc>
+          <w:tcPr>
+            <w:tcW w:type="dxa" w:w="1361"/>
+            <w:vAlign w:val="center"/>
+          </w:tcPr>
+          <w:p>
+            <w:pPr>
+              <w:spacing w:after="0" w:line="240" w:lineRule="auto"/>
+              <w:jc w:val="left"/>
+            </w:pPr>
+            <w:r/>
+            <w:r>
+              <w:rPr>
+                <w:rFonts w:ascii="Malgun Gothic" w:hAnsi="Malgun Gothic" w:eastAsia="Malgun Gothic" w:cs="Malgun Gothic"/>
+                <w:b w:val="0"/>
+                <w:i w:val="0"/>
+                <w:sz w:val="15"/>
+              </w:rPr>
+              <w:t>P−LA / R</w:t>
+            </w:r>
+          </w:p>
+        </w:tc>
+        <w:tc>
+          <w:tcPr>
+            <w:tcW w:type="dxa" w:w="1814"/>
+            <w:vAlign w:val="center"/>
+          </w:tcPr>
+          <w:p>
+            <w:pPr>
+              <w:spacing w:after="0" w:line="240" w:lineRule="auto"/>
+              <w:jc w:val="center"/>
+            </w:pPr>
+            <w:r/>
+            <w:r>
+              <w:rPr>
+                <w:rFonts w:ascii="Malgun Gothic" w:hAnsi="Malgun Gothic" w:eastAsia="Malgun Gothic" w:cs="Malgun Gothic"/>
+                <w:b w:val="0"/>
+                <w:i w:val="0"/>
+                <w:sz w:val="15"/>
+              </w:rPr>
+              <w:t>−0.011 [−0.058, 0.025]</w:t>
+            </w:r>
+          </w:p>
+        </w:tc>
+        <w:tc>
+          <w:tcPr>
+            <w:tcW w:type="dxa" w:w="794"/>
+            <w:vAlign w:val="center"/>
+          </w:tcPr>
+          <w:p>
+            <w:pPr>
+              <w:spacing w:after="0" w:line="240" w:lineRule="auto"/>
+              <w:jc w:val="center"/>
+            </w:pPr>
+            <w:r/>
+            <w:r>
+              <w:rPr>
+                <w:rFonts w:ascii="Malgun Gothic" w:hAnsi="Malgun Gothic" w:eastAsia="Malgun Gothic" w:cs="Malgun Gothic"/>
+                <w:b w:val="0"/>
+                <w:i w:val="0"/>
+                <w:sz w:val="15"/>
+              </w:rPr>
+              <w:t>.750</w:t>
+            </w:r>
+          </w:p>
+        </w:tc>
+        <w:tc>
+          <w:tcPr>
+            <w:tcW w:type="dxa" w:w="850"/>
+            <w:vAlign w:val="center"/>
+          </w:tcPr>
+          <w:p>
+            <w:pPr>
+              <w:spacing w:after="0" w:line="240" w:lineRule="auto"/>
+              <w:jc w:val="center"/>
+            </w:pPr>
+            <w:r/>
+            <w:r>
+              <w:rPr>
+                <w:rFonts w:ascii="Malgun Gothic" w:hAnsi="Malgun Gothic" w:eastAsia="Malgun Gothic" w:cs="Malgun Gothic"/>
+                <w:b w:val="0"/>
+                <w:i w:val="0"/>
+                <w:sz w:val="15"/>
+              </w:rPr>
+              <w:t>20/4</w:t>
+            </w:r>
+          </w:p>
+        </w:tc>
+      </w:tr>
+      <w:tr>
+        <w:trPr>
+          <w:cantSplit/>
+        </w:trPr>
+        <w:tc>
+          <w:tcPr>
+            <w:tcW w:type="dxa" w:w="1361"/>
+            <w:vAlign w:val="center"/>
+          </w:tcPr>
+          <w:p>
+            <w:pPr>
+              <w:spacing w:after="0" w:line="240" w:lineRule="auto"/>
+              <w:jc w:val="left"/>
+            </w:pPr>
+            <w:r/>
+            <w:r>
+              <w:rPr>
+                <w:rFonts w:ascii="Malgun Gothic" w:hAnsi="Malgun Gothic" w:eastAsia="Malgun Gothic" w:cs="Malgun Gothic"/>
+                <w:b w:val="0"/>
+                <w:i w:val="0"/>
+                <w:sz w:val="15"/>
+              </w:rPr>
+              <w:t>P−LA / LGR</w:t>
+            </w:r>
+          </w:p>
+        </w:tc>
+        <w:tc>
+          <w:tcPr>
+            <w:tcW w:type="dxa" w:w="1814"/>
+            <w:vAlign w:val="center"/>
+          </w:tcPr>
+          <w:p>
+            <w:pPr>
+              <w:spacing w:after="0" w:line="240" w:lineRule="auto"/>
+              <w:jc w:val="center"/>
+            </w:pPr>
+            <w:r/>
+            <w:r>
+              <w:rPr>
+                <w:rFonts w:ascii="Malgun Gothic" w:hAnsi="Malgun Gothic" w:eastAsia="Malgun Gothic" w:cs="Malgun Gothic"/>
+                <w:b w:val="0"/>
+                <w:i w:val="0"/>
+                <w:sz w:val="15"/>
+              </w:rPr>
+              <w:t>−0.042 [−0.117, 0.017]</w:t>
+            </w:r>
+          </w:p>
+        </w:tc>
+        <w:tc>
+          <w:tcPr>
+            <w:tcW w:type="dxa" w:w="794"/>
+            <w:vAlign w:val="center"/>
+          </w:tcPr>
+          <w:p>
+            <w:pPr>
+              <w:spacing w:after="0" w:line="240" w:lineRule="auto"/>
+              <w:jc w:val="center"/>
+            </w:pPr>
+            <w:r/>
+            <w:r>
+              <w:rPr>
+                <w:rFonts w:ascii="Malgun Gothic" w:hAnsi="Malgun Gothic" w:eastAsia="Malgun Gothic" w:cs="Malgun Gothic"/>
+                <w:b w:val="0"/>
+                <w:i w:val="0"/>
+                <w:sz w:val="15"/>
+              </w:rPr>
+              <w:t>.500</w:t>
+            </w:r>
+          </w:p>
+        </w:tc>
+        <w:tc>
+          <w:tcPr>
+            <w:tcW w:type="dxa" w:w="850"/>
+            <w:vAlign w:val="center"/>
+          </w:tcPr>
+          <w:p>
+            <w:pPr>
+              <w:spacing w:after="0" w:line="240" w:lineRule="auto"/>
+              <w:jc w:val="center"/>
+            </w:pPr>
+            <w:r/>
+            <w:r>
+              <w:rPr>
+                <w:rFonts w:ascii="Malgun Gothic" w:hAnsi="Malgun Gothic" w:eastAsia="Malgun Gothic" w:cs="Malgun Gothic"/>
+                <w:b w:val="0"/>
+                <w:i w:val="0"/>
+                <w:sz w:val="15"/>
+              </w:rPr>
+              <w:t>20/3</w:t>
+            </w:r>
+          </w:p>
+        </w:tc>
+      </w:tr>
+      <w:tr>
+        <w:trPr>
+          <w:cantSplit/>
+        </w:trPr>
+        <w:tc>
+          <w:tcPr>
+            <w:tcW w:type="dxa" w:w="1361"/>
+            <w:vAlign w:val="center"/>
+          </w:tcPr>
+          <w:p>
+            <w:pPr>
+              <w:spacing w:after="0" w:line="240" w:lineRule="auto"/>
+              <w:jc w:val="left"/>
+            </w:pPr>
+            <w:r/>
+            <w:r>
+              <w:rPr>
+                <w:rFonts w:ascii="Malgun Gothic" w:hAnsi="Malgun Gothic" w:eastAsia="Malgun Gothic" w:cs="Malgun Gothic"/>
+                <w:b w:val="0"/>
+                <w:i w:val="0"/>
+                <w:sz w:val="15"/>
+              </w:rPr>
+              <w:t>P−LA / CP</w:t>
+            </w:r>
+          </w:p>
+        </w:tc>
+        <w:tc>
+          <w:tcPr>
+            <w:tcW w:type="dxa" w:w="1814"/>
+            <w:vAlign w:val="center"/>
+          </w:tcPr>
+          <w:p>
+            <w:pPr>
+              <w:spacing w:after="0" w:line="240" w:lineRule="auto"/>
+              <w:jc w:val="center"/>
+            </w:pPr>
+            <w:r/>
+            <w:r>
+              <w:rPr>
+                <w:rFonts w:ascii="Malgun Gothic" w:hAnsi="Malgun Gothic" w:eastAsia="Malgun Gothic" w:cs="Malgun Gothic"/>
+                <w:b w:val="0"/>
+                <w:i w:val="0"/>
+                <w:sz w:val="15"/>
+              </w:rPr>
+              <w:t>+0.046 [0.009, 0.089]</w:t>
+            </w:r>
+          </w:p>
+        </w:tc>
+        <w:tc>
+          <w:tcPr>
+            <w:tcW w:type="dxa" w:w="794"/>
+            <w:vAlign w:val="center"/>
+          </w:tcPr>
+          <w:p>
+            <w:pPr>
+              <w:spacing w:after="0" w:line="240" w:lineRule="auto"/>
+              <w:jc w:val="center"/>
+            </w:pPr>
+            <w:r/>
+            <w:r>
+              <w:rPr>
+                <w:rFonts w:ascii="Malgun Gothic" w:hAnsi="Malgun Gothic" w:eastAsia="Malgun Gothic" w:cs="Malgun Gothic"/>
+                <w:b w:val="0"/>
+                <w:i w:val="0"/>
+                <w:sz w:val="15"/>
+              </w:rPr>
+              <w:t>.067</w:t>
+            </w:r>
+          </w:p>
+        </w:tc>
+        <w:tc>
+          <w:tcPr>
+            <w:tcW w:type="dxa" w:w="850"/>
+            <w:vAlign w:val="center"/>
+          </w:tcPr>
+          <w:p>
+            <w:pPr>
+              <w:spacing w:after="0" w:line="240" w:lineRule="auto"/>
+              <w:jc w:val="center"/>
+            </w:pPr>
+            <w:r/>
+            <w:r>
+              <w:rPr>
+                <w:rFonts w:ascii="Malgun Gothic" w:hAnsi="Malgun Gothic" w:eastAsia="Malgun Gothic" w:cs="Malgun Gothic"/>
+                <w:b w:val="0"/>
+                <w:i w:val="0"/>
+                <w:sz w:val="15"/>
+              </w:rPr>
+              <w:t>20/14</w:t>
+            </w:r>
+          </w:p>
+        </w:tc>
+      </w:tr>
+      <w:tr>
+        <w:trPr>
+          <w:cantSplit/>
+        </w:trPr>
+        <w:tc>
+          <w:tcPr>
+            <w:tcW w:type="dxa" w:w="1361"/>
+            <w:vAlign w:val="center"/>
+          </w:tcPr>
+          <w:p>
+            <w:pPr>
+              <w:spacing w:after="0" w:line="240" w:lineRule="auto"/>
+              <w:jc w:val="left"/>
+            </w:pPr>
+            <w:r/>
+            <w:r>
+              <w:rPr>
+                <w:rFonts w:ascii="Malgun Gothic" w:hAnsi="Malgun Gothic" w:eastAsia="Malgun Gothic" w:cs="Malgun Gothic"/>
+                <w:b w:val="0"/>
+                <w:i w:val="0"/>
+                <w:sz w:val="15"/>
+              </w:rPr>
+              <w:t>P−LA / AC</w:t>
+            </w:r>
+          </w:p>
+        </w:tc>
+        <w:tc>
+          <w:tcPr>
+            <w:tcW w:type="dxa" w:w="1814"/>
+            <w:vAlign w:val="center"/>
+          </w:tcPr>
+          <w:p>
+            <w:pPr>
+              <w:spacing w:after="0" w:line="240" w:lineRule="auto"/>
+              <w:jc w:val="center"/>
+            </w:pPr>
+            <w:r/>
+            <w:r>
+              <w:rPr>
+                <w:rFonts w:ascii="Malgun Gothic" w:hAnsi="Malgun Gothic" w:eastAsia="Malgun Gothic" w:cs="Malgun Gothic"/>
+                <w:b w:val="0"/>
+                <w:i w:val="0"/>
+                <w:sz w:val="15"/>
+              </w:rPr>
+              <w:t>−0.002 [−0.022, 0.021]</w:t>
+            </w:r>
+          </w:p>
+        </w:tc>
+        <w:tc>
+          <w:tcPr>
+            <w:tcW w:type="dxa" w:w="794"/>
+            <w:vAlign w:val="center"/>
+          </w:tcPr>
+          <w:p>
+            <w:pPr>
+              <w:spacing w:after="0" w:line="240" w:lineRule="auto"/>
+              <w:jc w:val="center"/>
+            </w:pPr>
+            <w:r/>
+            <w:r>
+              <w:rPr>
+                <w:rFonts w:ascii="Malgun Gothic" w:hAnsi="Malgun Gothic" w:eastAsia="Malgun Gothic" w:cs="Malgun Gothic"/>
+                <w:b w:val="0"/>
+                <w:i w:val="0"/>
+                <w:sz w:val="15"/>
+              </w:rPr>
+              <w:t>.622</w:t>
+            </w:r>
+          </w:p>
+        </w:tc>
+        <w:tc>
+          <w:tcPr>
+            <w:tcW w:type="dxa" w:w="850"/>
+            <w:vAlign w:val="center"/>
+          </w:tcPr>
+          <w:p>
+            <w:pPr>
+              <w:spacing w:after="0" w:line="240" w:lineRule="auto"/>
+              <w:jc w:val="center"/>
+            </w:pPr>
+            <w:r/>
+            <w:r>
+              <w:rPr>
+                <w:rFonts w:ascii="Malgun Gothic" w:hAnsi="Malgun Gothic" w:eastAsia="Malgun Gothic" w:cs="Malgun Gothic"/>
+                <w:b w:val="0"/>
+                <w:i w:val="0"/>
+                <w:sz w:val="15"/>
+              </w:rPr>
+              <w:t>20/20</w:t>
             </w:r>
           </w:p>
         </w:tc>
@@ -1124,17 +2940,30 @@
           <w:i w:val="0"/>
           <w:sz w:val="18"/>
         </w:rPr>
-        <w:t>개발 결과는 기존 그래프 사례 5건, 신규 결과는 15건이다. CP/CR/AC는 Context Precision/Context Recall/Answer Correctness를 뜻한다. 제안법은 신규 사례를 반복마다 모두 완료했지만 `link_all`은 반복별 14·15·14건만 완료했다</w:t>
-      </w:r>
-      <w:r>
-        <w:rPr>
-          <w:rFonts w:ascii="Malgun Gothic" w:hAnsi="Malgun Gothic" w:eastAsia="Malgun Gothic" w:cs="Malgun Gothic"/>
-          <w:b w:val="0"/>
-          <w:i/>
-          <w:sz w:val="18"/>
-        </w:rPr>
-        <w:t xml:space="preserve">. 사례별 점수는 가용 반복 평균으로 짝지었다. 신규 15건의 제안법−`link_all` 평균 차이는 Precision +0.0411(15쌍 중 비영 차이 7), Recall −0.0333(15쌍 중 4), Context Precision +0.0231(15쌍 중 9; 양측 exact Wilcoxon p=0.1289)이다. p값은 2개 소스 그룹·9개 지표 비교에서 보정하지 않은 탐색값이며, 반복 수가 불균형하고 일부 문항이 같은 규정·링크를 공유한다. </w:t>
-      </w:r>
+        <w:t>각 사례 점수를 3회 평균한 뒤 짝지었다. CI는 사례를 10,000회 재표집한 percentile bootstrap이고, p는 0 차이를 제외한 양측 exact Wilcoxon이다. p값은 다중 비교 보정 전 탐색값이며 일부 사례가 규정·링크를 공유한다. 개발 그래프 5건에서 hybrid_rerank/link_all/proposed의 Recall은 0.478/0.667/0.689, 링크 정답 Recall은 0.067/0.400/0.433이었다. 별도 신규 15건에서는 각각 0.622/0.911/0.889, 0.289/0.867/0.800이었다. 신규 그래프 15건은 승인 링크 36개 중 서로 다른 링크 15개를 골라 양쪽 원문을 바탕으로 LLM이 작성했고 검색 결과로 조정하지 않았다. 그러나 링크 자체에서 사례를 만들었으므로 링크 방식에 유리할 수 있으며, 신규 라벨은 아직 저자 검수 전이다.</w:t>
+      </w:r>
+    </w:p>
+    <w:p>
+      <w:pPr>
+        <w:keepNext/>
+        <w:spacing w:before="0" w:after="40" w:line="240" w:lineRule="auto"/>
+        <w:jc w:val="left"/>
+      </w:pPr>
+      <w:r>
+        <w:rPr>
+          <w:rFonts w:ascii="Malgun Gothic" w:hAnsi="Malgun Gothic" w:eastAsia="Malgun Gothic" w:cs="Malgun Gothic"/>
+          <w:b/>
+          <w:i w:val="0"/>
+          <w:sz w:val="20"/>
+        </w:rPr>
+        <w:t>4. 논의 및 결론</w:t>
+      </w:r>
+    </w:p>
+    <w:p>
+      <w:pPr>
+        <w:spacing w:before="0" w:after="40" w:line="240" w:lineRule="auto"/>
+        <w:jc w:val="left"/>
+      </w:pPr>
       <w:r>
         <w:rPr>
           <w:rFonts w:ascii="Malgun Gothic" w:hAnsi="Malgun Gothic" w:eastAsia="Malgun Gothic" w:cs="Malgun Gothic"/>
@@ -1142,7 +2971,52 @@
           <w:i w:val="0"/>
           <w:sz w:val="18"/>
         </w:rPr>
-        <w:t>`link_all` 수치는 부분 실행 자료다. 신규 라벨은 아직 사람 검수 전이며, 서로 다른 승인 링크 36개 중 15개만 사용했다. 신규 그래프 검색 지연은 제안법 2.638±0.030초, 부분 실행 `link_all` 1.689±0.030초다. 토큰 비용은 집계되지 않아 비용 비교로 해석할 수 없다.</w:t>
+        <w:t>전체 그래프 사례에서 링크 기반 방식은 `hybrid_rerank`보다 Recall과 링크 정답 Recall을 크게 높였다. 선택 재정렬은 `link_all` 대비 평균 Recall을 0.011 낮추면서 CP를 0.046 높였다. CP의 bootstrap 구간은 양수였지만 exact Wilcoxon p=.067이므로 확정적 차이로 해석하지 않는다. 첫 재정렬도 `hybrid` 대비 Precision을 0.230에서 0.781, CP를 0.759에서 0.946으로 높였다.</w:t>
+      </w:r>
+    </w:p>
+    <w:p>
+      <w:pPr>
+        <w:spacing w:before="0" w:after="40" w:line="240" w:lineRule="auto"/>
+        <w:jc w:val="left"/>
+      </w:pPr>
+      <w:r>
+        <w:rPr>
+          <w:rFonts w:ascii="Malgun Gothic" w:hAnsi="Malgun Gothic" w:eastAsia="Malgun Gothic" w:cs="Malgun Gothic"/>
+          <w:b w:val="0"/>
+          <w:i w:val="0"/>
+          <w:sz w:val="18"/>
+        </w:rPr>
+        <w:t>이 검색 개선은 답변 정확도로 거의 이어지지 않았다: `hybrid_rerank`와 `proposed`의 AC는 0.745와 0.756으로 비슷하다. 생성 모델이 불완전한 근거의 빈틈을 보완했거나 RAGAS AC가 근거 품질 변화를 충분히 구분하지 못했을 수 있다. 같은 모델이 생성과 채점을 수행했으므로, 향후 규정 실무자의 블라인드 답변·근거 검수가 필요하다.</w:t>
+      </w:r>
+    </w:p>
+    <w:p>
+      <w:pPr>
+        <w:spacing w:before="0" w:after="40" w:line="240" w:lineRule="auto"/>
+        <w:jc w:val="left"/>
+      </w:pPr>
+      <w:r>
+        <w:rPr>
+          <w:rFonts w:ascii="Malgun Gothic" w:hAnsi="Malgun Gothic" w:eastAsia="Malgun Gothic" w:cs="Malgun Gothic"/>
+          <w:b w:val="0"/>
+          <w:i w:val="0"/>
+          <w:sz w:val="18"/>
+        </w:rPr>
+        <w:t>이 코퍼스의 그래프 Recall은 BM25(0.592), hybrid(0.521), dense(0.383) 순이었다. Dense 기준선은 조항 단위가 부모 청크의 임베딩을 물려받아 이웃 조항이 같은 점수로 묶이는 표현 한계가 있다. 따라서 관찰된 dense 열세는 이 기준선의 특성이며 일반적인 dense 검색의 한계로 확대하지 않는다.</w:t>
+      </w:r>
+    </w:p>
+    <w:p>
+      <w:pPr>
+        <w:spacing w:before="0" w:after="40" w:line="240" w:lineRule="auto"/>
+        <w:jc w:val="left"/>
+      </w:pPr>
+      <w:r>
+        <w:rPr>
+          <w:rFonts w:ascii="Malgun Gothic" w:hAnsi="Malgun Gothic" w:eastAsia="Malgun Gothic" w:cs="Malgun Gothic"/>
+          <w:b w:val="0"/>
+          <w:i w:val="0"/>
+          <w:sz w:val="18"/>
+        </w:rPr>
+        <w:t>결과는 승인 링크 기반 확장이 이 사례들에서 교차문서 근거 회수를 돕는다는 탐색적 근거다. 15/20 그래프 사례가 링크에서 초안된 점, 미검수 정답, 사례 간 규정·링크 공유, 실행 당시 승인 링크 스냅샷 부재가 일반화를 제한한다. 연결 근거가 누락되어도 현 시스템은 직접 근거로 답할 수 있고 이를 알리는 경고가 없다. 사람 검수, 링크 변경 이력 추적, 불완전 답변 경고를 검증하기 전에는 실제 운전 판단에 사용해서는 안 된다.</w:t>
       </w:r>
     </w:p>
     <w:p>
@@ -1158,37 +3032,6 @@
           <w:i w:val="0"/>
           <w:sz w:val="20"/>
         </w:rPr>
-        <w:t>4. 결론 및 한계</w:t>
-      </w:r>
-    </w:p>
-    <w:p>
-      <w:pPr>
-        <w:spacing w:before="0" w:after="40" w:line="240" w:lineRule="auto"/>
-        <w:jc w:val="left"/>
-      </w:pPr>
-      <w:r>
-        <w:rPr>
-          <w:rFonts w:ascii="Malgun Gothic" w:hAnsi="Malgun Gothic" w:eastAsia="Malgun Gothic" w:cs="Malgun Gothic"/>
-          <w:b w:val="0"/>
-          <w:i w:val="0"/>
-          <w:sz w:val="18"/>
-        </w:rPr>
-        <w:t>이 결과는 미검수 신규 사례에서의 제한된 파이프라인 점검이다. 자동 judge는 생성 모델과 같고, 신규 질문·답·근거 및 링크 양끝의 필요성은 독립 검증되지 않았다. `link_all`의 누락 사례와 반복 수 불균형, 미실행 `hybrid_rerank` 비교도 선택 재정렬의 효과를 분리하지 못한다. 운영 사용 전에 규정 실무자의 독립 검수, 동일 조건의 완결 기준선, 링크 승인·버전·폐기 절차의 추적이 필요하다. 현재 시스템은 연결 근거가 선택되지 않아도 직접 근거로 답할 수 있고 이를 알리는 별도 경고가 없다. 따라서 안전성 검증 전에는 실제 운전 판단에 사용해서는 안 되며, 사용자 경고 기능도 구현·검증이 필요하다.</w:t>
-      </w:r>
-    </w:p>
-    <w:p>
-      <w:pPr>
-        <w:keepNext/>
-        <w:spacing w:before="0" w:after="40" w:line="240" w:lineRule="auto"/>
-        <w:jc w:val="left"/>
-      </w:pPr>
-      <w:r>
-        <w:rPr>
-          <w:rFonts w:ascii="Malgun Gothic" w:hAnsi="Malgun Gothic" w:eastAsia="Malgun Gothic" w:cs="Malgun Gothic"/>
-          <w:b/>
-          <w:i w:val="0"/>
-          <w:sz w:val="20"/>
-        </w:rPr>
         <w:t>참고문헌</w:t>
       </w:r>
     </w:p>
@@ -1483,7 +3326,7 @@
           <w:i w:val="0"/>
           <w:sz w:val="15"/>
         </w:rPr>
-        <w:t>, pp. 150–58, 2024.</w:t>
+        <w:t>, pp. 150–158, 2024.</w:t>
       </w:r>
     </w:p>
     <w:sectPr>

</xml_diff>

<commit_message>
Update Round 4 paper and results
</commit_message>
<xml_diff>
--- a/paper/final/final_draft.docx
+++ b/paper/final/final_draft.docx
@@ -60,7 +60,7 @@
           <w:i w:val="0"/>
           <w:sz w:val="18"/>
         </w:rPr>
-        <w:t>철도 규정 질의는 일반 규정과 현장 길라잡이의 노선별 조치를 함께 요구할 수 있다.</w:t>
+        <w:t>철도 규정 질의는 현장 길라잡이의 구체 절차와 규정의 보고·운전 조건을 함께 요구할 수 있다.</w:t>
       </w:r>
       <w:r>
         <w:rPr>
@@ -77,7 +77,7 @@
           <w:i w:val="0"/>
           <w:sz w:val="18"/>
         </w:rPr>
-        <w:t>본 연구는 사람이 승인한 교차문서 구간 링크를 검색 확장 경계로 평가하고, 링크 근거만 다시 고르는 선택 재정렬을 부차 기여로 분석한다.</w:t>
+        <w:t>본 연구는 관리자가 연결한 문서 구간 링크를 검색 확장 경계로 평가하고, 연결 근거 선택 재정렬은 부차 분석으로 둔다.</w:t>
       </w:r>
       <w:r>
         <w:rPr>
@@ -94,7 +94,7 @@
           <w:i w:val="0"/>
           <w:sz w:val="18"/>
         </w:rPr>
-        <w:t>그래프 질의 20건에서 링크 기반 두 방식은 `hybrid_rerank`보다 Recall을 0.253–0.264, 링크 정답 Recall을 0.475–0.517 높였다.</w:t>
+        <w:t>link_all−hybrid_rerank_k3의 그래프 Recall 차이는 개발 사례에서 +0.128, 신규 사례에서 +0.267이며 군집 구간으로 기술한다.</w:t>
       </w:r>
       <w:r>
         <w:rPr>
@@ -111,7 +111,7 @@
           <w:i w:val="0"/>
           <w:sz w:val="18"/>
         </w:rPr>
-        <w:t>다만 20건 중 15건은 해당 링크에서 LLM이 초안한 미검수 사례이므로, 결과는 탐색적 파이프라인 평가로 한정한다.</w:t>
+        <w:t>링크에서 초안한 신규 사례의 정답 검수가 남아 있어, 결과는 탐색적 파이프라인 평가로 한정한다.</w:t>
       </w:r>
     </w:p>
     <w:p>
@@ -155,7 +155,7 @@
           <w:i w:val="0"/>
           <w:sz w:val="18"/>
         </w:rPr>
-        <w:t>기관사와 관제원이 설비 고장 대응을 확인할 때는 길라잡이의 구체 조치와 규정의 보고·운전 조건을 함께 찾아야 한다. 예를 들어 보조전원장치 기동불능 질의에는 연장급전·부하감소 절차와 관제 보고 의무가 모두 필요할 수 있다. 본 연구가 다루는 범위는 오프라인 근거 확인·검토 지원이며, 운전 지시를 제공하거나 대체하지 않는다.</w:t>
+        <w:t>기관사와 관제원이 설비 고장 대응을 확인할 때는 길라잡이의 구체 조치와 규정의 보고·운전 조건을 함께 찾아야 한다. 본 연구의 범위는 오프라인 근거 확인·검토 지원이며, 운전 지시를 제공하거나 대체하지 않는다.</w:t>
       </w:r>
     </w:p>
     <w:p>
@@ -170,7 +170,7 @@
           <w:i w:val="0"/>
           <w:sz w:val="18"/>
         </w:rPr>
-        <w:t>검색 증강 생성은 외부 근거를 답변에 연결하고[1], LLM 재정렬은 검색 후보의 질의 관련 순서를 조정한다[2]. GraphRAG와 LightRAG는 문서에서 관계 그래프를 구성하며[3,4], KG²RAG는 검색 seed와 연결된 문단을 확장한다[5]. 철도 QA의 CARAG는 공간·사례 그래프를 탐색하고, 도시철도 출입문 RAG는 고장 이력과 재정렬을 이용한다[6,7]. LegalBench-RAG는 평가용 전문가 근거 주석을 제공하며[8], 한국어 법률 하이브리드 RAG는 검색 조합을 최적화한다[9]. 본 연구는 새 검색 알고리즘의 우월성을 주장하지 않고, 사람이 승인한 규정–길라잡이 구간 링크를 확장 경계로 삼는 운영 설계를 평가한다.</w:t>
+        <w:t>검색 증강 생성은 외부 근거를 답변에 연결하고[1], LLM 재정렬은 검색 후보의 질의 관련 순서를 조정한다[2]. GraphRAG와 LightRAG는 문서에서 관계 그래프를 구성하며[3,4], KG²RAG는 검색 seed에서 연결 문단을 확장한다[5]. 철도 QA의 CARAG는 공간·사례 그래프를 탐색하고, 도시철도 출입문 RAG는 고장 이력과 재정렬을 이용한다[6,7]. LegalBench-RAG는 전문가 근거 주석을 제공하고, 한국어 법률 RAG는 검색 조합을 최적화한다[8,9]. 답변 지표는 RAGAS로 계산한다[10]. 본 연구는 새 그래프 검색 알고리즘의 우월성을 주장하지 않는다. 평가 단위는 추출한 일반 관계가 아니라 관리자가 연결한 규정–길라잡이 문서 구간이며, 승인 링크 상태와 근거 위치를 운영 경계로 사용한다.</w:t>
       </w:r>
     </w:p>
     <w:p>
@@ -201,7 +201,7 @@
           <w:i w:val="0"/>
           <w:sz w:val="18"/>
         </w:rPr>
-        <w:t>하이브리드 검색과 1차 재정렬로 직접 근거를 고른 뒤, 직접 근거는 보존하고 승인 링크로 연결 구간을 확장한다. `link_all`은 연결 근거를 모두 포함하고, `proposed`는 그 연결 근거만 질문별로 다시 재정렬해 선택한다. 선택 결과가 없거나 재정렬에 실패하면 연결 근거를 넣지 않으므로 직접 근거만으로 답변할 수 있다.</w:t>
+        <w:t>하이브리드 검색 상위 20개에서 LLM이 직접 근거를 최대 top_k=5개 고른 뒤, 직접 근거를 보존하고 승인 링크로 연결 구간을 확장한다. link_all은 전체 최종 근거를 최대 top_k×3개로 제한한다. proposed는 직접 근거를 모두 보존하고 연결 근거만 질문별 재정렬해 최대 top_k×2개 더한다. hybrid_rerank_k3는 선택 결과가 3개 미만이면 hybrid 순위에서 보충하는 예산 민감도 기준선이다. 이 opt-in 설정은 최대 top_k까지 최소 개수를 보장하며, 기본값은 기존 동작을 유지한다.</w:t>
       </w:r>
     </w:p>
     <w:p>
@@ -256,7 +256,7 @@
           <w:i w:val="0"/>
           <w:sz w:val="18"/>
         </w:rPr>
-        <w:t>그림 1. 직접 근거를 유지하고 링크 경유 근거만 선택한다.</w:t>
+        <w:t>그림 1. 직접 근거를 보존하고 링크 경유 근거만 선택한다.</w:t>
       </w:r>
     </w:p>
     <w:p>
@@ -287,12 +287,7 @@
           <w:i w:val="0"/>
           <w:sz w:val="18"/>
         </w:rPr>
-        <w:t>평가셋 v3의 `existing_v2` 17건(문서형 12, 그래프형 5)은 개발 자료로, `llm_drafted` 20건(문서형 5, 그래프형 15)은 별도로 보고했다. 6개 변형을 모두 37건에서 3회 완주했다. 표의 값은 반복별 사례 평균의 평균 ± 반복 간 표본 표준편차이다. 검색 Recall은 정답 근거 중 검색된 비율, Precision은 검색 근거 중 정답 비율이며, linked-gold recall은 링크 경유 정답 근거의 Recall이다. CP/CR/AC는 RAGAS Context Precision/Recall/Answer Correctness이다[10]. 생성·평가 judge는 같은 `gpt-5.6-luna` 모델이고 검색·평가 임베딩은 각각 `text-embedding-3-small`, `text-embedding-3-large`를 사용했다.</w:t>
-      </w:r>
-    </w:p>
-    <w:p>
-      <w:r>
-        <w:br w:type="column"/>
+        <w:t>평가셋 v3은 existing_v2 17건(문서형 12, 그래프형 5)과 llm_drafted 20건(문서형 5, 그래프형 15)으로 구성된다. 일곱 변형 모두 37건에서 검색을 세 번 실행했다. hybrid_rerank_k3는 r1만 답변·RAGAS 평가를 하고 r2–r3은 검색 평가만 했다. 따라서 검색 평균은 세 반복, 해당 변형의 답변 지표 및 matched 답변 비교는 r1 결과다. 생성·평가 judge는 gpt-5.6-luna, 검색·평가 임베딩은 각각 text-embedding-3-small, text-embedding-3-large였다. 평가 시점 승인 링크 스냅샷에는 36개 행이 있으며 해시는 paper/experiments/provenance.md에 기록했다. task brief의 37개와 한 개 차이가 있다.</w:t>
       </w:r>
     </w:p>
     <w:p>
@@ -308,7 +303,790 @@
           <w:i w:val="0"/>
           <w:sz w:val="18"/>
         </w:rPr>
-        <w:t>표 1. 그래프 질의 검색 결과 (n=20, `hybrid_rr`=`hybrid_rerank`)</w:t>
+        <w:t>표 1. 그래프 질의 검색 결과 (n=20). hybrid_rr=hybrid_rerank, hybrid_rr_k3=hybrid_rerank_k3. 값은 세 반복의 사례 평균 ± 반복 간 표본 표준편차다.</w:t>
+      </w:r>
+    </w:p>
+    <w:tbl>
+      <w:tblPr>
+        <w:tblW w:type="dxa" w:w="4819"/>
+        <w:tblLayout w:type="fixed"/>
+        <w:tblLook w:firstColumn="1" w:firstRow="1" w:lastColumn="0" w:lastRow="0" w:noHBand="0" w:noVBand="1" w:val="04A0"/>
+        <w:jc w:val="left"/>
+        <w:tblBorders>
+          <w:top w:val="single" w:sz="4" w:space="0" w:color="000000"/>
+          <w:left w:val="single" w:sz="4" w:space="0" w:color="000000"/>
+          <w:bottom w:val="single" w:sz="4" w:space="0" w:color="000000"/>
+          <w:right w:val="single" w:sz="4" w:space="0" w:color="000000"/>
+          <w:insideH w:val="single" w:sz="4" w:space="0" w:color="000000"/>
+          <w:insideV w:val="single" w:sz="4" w:space="0" w:color="000000"/>
+        </w:tblBorders>
+      </w:tblPr>
+      <w:tblGrid>
+        <w:gridCol w:w="1361"/>
+        <w:gridCol w:w="1814"/>
+        <w:gridCol w:w="794"/>
+        <w:gridCol w:w="850"/>
+      </w:tblGrid>
+      <w:tr>
+        <w:trPr>
+          <w:cantSplit/>
+          <w:tblHeader w:val="true"/>
+        </w:trPr>
+        <w:tc>
+          <w:tcPr>
+            <w:tcW w:type="dxa" w:w="1361"/>
+            <w:vAlign w:val="center"/>
+          </w:tcPr>
+          <w:p>
+            <w:pPr>
+              <w:spacing w:after="0" w:line="240" w:lineRule="auto"/>
+              <w:jc w:val="left"/>
+            </w:pPr>
+            <w:r/>
+            <w:r>
+              <w:rPr>
+                <w:rFonts w:ascii="Malgun Gothic" w:hAnsi="Malgun Gothic" w:eastAsia="Malgun Gothic" w:cs="Malgun Gothic"/>
+                <w:b/>
+                <w:i w:val="0"/>
+                <w:sz w:val="16"/>
+              </w:rPr>
+              <w:t>변형</w:t>
+            </w:r>
+          </w:p>
+        </w:tc>
+        <w:tc>
+          <w:tcPr>
+            <w:tcW w:type="dxa" w:w="1814"/>
+            <w:vAlign w:val="center"/>
+          </w:tcPr>
+          <w:p>
+            <w:pPr>
+              <w:spacing w:after="0" w:line="240" w:lineRule="auto"/>
+              <w:jc w:val="center"/>
+            </w:pPr>
+            <w:r/>
+            <w:r>
+              <w:rPr>
+                <w:rFonts w:ascii="Malgun Gothic" w:hAnsi="Malgun Gothic" w:eastAsia="Malgun Gothic" w:cs="Malgun Gothic"/>
+                <w:b/>
+                <w:i w:val="0"/>
+                <w:sz w:val="16"/>
+              </w:rPr>
+              <w:t>Recall</w:t>
+            </w:r>
+          </w:p>
+        </w:tc>
+        <w:tc>
+          <w:tcPr>
+            <w:tcW w:type="dxa" w:w="794"/>
+            <w:vAlign w:val="center"/>
+          </w:tcPr>
+          <w:p>
+            <w:pPr>
+              <w:spacing w:after="0" w:line="240" w:lineRule="auto"/>
+              <w:jc w:val="center"/>
+            </w:pPr>
+            <w:r/>
+            <w:r>
+              <w:rPr>
+                <w:rFonts w:ascii="Malgun Gothic" w:hAnsi="Malgun Gothic" w:eastAsia="Malgun Gothic" w:cs="Malgun Gothic"/>
+                <w:b/>
+                <w:i w:val="0"/>
+                <w:sz w:val="16"/>
+              </w:rPr>
+              <w:t>링크 정답 Recall</w:t>
+            </w:r>
+          </w:p>
+        </w:tc>
+        <w:tc>
+          <w:tcPr>
+            <w:tcW w:type="dxa" w:w="850"/>
+            <w:vAlign w:val="center"/>
+          </w:tcPr>
+          <w:p>
+            <w:pPr>
+              <w:spacing w:after="0" w:line="240" w:lineRule="auto"/>
+              <w:jc w:val="center"/>
+            </w:pPr>
+            <w:r/>
+            <w:r>
+              <w:rPr>
+                <w:rFonts w:ascii="Malgun Gothic" w:hAnsi="Malgun Gothic" w:eastAsia="Malgun Gothic" w:cs="Malgun Gothic"/>
+                <w:b/>
+                <w:i w:val="0"/>
+                <w:sz w:val="16"/>
+              </w:rPr>
+              <w:t>근거 수/질의</w:t>
+            </w:r>
+          </w:p>
+        </w:tc>
+      </w:tr>
+      <w:tr>
+        <w:trPr>
+          <w:cantSplit/>
+        </w:trPr>
+        <w:tc>
+          <w:tcPr>
+            <w:tcW w:type="dxa" w:w="1361"/>
+            <w:vAlign w:val="center"/>
+          </w:tcPr>
+          <w:p>
+            <w:pPr>
+              <w:spacing w:after="0" w:line="240" w:lineRule="auto"/>
+              <w:jc w:val="left"/>
+            </w:pPr>
+            <w:r/>
+            <w:r>
+              <w:rPr>
+                <w:rFonts w:ascii="Malgun Gothic" w:hAnsi="Malgun Gothic" w:eastAsia="Malgun Gothic" w:cs="Malgun Gothic"/>
+                <w:b w:val="0"/>
+                <w:i w:val="0"/>
+                <w:sz w:val="16"/>
+              </w:rPr>
+              <w:t>bm25</w:t>
+            </w:r>
+          </w:p>
+        </w:tc>
+        <w:tc>
+          <w:tcPr>
+            <w:tcW w:type="dxa" w:w="1814"/>
+            <w:vAlign w:val="center"/>
+          </w:tcPr>
+          <w:p>
+            <w:pPr>
+              <w:spacing w:after="0" w:line="240" w:lineRule="auto"/>
+              <w:jc w:val="center"/>
+            </w:pPr>
+            <w:r/>
+            <w:r>
+              <w:rPr>
+                <w:rFonts w:ascii="Malgun Gothic" w:hAnsi="Malgun Gothic" w:eastAsia="Malgun Gothic" w:cs="Malgun Gothic"/>
+                <w:b w:val="0"/>
+                <w:i w:val="0"/>
+                <w:sz w:val="16"/>
+              </w:rPr>
+              <w:t>0.592 ± 0.000</w:t>
+            </w:r>
+          </w:p>
+        </w:tc>
+        <w:tc>
+          <w:tcPr>
+            <w:tcW w:type="dxa" w:w="794"/>
+            <w:vAlign w:val="center"/>
+          </w:tcPr>
+          <w:p>
+            <w:pPr>
+              <w:spacing w:after="0" w:line="240" w:lineRule="auto"/>
+              <w:jc w:val="center"/>
+            </w:pPr>
+            <w:r/>
+            <w:r>
+              <w:rPr>
+                <w:rFonts w:ascii="Malgun Gothic" w:hAnsi="Malgun Gothic" w:eastAsia="Malgun Gothic" w:cs="Malgun Gothic"/>
+                <w:b w:val="0"/>
+                <w:i w:val="0"/>
+                <w:sz w:val="16"/>
+              </w:rPr>
+              <w:t>0.275 ± 0.000</w:t>
+            </w:r>
+          </w:p>
+        </w:tc>
+        <w:tc>
+          <w:tcPr>
+            <w:tcW w:type="dxa" w:w="850"/>
+            <w:vAlign w:val="center"/>
+          </w:tcPr>
+          <w:p>
+            <w:pPr>
+              <w:spacing w:after="0" w:line="240" w:lineRule="auto"/>
+              <w:jc w:val="center"/>
+            </w:pPr>
+            <w:r/>
+            <w:r>
+              <w:rPr>
+                <w:rFonts w:ascii="Malgun Gothic" w:hAnsi="Malgun Gothic" w:eastAsia="Malgun Gothic" w:cs="Malgun Gothic"/>
+                <w:b w:val="0"/>
+                <w:i w:val="0"/>
+                <w:sz w:val="16"/>
+              </w:rPr>
+              <w:t>5.00 ± 0.00</w:t>
+            </w:r>
+          </w:p>
+        </w:tc>
+      </w:tr>
+      <w:tr>
+        <w:trPr>
+          <w:cantSplit/>
+        </w:trPr>
+        <w:tc>
+          <w:tcPr>
+            <w:tcW w:type="dxa" w:w="1361"/>
+            <w:vAlign w:val="center"/>
+          </w:tcPr>
+          <w:p>
+            <w:pPr>
+              <w:spacing w:after="0" w:line="240" w:lineRule="auto"/>
+              <w:jc w:val="left"/>
+            </w:pPr>
+            <w:r/>
+            <w:r>
+              <w:rPr>
+                <w:rFonts w:ascii="Malgun Gothic" w:hAnsi="Malgun Gothic" w:eastAsia="Malgun Gothic" w:cs="Malgun Gothic"/>
+                <w:b w:val="0"/>
+                <w:i w:val="0"/>
+                <w:sz w:val="16"/>
+              </w:rPr>
+              <w:t>dense</w:t>
+            </w:r>
+          </w:p>
+        </w:tc>
+        <w:tc>
+          <w:tcPr>
+            <w:tcW w:type="dxa" w:w="1814"/>
+            <w:vAlign w:val="center"/>
+          </w:tcPr>
+          <w:p>
+            <w:pPr>
+              <w:spacing w:after="0" w:line="240" w:lineRule="auto"/>
+              <w:jc w:val="center"/>
+            </w:pPr>
+            <w:r/>
+            <w:r>
+              <w:rPr>
+                <w:rFonts w:ascii="Malgun Gothic" w:hAnsi="Malgun Gothic" w:eastAsia="Malgun Gothic" w:cs="Malgun Gothic"/>
+                <w:b w:val="0"/>
+                <w:i w:val="0"/>
+                <w:sz w:val="16"/>
+              </w:rPr>
+              <w:t>0.383 ± 0.000</w:t>
+            </w:r>
+          </w:p>
+        </w:tc>
+        <w:tc>
+          <w:tcPr>
+            <w:tcW w:type="dxa" w:w="794"/>
+            <w:vAlign w:val="center"/>
+          </w:tcPr>
+          <w:p>
+            <w:pPr>
+              <w:spacing w:after="0" w:line="240" w:lineRule="auto"/>
+              <w:jc w:val="center"/>
+            </w:pPr>
+            <w:r/>
+            <w:r>
+              <w:rPr>
+                <w:rFonts w:ascii="Malgun Gothic" w:hAnsi="Malgun Gothic" w:eastAsia="Malgun Gothic" w:cs="Malgun Gothic"/>
+                <w:b w:val="0"/>
+                <w:i w:val="0"/>
+                <w:sz w:val="16"/>
+              </w:rPr>
+              <w:t>0.000 ± 0.000</w:t>
+            </w:r>
+          </w:p>
+        </w:tc>
+        <w:tc>
+          <w:tcPr>
+            <w:tcW w:type="dxa" w:w="850"/>
+            <w:vAlign w:val="center"/>
+          </w:tcPr>
+          <w:p>
+            <w:pPr>
+              <w:spacing w:after="0" w:line="240" w:lineRule="auto"/>
+              <w:jc w:val="center"/>
+            </w:pPr>
+            <w:r/>
+            <w:r>
+              <w:rPr>
+                <w:rFonts w:ascii="Malgun Gothic" w:hAnsi="Malgun Gothic" w:eastAsia="Malgun Gothic" w:cs="Malgun Gothic"/>
+                <w:b w:val="0"/>
+                <w:i w:val="0"/>
+                <w:sz w:val="16"/>
+              </w:rPr>
+              <w:t>5.00 ± 0.00</w:t>
+            </w:r>
+          </w:p>
+        </w:tc>
+      </w:tr>
+      <w:tr>
+        <w:trPr>
+          <w:cantSplit/>
+        </w:trPr>
+        <w:tc>
+          <w:tcPr>
+            <w:tcW w:type="dxa" w:w="1361"/>
+            <w:vAlign w:val="center"/>
+          </w:tcPr>
+          <w:p>
+            <w:pPr>
+              <w:spacing w:after="0" w:line="240" w:lineRule="auto"/>
+              <w:jc w:val="left"/>
+            </w:pPr>
+            <w:r/>
+            <w:r>
+              <w:rPr>
+                <w:rFonts w:ascii="Malgun Gothic" w:hAnsi="Malgun Gothic" w:eastAsia="Malgun Gothic" w:cs="Malgun Gothic"/>
+                <w:b w:val="0"/>
+                <w:i w:val="0"/>
+                <w:sz w:val="16"/>
+              </w:rPr>
+              <w:t>hybrid</w:t>
+            </w:r>
+          </w:p>
+        </w:tc>
+        <w:tc>
+          <w:tcPr>
+            <w:tcW w:type="dxa" w:w="1814"/>
+            <w:vAlign w:val="center"/>
+          </w:tcPr>
+          <w:p>
+            <w:pPr>
+              <w:spacing w:after="0" w:line="240" w:lineRule="auto"/>
+              <w:jc w:val="center"/>
+            </w:pPr>
+            <w:r/>
+            <w:r>
+              <w:rPr>
+                <w:rFonts w:ascii="Malgun Gothic" w:hAnsi="Malgun Gothic" w:eastAsia="Malgun Gothic" w:cs="Malgun Gothic"/>
+                <w:b w:val="0"/>
+                <w:i w:val="0"/>
+                <w:sz w:val="16"/>
+              </w:rPr>
+              <w:t>0.521 ± 0.000</w:t>
+            </w:r>
+          </w:p>
+        </w:tc>
+        <w:tc>
+          <w:tcPr>
+            <w:tcW w:type="dxa" w:w="794"/>
+            <w:vAlign w:val="center"/>
+          </w:tcPr>
+          <w:p>
+            <w:pPr>
+              <w:spacing w:after="0" w:line="240" w:lineRule="auto"/>
+              <w:jc w:val="center"/>
+            </w:pPr>
+            <w:r/>
+            <w:r>
+              <w:rPr>
+                <w:rFonts w:ascii="Malgun Gothic" w:hAnsi="Malgun Gothic" w:eastAsia="Malgun Gothic" w:cs="Malgun Gothic"/>
+                <w:b w:val="0"/>
+                <w:i w:val="0"/>
+                <w:sz w:val="16"/>
+              </w:rPr>
+              <w:t>0.150 ± 0.000</w:t>
+            </w:r>
+          </w:p>
+        </w:tc>
+        <w:tc>
+          <w:tcPr>
+            <w:tcW w:type="dxa" w:w="850"/>
+            <w:vAlign w:val="center"/>
+          </w:tcPr>
+          <w:p>
+            <w:pPr>
+              <w:spacing w:after="0" w:line="240" w:lineRule="auto"/>
+              <w:jc w:val="center"/>
+            </w:pPr>
+            <w:r/>
+            <w:r>
+              <w:rPr>
+                <w:rFonts w:ascii="Malgun Gothic" w:hAnsi="Malgun Gothic" w:eastAsia="Malgun Gothic" w:cs="Malgun Gothic"/>
+                <w:b w:val="0"/>
+                <w:i w:val="0"/>
+                <w:sz w:val="16"/>
+              </w:rPr>
+              <w:t>5.00 ± 0.00</w:t>
+            </w:r>
+          </w:p>
+        </w:tc>
+      </w:tr>
+      <w:tr>
+        <w:trPr>
+          <w:cantSplit/>
+        </w:trPr>
+        <w:tc>
+          <w:tcPr>
+            <w:tcW w:type="dxa" w:w="1361"/>
+            <w:vAlign w:val="center"/>
+          </w:tcPr>
+          <w:p>
+            <w:pPr>
+              <w:spacing w:after="0" w:line="240" w:lineRule="auto"/>
+              <w:jc w:val="left"/>
+            </w:pPr>
+            <w:r/>
+            <w:r>
+              <w:rPr>
+                <w:rFonts w:ascii="Malgun Gothic" w:hAnsi="Malgun Gothic" w:eastAsia="Malgun Gothic" w:cs="Malgun Gothic"/>
+                <w:b w:val="0"/>
+                <w:i w:val="0"/>
+                <w:sz w:val="16"/>
+              </w:rPr>
+              <w:t>hybrid_rerank</w:t>
+            </w:r>
+          </w:p>
+        </w:tc>
+        <w:tc>
+          <w:tcPr>
+            <w:tcW w:type="dxa" w:w="1814"/>
+            <w:vAlign w:val="center"/>
+          </w:tcPr>
+          <w:p>
+            <w:pPr>
+              <w:spacing w:after="0" w:line="240" w:lineRule="auto"/>
+              <w:jc w:val="center"/>
+            </w:pPr>
+            <w:r/>
+            <w:r>
+              <w:rPr>
+                <w:rFonts w:ascii="Malgun Gothic" w:hAnsi="Malgun Gothic" w:eastAsia="Malgun Gothic" w:cs="Malgun Gothic"/>
+                <w:b w:val="0"/>
+                <w:i w:val="0"/>
+                <w:sz w:val="16"/>
+              </w:rPr>
+              <w:t>0.586 ± 0.019</w:t>
+            </w:r>
+          </w:p>
+        </w:tc>
+        <w:tc>
+          <w:tcPr>
+            <w:tcW w:type="dxa" w:w="794"/>
+            <w:vAlign w:val="center"/>
+          </w:tcPr>
+          <w:p>
+            <w:pPr>
+              <w:spacing w:after="0" w:line="240" w:lineRule="auto"/>
+              <w:jc w:val="center"/>
+            </w:pPr>
+            <w:r/>
+            <w:r>
+              <w:rPr>
+                <w:rFonts w:ascii="Malgun Gothic" w:hAnsi="Malgun Gothic" w:eastAsia="Malgun Gothic" w:cs="Malgun Gothic"/>
+                <w:b w:val="0"/>
+                <w:i w:val="0"/>
+                <w:sz w:val="16"/>
+              </w:rPr>
+              <w:t>0.233 ± 0.014</w:t>
+            </w:r>
+          </w:p>
+        </w:tc>
+        <w:tc>
+          <w:tcPr>
+            <w:tcW w:type="dxa" w:w="850"/>
+            <w:vAlign w:val="center"/>
+          </w:tcPr>
+          <w:p>
+            <w:pPr>
+              <w:spacing w:after="0" w:line="240" w:lineRule="auto"/>
+              <w:jc w:val="center"/>
+            </w:pPr>
+            <w:r/>
+            <w:r>
+              <w:rPr>
+                <w:rFonts w:ascii="Malgun Gothic" w:hAnsi="Malgun Gothic" w:eastAsia="Malgun Gothic" w:cs="Malgun Gothic"/>
+                <w:b w:val="0"/>
+                <w:i w:val="0"/>
+                <w:sz w:val="16"/>
+              </w:rPr>
+              <w:t>2.08 ± 0.06</w:t>
+            </w:r>
+          </w:p>
+        </w:tc>
+      </w:tr>
+      <w:tr>
+        <w:trPr>
+          <w:cantSplit/>
+        </w:trPr>
+        <w:tc>
+          <w:tcPr>
+            <w:tcW w:type="dxa" w:w="1361"/>
+            <w:vAlign w:val="center"/>
+          </w:tcPr>
+          <w:p>
+            <w:pPr>
+              <w:spacing w:after="0" w:line="240" w:lineRule="auto"/>
+              <w:jc w:val="left"/>
+            </w:pPr>
+            <w:r/>
+            <w:r>
+              <w:rPr>
+                <w:rFonts w:ascii="Malgun Gothic" w:hAnsi="Malgun Gothic" w:eastAsia="Malgun Gothic" w:cs="Malgun Gothic"/>
+                <w:b w:val="0"/>
+                <w:i w:val="0"/>
+                <w:sz w:val="16"/>
+              </w:rPr>
+              <w:t>hybrid_rr_k3</w:t>
+            </w:r>
+          </w:p>
+        </w:tc>
+        <w:tc>
+          <w:tcPr>
+            <w:tcW w:type="dxa" w:w="1814"/>
+            <w:vAlign w:val="center"/>
+          </w:tcPr>
+          <w:p>
+            <w:pPr>
+              <w:spacing w:after="0" w:line="240" w:lineRule="auto"/>
+              <w:jc w:val="center"/>
+            </w:pPr>
+            <w:r/>
+            <w:r>
+              <w:rPr>
+                <w:rFonts w:ascii="Malgun Gothic" w:hAnsi="Malgun Gothic" w:eastAsia="Malgun Gothic" w:cs="Malgun Gothic"/>
+                <w:b w:val="0"/>
+                <w:i w:val="0"/>
+                <w:sz w:val="16"/>
+              </w:rPr>
+              <w:t>0.618 ± 0.017</w:t>
+            </w:r>
+          </w:p>
+        </w:tc>
+        <w:tc>
+          <w:tcPr>
+            <w:tcW w:type="dxa" w:w="794"/>
+            <w:vAlign w:val="center"/>
+          </w:tcPr>
+          <w:p>
+            <w:pPr>
+              <w:spacing w:after="0" w:line="240" w:lineRule="auto"/>
+              <w:jc w:val="center"/>
+            </w:pPr>
+            <w:r/>
+            <w:r>
+              <w:rPr>
+                <w:rFonts w:ascii="Malgun Gothic" w:hAnsi="Malgun Gothic" w:eastAsia="Malgun Gothic" w:cs="Malgun Gothic"/>
+                <w:b w:val="0"/>
+                <w:i w:val="0"/>
+                <w:sz w:val="16"/>
+              </w:rPr>
+              <w:t>0.225 ± 0.043</w:t>
+            </w:r>
+          </w:p>
+        </w:tc>
+        <w:tc>
+          <w:tcPr>
+            <w:tcW w:type="dxa" w:w="850"/>
+            <w:vAlign w:val="center"/>
+          </w:tcPr>
+          <w:p>
+            <w:pPr>
+              <w:spacing w:after="0" w:line="240" w:lineRule="auto"/>
+              <w:jc w:val="center"/>
+            </w:pPr>
+            <w:r/>
+            <w:r>
+              <w:rPr>
+                <w:rFonts w:ascii="Malgun Gothic" w:hAnsi="Malgun Gothic" w:eastAsia="Malgun Gothic" w:cs="Malgun Gothic"/>
+                <w:b w:val="0"/>
+                <w:i w:val="0"/>
+                <w:sz w:val="16"/>
+              </w:rPr>
+              <w:t>3.15 ± 0.05</w:t>
+            </w:r>
+          </w:p>
+        </w:tc>
+      </w:tr>
+      <w:tr>
+        <w:trPr>
+          <w:cantSplit/>
+        </w:trPr>
+        <w:tc>
+          <w:tcPr>
+            <w:tcW w:type="dxa" w:w="1361"/>
+            <w:vAlign w:val="center"/>
+          </w:tcPr>
+          <w:p>
+            <w:pPr>
+              <w:spacing w:after="0" w:line="240" w:lineRule="auto"/>
+              <w:jc w:val="left"/>
+            </w:pPr>
+            <w:r/>
+            <w:r>
+              <w:rPr>
+                <w:rFonts w:ascii="Malgun Gothic" w:hAnsi="Malgun Gothic" w:eastAsia="Malgun Gothic" w:cs="Malgun Gothic"/>
+                <w:b w:val="0"/>
+                <w:i w:val="0"/>
+                <w:sz w:val="16"/>
+              </w:rPr>
+              <w:t>link_all</w:t>
+            </w:r>
+          </w:p>
+        </w:tc>
+        <w:tc>
+          <w:tcPr>
+            <w:tcW w:type="dxa" w:w="1814"/>
+            <w:vAlign w:val="center"/>
+          </w:tcPr>
+          <w:p>
+            <w:pPr>
+              <w:spacing w:after="0" w:line="240" w:lineRule="auto"/>
+              <w:jc w:val="center"/>
+            </w:pPr>
+            <w:r/>
+            <w:r>
+              <w:rPr>
+                <w:rFonts w:ascii="Malgun Gothic" w:hAnsi="Malgun Gothic" w:eastAsia="Malgun Gothic" w:cs="Malgun Gothic"/>
+                <w:b w:val="0"/>
+                <w:i w:val="0"/>
+                <w:sz w:val="16"/>
+              </w:rPr>
+              <w:t>0.850 ± 0.014</w:t>
+            </w:r>
+          </w:p>
+        </w:tc>
+        <w:tc>
+          <w:tcPr>
+            <w:tcW w:type="dxa" w:w="794"/>
+            <w:vAlign w:val="center"/>
+          </w:tcPr>
+          <w:p>
+            <w:pPr>
+              <w:spacing w:after="0" w:line="240" w:lineRule="auto"/>
+              <w:jc w:val="center"/>
+            </w:pPr>
+            <w:r/>
+            <w:r>
+              <w:rPr>
+                <w:rFonts w:ascii="Malgun Gothic" w:hAnsi="Malgun Gothic" w:eastAsia="Malgun Gothic" w:cs="Malgun Gothic"/>
+                <w:b w:val="0"/>
+                <w:i w:val="0"/>
+                <w:sz w:val="16"/>
+              </w:rPr>
+              <w:t>0.750 ± 0.000</w:t>
+            </w:r>
+          </w:p>
+        </w:tc>
+        <w:tc>
+          <w:tcPr>
+            <w:tcW w:type="dxa" w:w="850"/>
+            <w:vAlign w:val="center"/>
+          </w:tcPr>
+          <w:p>
+            <w:pPr>
+              <w:spacing w:after="0" w:line="240" w:lineRule="auto"/>
+              <w:jc w:val="center"/>
+            </w:pPr>
+            <w:r/>
+            <w:r>
+              <w:rPr>
+                <w:rFonts w:ascii="Malgun Gothic" w:hAnsi="Malgun Gothic" w:eastAsia="Malgun Gothic" w:cs="Malgun Gothic"/>
+                <w:b w:val="0"/>
+                <w:i w:val="0"/>
+                <w:sz w:val="16"/>
+              </w:rPr>
+              <w:t>3.08 ± 0.03</w:t>
+            </w:r>
+          </w:p>
+        </w:tc>
+      </w:tr>
+      <w:tr>
+        <w:trPr>
+          <w:cantSplit/>
+        </w:trPr>
+        <w:tc>
+          <w:tcPr>
+            <w:tcW w:type="dxa" w:w="1361"/>
+            <w:vAlign w:val="center"/>
+          </w:tcPr>
+          <w:p>
+            <w:pPr>
+              <w:spacing w:after="0" w:line="240" w:lineRule="auto"/>
+              <w:jc w:val="left"/>
+            </w:pPr>
+            <w:r/>
+            <w:r>
+              <w:rPr>
+                <w:rFonts w:ascii="Malgun Gothic" w:hAnsi="Malgun Gothic" w:eastAsia="Malgun Gothic" w:cs="Malgun Gothic"/>
+                <w:b w:val="0"/>
+                <w:i w:val="0"/>
+                <w:sz w:val="16"/>
+              </w:rPr>
+              <w:t>proposed</w:t>
+            </w:r>
+          </w:p>
+        </w:tc>
+        <w:tc>
+          <w:tcPr>
+            <w:tcW w:type="dxa" w:w="1814"/>
+            <w:vAlign w:val="center"/>
+          </w:tcPr>
+          <w:p>
+            <w:pPr>
+              <w:spacing w:after="0" w:line="240" w:lineRule="auto"/>
+              <w:jc w:val="center"/>
+            </w:pPr>
+            <w:r/>
+            <w:r>
+              <w:rPr>
+                <w:rFonts w:ascii="Malgun Gothic" w:hAnsi="Malgun Gothic" w:eastAsia="Malgun Gothic" w:cs="Malgun Gothic"/>
+                <w:b w:val="0"/>
+                <w:i w:val="0"/>
+                <w:sz w:val="16"/>
+              </w:rPr>
+              <w:t>0.839 ± 0.046</w:t>
+            </w:r>
+          </w:p>
+        </w:tc>
+        <w:tc>
+          <w:tcPr>
+            <w:tcW w:type="dxa" w:w="794"/>
+            <w:vAlign w:val="center"/>
+          </w:tcPr>
+          <w:p>
+            <w:pPr>
+              <w:spacing w:after="0" w:line="240" w:lineRule="auto"/>
+              <w:jc w:val="center"/>
+            </w:pPr>
+            <w:r/>
+            <w:r>
+              <w:rPr>
+                <w:rFonts w:ascii="Malgun Gothic" w:hAnsi="Malgun Gothic" w:eastAsia="Malgun Gothic" w:cs="Malgun Gothic"/>
+                <w:b w:val="0"/>
+                <w:i w:val="0"/>
+                <w:sz w:val="16"/>
+              </w:rPr>
+              <w:t>0.708 ± 0.063</w:t>
+            </w:r>
+          </w:p>
+        </w:tc>
+        <w:tc>
+          <w:tcPr>
+            <w:tcW w:type="dxa" w:w="850"/>
+            <w:vAlign w:val="center"/>
+          </w:tcPr>
+          <w:p>
+            <w:pPr>
+              <w:spacing w:after="0" w:line="240" w:lineRule="auto"/>
+              <w:jc w:val="center"/>
+            </w:pPr>
+            <w:r/>
+            <w:r>
+              <w:rPr>
+                <w:rFonts w:ascii="Malgun Gothic" w:hAnsi="Malgun Gothic" w:eastAsia="Malgun Gothic" w:cs="Malgun Gothic"/>
+                <w:b w:val="0"/>
+                <w:i w:val="0"/>
+                <w:sz w:val="16"/>
+              </w:rPr>
+              <w:t>3.00 ± 0.17</w:t>
+            </w:r>
+          </w:p>
+        </w:tc>
+      </w:tr>
+    </w:tbl>
+    <w:p>
+      <w:pPr>
+        <w:keepNext/>
+        <w:spacing w:before="0" w:after="40" w:line="240" w:lineRule="auto"/>
+        <w:jc w:val="left"/>
+      </w:pPr>
+      <w:r>
+        <w:rPr>
+          <w:rFonts w:ascii="Malgun Gothic" w:hAnsi="Malgun Gothic" w:eastAsia="Malgun Gothic" w:cs="Malgun Gothic"/>
+          <w:b/>
+          <w:i w:val="0"/>
+          <w:sz w:val="18"/>
+        </w:rPr>
+        <w:t>표 2. 출처별 paired 차이와 연결 정답 끝점 군집 bootstrap (10,000회). k3=hybrid_rerank_k3; 차이는 첫 변형 − 둘째 변형이며 CI는 기술적 민감도 구간이다.</w:t>
       </w:r>
     </w:p>
     <w:tbl>
@@ -355,7 +1133,7 @@
                 <w:i w:val="0"/>
                 <w:sz w:val="16"/>
               </w:rPr>
-              <w:t>변형</w:t>
+              <w:t>출처 (사례/군집)</w:t>
             </w:r>
           </w:p>
         </w:tc>
@@ -377,7 +1155,7 @@
                 <w:i w:val="0"/>
                 <w:sz w:val="16"/>
               </w:rPr>
-              <w:t>Recall</w:t>
+              <w:t>비교</w:t>
             </w:r>
           </w:p>
         </w:tc>
@@ -399,7 +1177,7 @@
                 <w:i w:val="0"/>
                 <w:sz w:val="16"/>
               </w:rPr>
-              <w:t>Precision</w:t>
+              <w:t>ΔRecall [95% CI]</w:t>
             </w:r>
           </w:p>
         </w:tc>
@@ -421,7 +1199,7 @@
                 <w:i w:val="0"/>
                 <w:sz w:val="16"/>
               </w:rPr>
-              <w:t>링크 정답 Recall</w:t>
+              <w:t>Δ링크 정답 Recall [95% CI]</w:t>
             </w:r>
           </w:p>
         </w:tc>
@@ -448,7 +1226,7 @@
                 <w:i w:val="0"/>
                 <w:sz w:val="16"/>
               </w:rPr>
-              <w:t>bm25</w:t>
+              <w:t>existing_v2 (5/5)</w:t>
             </w:r>
           </w:p>
         </w:tc>
@@ -470,7 +1248,7 @@
                 <w:i w:val="0"/>
                 <w:sz w:val="16"/>
               </w:rPr>
-              <w:t>0.592±0.000</w:t>
+              <w:t>link_all − k3</w:t>
             </w:r>
           </w:p>
         </w:tc>
@@ -492,7 +1270,7 @@
                 <w:i w:val="0"/>
                 <w:sz w:val="16"/>
               </w:rPr>
-              <w:t>0.260±0.000</w:t>
+              <w:t>+0.128 [+0.017, +0.244]</w:t>
             </w:r>
           </w:p>
         </w:tc>
@@ -514,7 +1292,7 @@
                 <w:i w:val="0"/>
                 <w:sz w:val="16"/>
               </w:rPr>
-              <w:t>0.275±0.000</w:t>
+              <w:t>+0.367 [+0.067, +0.700]</w:t>
             </w:r>
           </w:p>
         </w:tc>
@@ -541,7 +1319,7 @@
                 <w:i w:val="0"/>
                 <w:sz w:val="16"/>
               </w:rPr>
-              <w:t>dense</w:t>
+              <w:t>existing_v2 (5/5)</w:t>
             </w:r>
           </w:p>
         </w:tc>
@@ -563,7 +1341,7 @@
                 <w:i w:val="0"/>
                 <w:sz w:val="16"/>
               </w:rPr>
-              <w:t>0.383±0.000</w:t>
+              <w:t>proposed − k3</w:t>
             </w:r>
           </w:p>
         </w:tc>
@@ -585,7 +1363,7 @@
                 <w:i w:val="0"/>
                 <w:sz w:val="16"/>
               </w:rPr>
-              <w:t>0.170±0.000</w:t>
+              <w:t>+0.150 [+0.017, +0.283]</w:t>
             </w:r>
           </w:p>
         </w:tc>
@@ -607,7 +1385,7 @@
                 <w:i w:val="0"/>
                 <w:sz w:val="16"/>
               </w:rPr>
-              <w:t>0.000±0.000</w:t>
+              <w:t>+0.400 [+0.100, +0.700]</w:t>
             </w:r>
           </w:p>
         </w:tc>
@@ -634,7 +1412,7 @@
                 <w:i w:val="0"/>
                 <w:sz w:val="16"/>
               </w:rPr>
-              <w:t>hybrid</w:t>
+              <w:t>existing_v2 (5/5)</w:t>
             </w:r>
           </w:p>
         </w:tc>
@@ -656,7 +1434,7 @@
                 <w:i w:val="0"/>
                 <w:sz w:val="16"/>
               </w:rPr>
-              <w:t>0.521±0.000</w:t>
+              <w:t>proposed − link_all</w:t>
             </w:r>
           </w:p>
         </w:tc>
@@ -678,7 +1456,7 @@
                 <w:i w:val="0"/>
                 <w:sz w:val="16"/>
               </w:rPr>
-              <w:t>0.230±0.000</w:t>
+              <w:t>+0.022 [+0.000, +0.067]</w:t>
             </w:r>
           </w:p>
         </w:tc>
@@ -700,7 +1478,7 @@
                 <w:i w:val="0"/>
                 <w:sz w:val="16"/>
               </w:rPr>
-              <w:t>0.150±0.000</w:t>
+              <w:t>+0.033 [+0.000, +0.100]</w:t>
             </w:r>
           </w:p>
         </w:tc>
@@ -727,7 +1505,7 @@
                 <w:i w:val="0"/>
                 <w:sz w:val="16"/>
               </w:rPr>
-              <w:t>hybrid_rr</w:t>
+              <w:t>llm_drafted (15/6)</w:t>
             </w:r>
           </w:p>
         </w:tc>
@@ -749,7 +1527,7 @@
                 <w:i w:val="0"/>
                 <w:sz w:val="16"/>
               </w:rPr>
-              <w:t>0.586±0.019</w:t>
+              <w:t>link_all − k3</w:t>
             </w:r>
           </w:p>
         </w:tc>
@@ -771,7 +1549,7 @@
                 <w:i w:val="0"/>
                 <w:sz w:val="16"/>
               </w:rPr>
-              <w:t>0.781±0.038</w:t>
+              <w:t>+0.267 [+0.083, +0.440]</w:t>
             </w:r>
           </w:p>
         </w:tc>
@@ -793,7 +1571,7 @@
                 <w:i w:val="0"/>
                 <w:sz w:val="16"/>
               </w:rPr>
-              <w:t>0.233±0.014</w:t>
+              <w:t>+0.578 [+0.271, +0.889]</w:t>
             </w:r>
           </w:p>
         </w:tc>
@@ -820,7 +1598,7 @@
                 <w:i w:val="0"/>
                 <w:sz w:val="16"/>
               </w:rPr>
-              <w:t>link_all</w:t>
+              <w:t>llm_drafted (15/6)</w:t>
             </w:r>
           </w:p>
         </w:tc>
@@ -842,7 +1620,7 @@
                 <w:i w:val="0"/>
                 <w:sz w:val="16"/>
               </w:rPr>
-              <w:t>0.850±0.014</w:t>
+              <w:t>proposed − k3</w:t>
             </w:r>
           </w:p>
         </w:tc>
@@ -864,7 +1642,7 @@
                 <w:i w:val="0"/>
                 <w:sz w:val="16"/>
               </w:rPr>
-              <w:t>0.721±0.002</w:t>
+              <w:t>+0.244 [+0.098, +0.400]</w:t>
             </w:r>
           </w:p>
         </w:tc>
@@ -886,7 +1664,7 @@
                 <w:i w:val="0"/>
                 <w:sz w:val="16"/>
               </w:rPr>
-              <w:t>0.750±0.000</w:t>
+              <w:t>+0.511 [+0.246, +0.806]</w:t>
             </w:r>
           </w:p>
         </w:tc>
@@ -913,7 +1691,7 @@
                 <w:i w:val="0"/>
                 <w:sz w:val="16"/>
               </w:rPr>
-              <w:t>proposed</w:t>
+              <w:t>llm_drafted (15/6)</w:t>
             </w:r>
           </w:p>
         </w:tc>
@@ -935,7 +1713,7 @@
                 <w:i w:val="0"/>
                 <w:sz w:val="16"/>
               </w:rPr>
-              <w:t>0.839±0.046</w:t>
+              <w:t>proposed − link_all</w:t>
             </w:r>
           </w:p>
         </w:tc>
@@ -957,7 +1735,7 @@
                 <w:i w:val="0"/>
                 <w:sz w:val="16"/>
               </w:rPr>
-              <w:t>0.742±0.022</w:t>
+              <w:t>−0.022 [−0.083, +0.026]</w:t>
             </w:r>
           </w:p>
         </w:tc>
@@ -979,7 +1757,7 @@
                 <w:i w:val="0"/>
                 <w:sz w:val="16"/>
               </w:rPr>
-              <w:t>0.708±0.063</w:t>
+              <w:t>−0.067 [−0.167, 0.000]</w:t>
             </w:r>
           </w:p>
         </w:tc>
@@ -987,6 +1765,21 @@
     </w:tbl>
     <w:p>
       <w:pPr>
+        <w:spacing w:before="0" w:after="40" w:line="240" w:lineRule="auto"/>
+        <w:jc w:val="left"/>
+      </w:pPr>
+      <w:r>
+        <w:rPr>
+          <w:rFonts w:ascii="Malgun Gothic" w:hAnsi="Malgun Gothic" w:eastAsia="Malgun Gothic" w:cs="Malgun Gothic"/>
+          <w:b w:val="0"/>
+          <w:i w:val="0"/>
+          <w:sz w:val="18"/>
+        </w:rPr>
+        <w:t>군집은 같은 via_link 정답 끝점(문서 버전, 조항)을 공유하는 사례의 연결요소로 구성했다. 평가셋에 실제 link ID가 없어 끝점 공유를 군집의 대리 지표로 쓴다. 5개 개발 군집과 6개 신규 군집은 작아 CI를 확증적 추론으로 해석하지 않는다. 신규 그래프 사례 15건은 서로 다른 승인 링크와 양쪽 원문에서 초안되어 링크 조건부 평가일 수 있고, llm_drafted의 20개 정답은 아직 사람 검수 전이다.</w:t>
+      </w:r>
+    </w:p>
+    <w:p>
+      <w:pPr>
         <w:keepNext/>
         <w:spacing w:before="0" w:after="40" w:line="240" w:lineRule="auto"/>
         <w:jc w:val="left"/>
@@ -998,7 +1791,7 @@
           <w:i w:val="0"/>
           <w:sz w:val="18"/>
         </w:rPr>
-        <w:t>표 2. 그래프 질의 문맥·답변 결과 (n=20)</w:t>
+        <w:t>표 3. 선택 재정렬(proposed − link_all)의 출처별 문맥·답변 차이. CI는 링크 끝점 군집 bootstrap이며 탐색적이다.</w:t>
       </w:r>
     </w:p>
     <w:tbl>
@@ -1045,7 +1838,7 @@
                 <w:i w:val="0"/>
                 <w:sz w:val="16"/>
               </w:rPr>
-              <w:t>변형</w:t>
+              <w:t>출처 (사례/군집)</w:t>
             </w:r>
           </w:p>
         </w:tc>
@@ -1067,7 +1860,7 @@
                 <w:i w:val="0"/>
                 <w:sz w:val="16"/>
               </w:rPr>
-              <w:t>CP</w:t>
+              <w:t>ΔContext Precision [95% CI]</w:t>
             </w:r>
           </w:p>
         </w:tc>
@@ -1089,7 +1882,7 @@
                 <w:i w:val="0"/>
                 <w:sz w:val="16"/>
               </w:rPr>
-              <w:t>CR</w:t>
+              <w:t>ΔAnswer Correctness [95% CI]</w:t>
             </w:r>
           </w:p>
         </w:tc>
@@ -1111,7 +1904,7 @@
                 <w:i w:val="0"/>
                 <w:sz w:val="16"/>
               </w:rPr>
-              <w:t>AC</w:t>
+              <w:t>Δ지연 (초/질의) [95% CI]</w:t>
             </w:r>
           </w:p>
         </w:tc>
@@ -1138,7 +1931,7 @@
                 <w:i w:val="0"/>
                 <w:sz w:val="16"/>
               </w:rPr>
-              <w:t>bm25</w:t>
+              <w:t>existing_v2 (5/5)</w:t>
             </w:r>
           </w:p>
         </w:tc>
@@ -1160,7 +1953,7 @@
                 <w:i w:val="0"/>
                 <w:sz w:val="16"/>
               </w:rPr>
-              <w:t>0.794±0.028</w:t>
+              <w:t>+0.109 [+0.002, +0.220]</w:t>
             </w:r>
           </w:p>
         </w:tc>
@@ -1182,7 +1975,7 @@
                 <w:i w:val="0"/>
                 <w:sz w:val="16"/>
               </w:rPr>
-              <w:t>0.778±0.012</w:t>
+              <w:t>−0.003 [−0.040, +0.042]</w:t>
             </w:r>
           </w:p>
         </w:tc>
@@ -1204,7 +1997,7 @@
                 <w:i w:val="0"/>
                 <w:sz w:val="16"/>
               </w:rPr>
-              <w:t>0.734±0.006</w:t>
+              <w:t>+1.057 [+0.904, +1.211]</w:t>
             </w:r>
           </w:p>
         </w:tc>
@@ -1231,7 +2024,7 @@
                 <w:i w:val="0"/>
                 <w:sz w:val="16"/>
               </w:rPr>
-              <w:t>dense</w:t>
+              <w:t>llm_drafted (15/6)</w:t>
             </w:r>
           </w:p>
         </w:tc>
@@ -1253,7 +2046,7 @@
                 <w:i w:val="0"/>
                 <w:sz w:val="16"/>
               </w:rPr>
-              <w:t>0.511±0.050</w:t>
+              <w:t>+0.025 [+0.008, +0.042]</w:t>
             </w:r>
           </w:p>
         </w:tc>
@@ -1275,7 +2068,7 @@
                 <w:i w:val="0"/>
                 <w:sz w:val="16"/>
               </w:rPr>
-              <w:t>0.625±0.003</w:t>
+              <w:t>−0.001 [−0.019, +0.018]</w:t>
             </w:r>
           </w:p>
         </w:tc>
@@ -1297,387 +2090,25 @@
                 <w:i w:val="0"/>
                 <w:sz w:val="16"/>
               </w:rPr>
-              <w:t>0.662±0.021</w:t>
-            </w:r>
-          </w:p>
-        </w:tc>
-      </w:tr>
-      <w:tr>
-        <w:trPr>
-          <w:cantSplit/>
-        </w:trPr>
-        <w:tc>
-          <w:tcPr>
-            <w:tcW w:type="dxa" w:w="1134"/>
-            <w:vAlign w:val="center"/>
-          </w:tcPr>
-          <w:p>
-            <w:pPr>
-              <w:spacing w:after="0" w:line="240" w:lineRule="auto"/>
-              <w:jc w:val="left"/>
-            </w:pPr>
-            <w:r/>
-            <w:r>
-              <w:rPr>
-                <w:rFonts w:ascii="Malgun Gothic" w:hAnsi="Malgun Gothic" w:eastAsia="Malgun Gothic" w:cs="Malgun Gothic"/>
-                <w:b w:val="0"/>
-                <w:i w:val="0"/>
-                <w:sz w:val="16"/>
-              </w:rPr>
-              <w:t>hybrid</w:t>
-            </w:r>
-          </w:p>
-        </w:tc>
-        <w:tc>
-          <w:tcPr>
-            <w:tcW w:type="dxa" w:w="1247"/>
-            <w:vAlign w:val="center"/>
-          </w:tcPr>
-          <w:p>
-            <w:pPr>
-              <w:spacing w:after="0" w:line="240" w:lineRule="auto"/>
-              <w:jc w:val="center"/>
-            </w:pPr>
-            <w:r/>
-            <w:r>
-              <w:rPr>
-                <w:rFonts w:ascii="Malgun Gothic" w:hAnsi="Malgun Gothic" w:eastAsia="Malgun Gothic" w:cs="Malgun Gothic"/>
-                <w:b w:val="0"/>
-                <w:i w:val="0"/>
-                <w:sz w:val="16"/>
-              </w:rPr>
-              <w:t>0.759±0.052</w:t>
-            </w:r>
-          </w:p>
-        </w:tc>
-        <w:tc>
-          <w:tcPr>
-            <w:tcW w:type="dxa" w:w="1247"/>
-            <w:vAlign w:val="center"/>
-          </w:tcPr>
-          <w:p>
-            <w:pPr>
-              <w:spacing w:after="0" w:line="240" w:lineRule="auto"/>
-              <w:jc w:val="center"/>
-            </w:pPr>
-            <w:r/>
-            <w:r>
-              <w:rPr>
-                <w:rFonts w:ascii="Malgun Gothic" w:hAnsi="Malgun Gothic" w:eastAsia="Malgun Gothic" w:cs="Malgun Gothic"/>
-                <w:b w:val="0"/>
-                <w:i w:val="0"/>
-                <w:sz w:val="16"/>
-              </w:rPr>
-              <w:t>0.714±0.000</w:t>
-            </w:r>
-          </w:p>
-        </w:tc>
-        <w:tc>
-          <w:tcPr>
-            <w:tcW w:type="dxa" w:w="1247"/>
-            <w:vAlign w:val="center"/>
-          </w:tcPr>
-          <w:p>
-            <w:pPr>
-              <w:spacing w:after="0" w:line="240" w:lineRule="auto"/>
-              <w:jc w:val="center"/>
-            </w:pPr>
-            <w:r/>
-            <w:r>
-              <w:rPr>
-                <w:rFonts w:ascii="Malgun Gothic" w:hAnsi="Malgun Gothic" w:eastAsia="Malgun Gothic" w:cs="Malgun Gothic"/>
-                <w:b w:val="0"/>
-                <w:i w:val="0"/>
-                <w:sz w:val="16"/>
-              </w:rPr>
-              <w:t>0.683±0.028</w:t>
-            </w:r>
-          </w:p>
-        </w:tc>
-      </w:tr>
-      <w:tr>
-        <w:trPr>
-          <w:cantSplit/>
-        </w:trPr>
-        <w:tc>
-          <w:tcPr>
-            <w:tcW w:type="dxa" w:w="1134"/>
-            <w:vAlign w:val="center"/>
-          </w:tcPr>
-          <w:p>
-            <w:pPr>
-              <w:spacing w:after="0" w:line="240" w:lineRule="auto"/>
-              <w:jc w:val="left"/>
-            </w:pPr>
-            <w:r/>
-            <w:r>
-              <w:rPr>
-                <w:rFonts w:ascii="Malgun Gothic" w:hAnsi="Malgun Gothic" w:eastAsia="Malgun Gothic" w:cs="Malgun Gothic"/>
-                <w:b w:val="0"/>
-                <w:i w:val="0"/>
-                <w:sz w:val="16"/>
-              </w:rPr>
-              <w:t>hybrid_rr</w:t>
-            </w:r>
-          </w:p>
-        </w:tc>
-        <w:tc>
-          <w:tcPr>
-            <w:tcW w:type="dxa" w:w="1247"/>
-            <w:vAlign w:val="center"/>
-          </w:tcPr>
-          <w:p>
-            <w:pPr>
-              <w:spacing w:after="0" w:line="240" w:lineRule="auto"/>
-              <w:jc w:val="center"/>
-            </w:pPr>
-            <w:r/>
-            <w:r>
-              <w:rPr>
-                <w:rFonts w:ascii="Malgun Gothic" w:hAnsi="Malgun Gothic" w:eastAsia="Malgun Gothic" w:cs="Malgun Gothic"/>
-                <w:b w:val="0"/>
-                <w:i w:val="0"/>
-                <w:sz w:val="16"/>
-              </w:rPr>
-              <w:t>0.946±0.053</w:t>
-            </w:r>
-          </w:p>
-        </w:tc>
-        <w:tc>
-          <w:tcPr>
-            <w:tcW w:type="dxa" w:w="1247"/>
-            <w:vAlign w:val="center"/>
-          </w:tcPr>
-          <w:p>
-            <w:pPr>
-              <w:spacing w:after="0" w:line="240" w:lineRule="auto"/>
-              <w:jc w:val="center"/>
-            </w:pPr>
-            <w:r/>
-            <w:r>
-              <w:rPr>
-                <w:rFonts w:ascii="Malgun Gothic" w:hAnsi="Malgun Gothic" w:eastAsia="Malgun Gothic" w:cs="Malgun Gothic"/>
-                <w:b w:val="0"/>
-                <w:i w:val="0"/>
-                <w:sz w:val="16"/>
-              </w:rPr>
-              <w:t>0.785±0.016</w:t>
-            </w:r>
-          </w:p>
-        </w:tc>
-        <w:tc>
-          <w:tcPr>
-            <w:tcW w:type="dxa" w:w="1247"/>
-            <w:vAlign w:val="center"/>
-          </w:tcPr>
-          <w:p>
-            <w:pPr>
-              <w:spacing w:after="0" w:line="240" w:lineRule="auto"/>
-              <w:jc w:val="center"/>
-            </w:pPr>
-            <w:r/>
-            <w:r>
-              <w:rPr>
-                <w:rFonts w:ascii="Malgun Gothic" w:hAnsi="Malgun Gothic" w:eastAsia="Malgun Gothic" w:cs="Malgun Gothic"/>
-                <w:b w:val="0"/>
-                <w:i w:val="0"/>
-                <w:sz w:val="16"/>
-              </w:rPr>
-              <w:t>0.745±0.016</w:t>
-            </w:r>
-          </w:p>
-        </w:tc>
-      </w:tr>
-      <w:tr>
-        <w:trPr>
-          <w:cantSplit/>
-        </w:trPr>
-        <w:tc>
-          <w:tcPr>
-            <w:tcW w:type="dxa" w:w="1134"/>
-            <w:vAlign w:val="center"/>
-          </w:tcPr>
-          <w:p>
-            <w:pPr>
-              <w:spacing w:after="0" w:line="240" w:lineRule="auto"/>
-              <w:jc w:val="left"/>
-            </w:pPr>
-            <w:r/>
-            <w:r>
-              <w:rPr>
-                <w:rFonts w:ascii="Malgun Gothic" w:hAnsi="Malgun Gothic" w:eastAsia="Malgun Gothic" w:cs="Malgun Gothic"/>
-                <w:b w:val="0"/>
-                <w:i w:val="0"/>
-                <w:sz w:val="16"/>
-              </w:rPr>
-              <w:t>link_all</w:t>
-            </w:r>
-          </w:p>
-        </w:tc>
-        <w:tc>
-          <w:tcPr>
-            <w:tcW w:type="dxa" w:w="1247"/>
-            <w:vAlign w:val="center"/>
-          </w:tcPr>
-          <w:p>
-            <w:pPr>
-              <w:spacing w:after="0" w:line="240" w:lineRule="auto"/>
-              <w:jc w:val="center"/>
-            </w:pPr>
-            <w:r/>
-            <w:r>
-              <w:rPr>
-                <w:rFonts w:ascii="Malgun Gothic" w:hAnsi="Malgun Gothic" w:eastAsia="Malgun Gothic" w:cs="Malgun Gothic"/>
-                <w:b w:val="0"/>
-                <w:i w:val="0"/>
-                <w:sz w:val="16"/>
-              </w:rPr>
-              <w:t>0.877±0.008</w:t>
-            </w:r>
-          </w:p>
-        </w:tc>
-        <w:tc>
-          <w:tcPr>
-            <w:tcW w:type="dxa" w:w="1247"/>
-            <w:vAlign w:val="center"/>
-          </w:tcPr>
-          <w:p>
-            <w:pPr>
-              <w:spacing w:after="0" w:line="240" w:lineRule="auto"/>
-              <w:jc w:val="center"/>
-            </w:pPr>
-            <w:r/>
-            <w:r>
-              <w:rPr>
-                <w:rFonts w:ascii="Malgun Gothic" w:hAnsi="Malgun Gothic" w:eastAsia="Malgun Gothic" w:cs="Malgun Gothic"/>
-                <w:b w:val="0"/>
-                <w:i w:val="0"/>
-                <w:sz w:val="16"/>
-              </w:rPr>
-              <w:t>0.938±0.007</w:t>
-            </w:r>
-          </w:p>
-        </w:tc>
-        <w:tc>
-          <w:tcPr>
-            <w:tcW w:type="dxa" w:w="1247"/>
-            <w:vAlign w:val="center"/>
-          </w:tcPr>
-          <w:p>
-            <w:pPr>
-              <w:spacing w:after="0" w:line="240" w:lineRule="auto"/>
-              <w:jc w:val="center"/>
-            </w:pPr>
-            <w:r/>
-            <w:r>
-              <w:rPr>
-                <w:rFonts w:ascii="Malgun Gothic" w:hAnsi="Malgun Gothic" w:eastAsia="Malgun Gothic" w:cs="Malgun Gothic"/>
-                <w:b w:val="0"/>
-                <w:i w:val="0"/>
-                <w:sz w:val="16"/>
-              </w:rPr>
-              <w:t>0.758±0.029</w:t>
-            </w:r>
-          </w:p>
-        </w:tc>
-      </w:tr>
-      <w:tr>
-        <w:trPr>
-          <w:cantSplit/>
-        </w:trPr>
-        <w:tc>
-          <w:tcPr>
-            <w:tcW w:type="dxa" w:w="1134"/>
-            <w:vAlign w:val="center"/>
-          </w:tcPr>
-          <w:p>
-            <w:pPr>
-              <w:spacing w:after="0" w:line="240" w:lineRule="auto"/>
-              <w:jc w:val="left"/>
-            </w:pPr>
-            <w:r/>
-            <w:r>
-              <w:rPr>
-                <w:rFonts w:ascii="Malgun Gothic" w:hAnsi="Malgun Gothic" w:eastAsia="Malgun Gothic" w:cs="Malgun Gothic"/>
-                <w:b w:val="0"/>
-                <w:i w:val="0"/>
-                <w:sz w:val="16"/>
-              </w:rPr>
-              <w:t>proposed</w:t>
-            </w:r>
-          </w:p>
-        </w:tc>
-        <w:tc>
-          <w:tcPr>
-            <w:tcW w:type="dxa" w:w="1247"/>
-            <w:vAlign w:val="center"/>
-          </w:tcPr>
-          <w:p>
-            <w:pPr>
-              <w:spacing w:after="0" w:line="240" w:lineRule="auto"/>
-              <w:jc w:val="center"/>
-            </w:pPr>
-            <w:r/>
-            <w:r>
-              <w:rPr>
-                <w:rFonts w:ascii="Malgun Gothic" w:hAnsi="Malgun Gothic" w:eastAsia="Malgun Gothic" w:cs="Malgun Gothic"/>
-                <w:b w:val="0"/>
-                <w:i w:val="0"/>
-                <w:sz w:val="16"/>
-              </w:rPr>
-              <w:t>0.923±0.033</w:t>
-            </w:r>
-          </w:p>
-        </w:tc>
-        <w:tc>
-          <w:tcPr>
-            <w:tcW w:type="dxa" w:w="1247"/>
-            <w:vAlign w:val="center"/>
-          </w:tcPr>
-          <w:p>
-            <w:pPr>
-              <w:spacing w:after="0" w:line="240" w:lineRule="auto"/>
-              <w:jc w:val="center"/>
-            </w:pPr>
-            <w:r/>
-            <w:r>
-              <w:rPr>
-                <w:rFonts w:ascii="Malgun Gothic" w:hAnsi="Malgun Gothic" w:eastAsia="Malgun Gothic" w:cs="Malgun Gothic"/>
-                <w:b w:val="0"/>
-                <w:i w:val="0"/>
-                <w:sz w:val="16"/>
-              </w:rPr>
-              <w:t>0.916±0.011</w:t>
-            </w:r>
-          </w:p>
-        </w:tc>
-        <w:tc>
-          <w:tcPr>
-            <w:tcW w:type="dxa" w:w="1247"/>
-            <w:vAlign w:val="center"/>
-          </w:tcPr>
-          <w:p>
-            <w:pPr>
-              <w:spacing w:after="0" w:line="240" w:lineRule="auto"/>
-              <w:jc w:val="center"/>
-            </w:pPr>
-            <w:r/>
-            <w:r>
-              <w:rPr>
-                <w:rFonts w:ascii="Malgun Gothic" w:hAnsi="Malgun Gothic" w:eastAsia="Malgun Gothic" w:cs="Malgun Gothic"/>
-                <w:b w:val="0"/>
-                <w:i w:val="0"/>
-                <w:sz w:val="16"/>
-              </w:rPr>
-              <w:t>0.756±0.012</w:t>
+              <w:t>+0.343 [−0.761, +1.066]</w:t>
             </w:r>
           </w:p>
         </w:tc>
       </w:tr>
     </w:tbl>
     <w:p>
-      <w:r>
-        <w:br w:type="column"/>
+      <w:pPr>
+        <w:spacing w:before="0" w:after="40" w:line="240" w:lineRule="auto"/>
+        <w:jc w:val="left"/>
+      </w:pPr>
+      <w:r>
+        <w:rPr>
+          <w:rFonts w:ascii="Malgun Gothic" w:hAnsi="Malgun Gothic" w:eastAsia="Malgun Gothic" w:cs="Malgun Gothic"/>
+          <w:b w:val="0"/>
+          <w:i w:val="0"/>
+          <w:sz w:val="18"/>
+        </w:rPr>
+        <w:t>proposed−k3의 matched r1 RAGAS 차이는 기존 사례에서 Context Precision −0.266 [−0.478, −0.099], Answer Correctness −0.022 [−0.120, +0.077], 신규 사례에서 각각 +0.020 [−0.047, +0.078], +0.031 [−0.043, +0.136]이었다. k3 답변 지표와 두 matched 차이는 한 반복만 있어 기술적으로 해석한다. 그래프 질의 평균 검색 지연은 k3 1.446초, link_all 2.157초, proposed 2.678초다. 같은 모델이 답변을 만들고 RAGAS를 채점했으며 블라인드 사람 평가는 수행하지 않았다. 토큰 및 금전 비용은 결과에 일관되게 기록되지 않아 비교하지 않았다.</w:t>
       </w:r>
     </w:p>
     <w:p>
@@ -1691,1243 +2122,11 @@
           <w:rFonts w:ascii="Malgun Gothic" w:hAnsi="Malgun Gothic" w:eastAsia="Malgun Gothic" w:cs="Malgun Gothic"/>
           <w:b/>
           <w:i w:val="0"/>
-          <w:sz w:val="18"/>
-        </w:rPr>
-        <w:t>표 3. 그래프 사례별 paired 차이 (LA=`link_all`, HR=`hybrid_rerank`, P=`proposed`; R=Recall, LGR=링크 정답 Recall)</w:t>
+          <w:sz w:val="20"/>
+        </w:rPr>
+        <w:t>4. 논의 및 결론</w:t>
       </w:r>
     </w:p>
-    <w:tbl>
-      <w:tblPr>
-        <w:tblW w:type="dxa" w:w="4819"/>
-        <w:tblLayout w:type="fixed"/>
-        <w:tblLook w:firstColumn="1" w:firstRow="1" w:lastColumn="0" w:lastRow="0" w:noHBand="0" w:noVBand="1" w:val="04A0"/>
-        <w:jc w:val="left"/>
-        <w:tblBorders>
-          <w:top w:val="single" w:sz="4" w:space="0" w:color="000000"/>
-          <w:left w:val="single" w:sz="4" w:space="0" w:color="000000"/>
-          <w:bottom w:val="single" w:sz="4" w:space="0" w:color="000000"/>
-          <w:right w:val="single" w:sz="4" w:space="0" w:color="000000"/>
-          <w:insideH w:val="single" w:sz="4" w:space="0" w:color="000000"/>
-          <w:insideV w:val="single" w:sz="4" w:space="0" w:color="000000"/>
-        </w:tblBorders>
-      </w:tblPr>
-      <w:tblGrid>
-        <w:gridCol w:w="1361"/>
-        <w:gridCol w:w="1814"/>
-        <w:gridCol w:w="794"/>
-        <w:gridCol w:w="850"/>
-      </w:tblGrid>
-      <w:tr>
-        <w:trPr>
-          <w:cantSplit/>
-          <w:tblHeader w:val="true"/>
-        </w:trPr>
-        <w:tc>
-          <w:tcPr>
-            <w:tcW w:type="dxa" w:w="1361"/>
-            <w:vAlign w:val="center"/>
-          </w:tcPr>
-          <w:p>
-            <w:pPr>
-              <w:spacing w:after="0" w:line="240" w:lineRule="auto"/>
-              <w:jc w:val="left"/>
-            </w:pPr>
-            <w:r/>
-            <w:r>
-              <w:rPr>
-                <w:rFonts w:ascii="Malgun Gothic" w:hAnsi="Malgun Gothic" w:eastAsia="Malgun Gothic" w:cs="Malgun Gothic"/>
-                <w:b/>
-                <w:i w:val="0"/>
-                <w:sz w:val="15"/>
-              </w:rPr>
-              <w:t>비교 / 지표</w:t>
-            </w:r>
-          </w:p>
-        </w:tc>
-        <w:tc>
-          <w:tcPr>
-            <w:tcW w:type="dxa" w:w="1814"/>
-            <w:vAlign w:val="center"/>
-          </w:tcPr>
-          <w:p>
-            <w:pPr>
-              <w:spacing w:after="0" w:line="240" w:lineRule="auto"/>
-              <w:jc w:val="center"/>
-            </w:pPr>
-            <w:r/>
-            <w:r>
-              <w:rPr>
-                <w:rFonts w:ascii="Malgun Gothic" w:hAnsi="Malgun Gothic" w:eastAsia="Malgun Gothic" w:cs="Malgun Gothic"/>
-                <w:b/>
-                <w:i w:val="0"/>
-                <w:sz w:val="15"/>
-              </w:rPr>
-              <w:t>Δ [95% CI]</w:t>
-            </w:r>
-          </w:p>
-        </w:tc>
-        <w:tc>
-          <w:tcPr>
-            <w:tcW w:type="dxa" w:w="794"/>
-            <w:vAlign w:val="center"/>
-          </w:tcPr>
-          <w:p>
-            <w:pPr>
-              <w:spacing w:after="0" w:line="240" w:lineRule="auto"/>
-              <w:jc w:val="center"/>
-            </w:pPr>
-            <w:r/>
-            <w:r>
-              <w:rPr>
-                <w:rFonts w:ascii="Malgun Gothic" w:hAnsi="Malgun Gothic" w:eastAsia="Malgun Gothic" w:cs="Malgun Gothic"/>
-                <w:b/>
-                <w:i w:val="0"/>
-                <w:sz w:val="15"/>
-              </w:rPr>
-              <w:t>p</w:t>
-            </w:r>
-          </w:p>
-        </w:tc>
-        <w:tc>
-          <w:tcPr>
-            <w:tcW w:type="dxa" w:w="850"/>
-            <w:vAlign w:val="center"/>
-          </w:tcPr>
-          <w:p>
-            <w:pPr>
-              <w:spacing w:after="0" w:line="240" w:lineRule="auto"/>
-              <w:jc w:val="center"/>
-            </w:pPr>
-            <w:r/>
-            <w:r>
-              <w:rPr>
-                <w:rFonts w:ascii="Malgun Gothic" w:hAnsi="Malgun Gothic" w:eastAsia="Malgun Gothic" w:cs="Malgun Gothic"/>
-                <w:b/>
-                <w:i w:val="0"/>
-                <w:sz w:val="15"/>
-              </w:rPr>
-              <w:t>쌍 / 비영</w:t>
-            </w:r>
-          </w:p>
-        </w:tc>
-      </w:tr>
-      <w:tr>
-        <w:trPr>
-          <w:cantSplit/>
-        </w:trPr>
-        <w:tc>
-          <w:tcPr>
-            <w:tcW w:type="dxa" w:w="1361"/>
-            <w:vAlign w:val="center"/>
-          </w:tcPr>
-          <w:p>
-            <w:pPr>
-              <w:spacing w:after="0" w:line="240" w:lineRule="auto"/>
-              <w:jc w:val="left"/>
-            </w:pPr>
-            <w:r/>
-            <w:r>
-              <w:rPr>
-                <w:rFonts w:ascii="Malgun Gothic" w:hAnsi="Malgun Gothic" w:eastAsia="Malgun Gothic" w:cs="Malgun Gothic"/>
-                <w:b w:val="0"/>
-                <w:i w:val="0"/>
-                <w:sz w:val="15"/>
-              </w:rPr>
-              <w:t>LA−HR / R</w:t>
-            </w:r>
-          </w:p>
-        </w:tc>
-        <w:tc>
-          <w:tcPr>
-            <w:tcW w:type="dxa" w:w="1814"/>
-            <w:vAlign w:val="center"/>
-          </w:tcPr>
-          <w:p>
-            <w:pPr>
-              <w:spacing w:after="0" w:line="240" w:lineRule="auto"/>
-              <w:jc w:val="center"/>
-            </w:pPr>
-            <w:r/>
-            <w:r>
-              <w:rPr>
-                <w:rFonts w:ascii="Malgun Gothic" w:hAnsi="Malgun Gothic" w:eastAsia="Malgun Gothic" w:cs="Malgun Gothic"/>
-                <w:b w:val="0"/>
-                <w:i w:val="0"/>
-                <w:sz w:val="15"/>
-              </w:rPr>
-              <w:t>+0.264 [0.158, 0.367]</w:t>
-            </w:r>
-          </w:p>
-        </w:tc>
-        <w:tc>
-          <w:tcPr>
-            <w:tcW w:type="dxa" w:w="794"/>
-            <w:vAlign w:val="center"/>
-          </w:tcPr>
-          <w:p>
-            <w:pPr>
-              <w:spacing w:after="0" w:line="240" w:lineRule="auto"/>
-              <w:jc w:val="center"/>
-            </w:pPr>
-            <w:r/>
-            <w:r>
-              <w:rPr>
-                <w:rFonts w:ascii="Malgun Gothic" w:hAnsi="Malgun Gothic" w:eastAsia="Malgun Gothic" w:cs="Malgun Gothic"/>
-                <w:b w:val="0"/>
-                <w:i w:val="0"/>
-                <w:sz w:val="15"/>
-              </w:rPr>
-              <w:t>&lt;.001</w:t>
-            </w:r>
-          </w:p>
-        </w:tc>
-        <w:tc>
-          <w:tcPr>
-            <w:tcW w:type="dxa" w:w="850"/>
-            <w:vAlign w:val="center"/>
-          </w:tcPr>
-          <w:p>
-            <w:pPr>
-              <w:spacing w:after="0" w:line="240" w:lineRule="auto"/>
-              <w:jc w:val="center"/>
-            </w:pPr>
-            <w:r/>
-            <w:r>
-              <w:rPr>
-                <w:rFonts w:ascii="Malgun Gothic" w:hAnsi="Malgun Gothic" w:eastAsia="Malgun Gothic" w:cs="Malgun Gothic"/>
-                <w:b w:val="0"/>
-                <w:i w:val="0"/>
-                <w:sz w:val="15"/>
-              </w:rPr>
-              <w:t>20/14</w:t>
-            </w:r>
-          </w:p>
-        </w:tc>
-      </w:tr>
-      <w:tr>
-        <w:trPr>
-          <w:cantSplit/>
-        </w:trPr>
-        <w:tc>
-          <w:tcPr>
-            <w:tcW w:type="dxa" w:w="1361"/>
-            <w:vAlign w:val="center"/>
-          </w:tcPr>
-          <w:p>
-            <w:pPr>
-              <w:spacing w:after="0" w:line="240" w:lineRule="auto"/>
-              <w:jc w:val="left"/>
-            </w:pPr>
-            <w:r/>
-            <w:r>
-              <w:rPr>
-                <w:rFonts w:ascii="Malgun Gothic" w:hAnsi="Malgun Gothic" w:eastAsia="Malgun Gothic" w:cs="Malgun Gothic"/>
-                <w:b w:val="0"/>
-                <w:i w:val="0"/>
-                <w:sz w:val="15"/>
-              </w:rPr>
-              <w:t>LA−HR / LGR</w:t>
-            </w:r>
-          </w:p>
-        </w:tc>
-        <w:tc>
-          <w:tcPr>
-            <w:tcW w:type="dxa" w:w="1814"/>
-            <w:vAlign w:val="center"/>
-          </w:tcPr>
-          <w:p>
-            <w:pPr>
-              <w:spacing w:after="0" w:line="240" w:lineRule="auto"/>
-              <w:jc w:val="center"/>
-            </w:pPr>
-            <w:r/>
-            <w:r>
-              <w:rPr>
-                <w:rFonts w:ascii="Malgun Gothic" w:hAnsi="Malgun Gothic" w:eastAsia="Malgun Gothic" w:cs="Malgun Gothic"/>
-                <w:b w:val="0"/>
-                <w:i w:val="0"/>
-                <w:sz w:val="15"/>
-              </w:rPr>
-              <w:t>+0.517 [0.308, 0.717]</w:t>
-            </w:r>
-          </w:p>
-        </w:tc>
-        <w:tc>
-          <w:tcPr>
-            <w:tcW w:type="dxa" w:w="794"/>
-            <w:vAlign w:val="center"/>
-          </w:tcPr>
-          <w:p>
-            <w:pPr>
-              <w:spacing w:after="0" w:line="240" w:lineRule="auto"/>
-              <w:jc w:val="center"/>
-            </w:pPr>
-            <w:r/>
-            <w:r>
-              <w:rPr>
-                <w:rFonts w:ascii="Malgun Gothic" w:hAnsi="Malgun Gothic" w:eastAsia="Malgun Gothic" w:cs="Malgun Gothic"/>
-                <w:b w:val="0"/>
-                <w:i w:val="0"/>
-                <w:sz w:val="15"/>
-              </w:rPr>
-              <w:t>&lt;.001</w:t>
-            </w:r>
-          </w:p>
-        </w:tc>
-        <w:tc>
-          <w:tcPr>
-            <w:tcW w:type="dxa" w:w="850"/>
-            <w:vAlign w:val="center"/>
-          </w:tcPr>
-          <w:p>
-            <w:pPr>
-              <w:spacing w:after="0" w:line="240" w:lineRule="auto"/>
-              <w:jc w:val="center"/>
-            </w:pPr>
-            <w:r/>
-            <w:r>
-              <w:rPr>
-                <w:rFonts w:ascii="Malgun Gothic" w:hAnsi="Malgun Gothic" w:eastAsia="Malgun Gothic" w:cs="Malgun Gothic"/>
-                <w:b w:val="0"/>
-                <w:i w:val="0"/>
-                <w:sz w:val="15"/>
-              </w:rPr>
-              <w:t>20/12</w:t>
-            </w:r>
-          </w:p>
-        </w:tc>
-      </w:tr>
-      <w:tr>
-        <w:trPr>
-          <w:cantSplit/>
-        </w:trPr>
-        <w:tc>
-          <w:tcPr>
-            <w:tcW w:type="dxa" w:w="1361"/>
-            <w:vAlign w:val="center"/>
-          </w:tcPr>
-          <w:p>
-            <w:pPr>
-              <w:spacing w:after="0" w:line="240" w:lineRule="auto"/>
-              <w:jc w:val="left"/>
-            </w:pPr>
-            <w:r/>
-            <w:r>
-              <w:rPr>
-                <w:rFonts w:ascii="Malgun Gothic" w:hAnsi="Malgun Gothic" w:eastAsia="Malgun Gothic" w:cs="Malgun Gothic"/>
-                <w:b w:val="0"/>
-                <w:i w:val="0"/>
-                <w:sz w:val="15"/>
-              </w:rPr>
-              <w:t>LA−HR / CP</w:t>
-            </w:r>
-          </w:p>
-        </w:tc>
-        <w:tc>
-          <w:tcPr>
-            <w:tcW w:type="dxa" w:w="1814"/>
-            <w:vAlign w:val="center"/>
-          </w:tcPr>
-          <w:p>
-            <w:pPr>
-              <w:spacing w:after="0" w:line="240" w:lineRule="auto"/>
-              <w:jc w:val="center"/>
-            </w:pPr>
-            <w:r/>
-            <w:r>
-              <w:rPr>
-                <w:rFonts w:ascii="Malgun Gothic" w:hAnsi="Malgun Gothic" w:eastAsia="Malgun Gothic" w:cs="Malgun Gothic"/>
-                <w:b w:val="0"/>
-                <w:i w:val="0"/>
-                <w:sz w:val="15"/>
-              </w:rPr>
-              <w:t>−0.069 [−0.136, −0.004]</w:t>
-            </w:r>
-          </w:p>
-        </w:tc>
-        <w:tc>
-          <w:tcPr>
-            <w:tcW w:type="dxa" w:w="794"/>
-            <w:vAlign w:val="center"/>
-          </w:tcPr>
-          <w:p>
-            <w:pPr>
-              <w:spacing w:after="0" w:line="240" w:lineRule="auto"/>
-              <w:jc w:val="center"/>
-            </w:pPr>
-            <w:r/>
-            <w:r>
-              <w:rPr>
-                <w:rFonts w:ascii="Malgun Gothic" w:hAnsi="Malgun Gothic" w:eastAsia="Malgun Gothic" w:cs="Malgun Gothic"/>
-                <w:b w:val="0"/>
-                <w:i w:val="0"/>
-                <w:sz w:val="15"/>
-              </w:rPr>
-              <w:t>.077</w:t>
-            </w:r>
-          </w:p>
-        </w:tc>
-        <w:tc>
-          <w:tcPr>
-            <w:tcW w:type="dxa" w:w="850"/>
-            <w:vAlign w:val="center"/>
-          </w:tcPr>
-          <w:p>
-            <w:pPr>
-              <w:spacing w:after="0" w:line="240" w:lineRule="auto"/>
-              <w:jc w:val="center"/>
-            </w:pPr>
-            <w:r/>
-            <w:r>
-              <w:rPr>
-                <w:rFonts w:ascii="Malgun Gothic" w:hAnsi="Malgun Gothic" w:eastAsia="Malgun Gothic" w:cs="Malgun Gothic"/>
-                <w:b w:val="0"/>
-                <w:i w:val="0"/>
-                <w:sz w:val="15"/>
-              </w:rPr>
-              <w:t>20/13</w:t>
-            </w:r>
-          </w:p>
-        </w:tc>
-      </w:tr>
-      <w:tr>
-        <w:trPr>
-          <w:cantSplit/>
-        </w:trPr>
-        <w:tc>
-          <w:tcPr>
-            <w:tcW w:type="dxa" w:w="1361"/>
-            <w:vAlign w:val="center"/>
-          </w:tcPr>
-          <w:p>
-            <w:pPr>
-              <w:spacing w:after="0" w:line="240" w:lineRule="auto"/>
-              <w:jc w:val="left"/>
-            </w:pPr>
-            <w:r/>
-            <w:r>
-              <w:rPr>
-                <w:rFonts w:ascii="Malgun Gothic" w:hAnsi="Malgun Gothic" w:eastAsia="Malgun Gothic" w:cs="Malgun Gothic"/>
-                <w:b w:val="0"/>
-                <w:i w:val="0"/>
-                <w:sz w:val="15"/>
-              </w:rPr>
-              <w:t>LA−HR / AC</w:t>
-            </w:r>
-          </w:p>
-        </w:tc>
-        <w:tc>
-          <w:tcPr>
-            <w:tcW w:type="dxa" w:w="1814"/>
-            <w:vAlign w:val="center"/>
-          </w:tcPr>
-          <w:p>
-            <w:pPr>
-              <w:spacing w:after="0" w:line="240" w:lineRule="auto"/>
-              <w:jc w:val="center"/>
-            </w:pPr>
-            <w:r/>
-            <w:r>
-              <w:rPr>
-                <w:rFonts w:ascii="Malgun Gothic" w:hAnsi="Malgun Gothic" w:eastAsia="Malgun Gothic" w:cs="Malgun Gothic"/>
-                <w:b w:val="0"/>
-                <w:i w:val="0"/>
-                <w:sz w:val="15"/>
-              </w:rPr>
-              <w:t>+0.013 [−0.030, 0.070]</w:t>
-            </w:r>
-          </w:p>
-        </w:tc>
-        <w:tc>
-          <w:tcPr>
-            <w:tcW w:type="dxa" w:w="794"/>
-            <w:vAlign w:val="center"/>
-          </w:tcPr>
-          <w:p>
-            <w:pPr>
-              <w:spacing w:after="0" w:line="240" w:lineRule="auto"/>
-              <w:jc w:val="center"/>
-            </w:pPr>
-            <w:r/>
-            <w:r>
-              <w:rPr>
-                <w:rFonts w:ascii="Malgun Gothic" w:hAnsi="Malgun Gothic" w:eastAsia="Malgun Gothic" w:cs="Malgun Gothic"/>
-                <w:b w:val="0"/>
-                <w:i w:val="0"/>
-                <w:sz w:val="15"/>
-              </w:rPr>
-              <w:t>.784</w:t>
-            </w:r>
-          </w:p>
-        </w:tc>
-        <w:tc>
-          <w:tcPr>
-            <w:tcW w:type="dxa" w:w="850"/>
-            <w:vAlign w:val="center"/>
-          </w:tcPr>
-          <w:p>
-            <w:pPr>
-              <w:spacing w:after="0" w:line="240" w:lineRule="auto"/>
-              <w:jc w:val="center"/>
-            </w:pPr>
-            <w:r/>
-            <w:r>
-              <w:rPr>
-                <w:rFonts w:ascii="Malgun Gothic" w:hAnsi="Malgun Gothic" w:eastAsia="Malgun Gothic" w:cs="Malgun Gothic"/>
-                <w:b w:val="0"/>
-                <w:i w:val="0"/>
-                <w:sz w:val="15"/>
-              </w:rPr>
-              <w:t>20/20</w:t>
-            </w:r>
-          </w:p>
-        </w:tc>
-      </w:tr>
-      <w:tr>
-        <w:trPr>
-          <w:cantSplit/>
-        </w:trPr>
-        <w:tc>
-          <w:tcPr>
-            <w:tcW w:type="dxa" w:w="1361"/>
-            <w:vAlign w:val="center"/>
-          </w:tcPr>
-          <w:p>
-            <w:pPr>
-              <w:spacing w:after="0" w:line="240" w:lineRule="auto"/>
-              <w:jc w:val="left"/>
-            </w:pPr>
-            <w:r/>
-            <w:r>
-              <w:rPr>
-                <w:rFonts w:ascii="Malgun Gothic" w:hAnsi="Malgun Gothic" w:eastAsia="Malgun Gothic" w:cs="Malgun Gothic"/>
-                <w:b w:val="0"/>
-                <w:i w:val="0"/>
-                <w:sz w:val="15"/>
-              </w:rPr>
-              <w:t>P−HR / R</w:t>
-            </w:r>
-          </w:p>
-        </w:tc>
-        <w:tc>
-          <w:tcPr>
-            <w:tcW w:type="dxa" w:w="1814"/>
-            <w:vAlign w:val="center"/>
-          </w:tcPr>
-          <w:p>
-            <w:pPr>
-              <w:spacing w:after="0" w:line="240" w:lineRule="auto"/>
-              <w:jc w:val="center"/>
-            </w:pPr>
-            <w:r/>
-            <w:r>
-              <w:rPr>
-                <w:rFonts w:ascii="Malgun Gothic" w:hAnsi="Malgun Gothic" w:eastAsia="Malgun Gothic" w:cs="Malgun Gothic"/>
-                <w:b w:val="0"/>
-                <w:i w:val="0"/>
-                <w:sz w:val="15"/>
-              </w:rPr>
-              <w:t>+0.253 [0.161, 0.344]</w:t>
-            </w:r>
-          </w:p>
-        </w:tc>
-        <w:tc>
-          <w:tcPr>
-            <w:tcW w:type="dxa" w:w="794"/>
-            <w:vAlign w:val="center"/>
-          </w:tcPr>
-          <w:p>
-            <w:pPr>
-              <w:spacing w:after="0" w:line="240" w:lineRule="auto"/>
-              <w:jc w:val="center"/>
-            </w:pPr>
-            <w:r/>
-            <w:r>
-              <w:rPr>
-                <w:rFonts w:ascii="Malgun Gothic" w:hAnsi="Malgun Gothic" w:eastAsia="Malgun Gothic" w:cs="Malgun Gothic"/>
-                <w:b w:val="0"/>
-                <w:i w:val="0"/>
-                <w:sz w:val="15"/>
-              </w:rPr>
-              <w:t>&lt;.001</w:t>
-            </w:r>
-          </w:p>
-        </w:tc>
-        <w:tc>
-          <w:tcPr>
-            <w:tcW w:type="dxa" w:w="850"/>
-            <w:vAlign w:val="center"/>
-          </w:tcPr>
-          <w:p>
-            <w:pPr>
-              <w:spacing w:after="0" w:line="240" w:lineRule="auto"/>
-              <w:jc w:val="center"/>
-            </w:pPr>
-            <w:r/>
-            <w:r>
-              <w:rPr>
-                <w:rFonts w:ascii="Malgun Gothic" w:hAnsi="Malgun Gothic" w:eastAsia="Malgun Gothic" w:cs="Malgun Gothic"/>
-                <w:b w:val="0"/>
-                <w:i w:val="0"/>
-                <w:sz w:val="15"/>
-              </w:rPr>
-              <w:t>20/13</w:t>
-            </w:r>
-          </w:p>
-        </w:tc>
-      </w:tr>
-      <w:tr>
-        <w:trPr>
-          <w:cantSplit/>
-        </w:trPr>
-        <w:tc>
-          <w:tcPr>
-            <w:tcW w:type="dxa" w:w="1361"/>
-            <w:vAlign w:val="center"/>
-          </w:tcPr>
-          <w:p>
-            <w:pPr>
-              <w:spacing w:after="0" w:line="240" w:lineRule="auto"/>
-              <w:jc w:val="left"/>
-            </w:pPr>
-            <w:r/>
-            <w:r>
-              <w:rPr>
-                <w:rFonts w:ascii="Malgun Gothic" w:hAnsi="Malgun Gothic" w:eastAsia="Malgun Gothic" w:cs="Malgun Gothic"/>
-                <w:b w:val="0"/>
-                <w:i w:val="0"/>
-                <w:sz w:val="15"/>
-              </w:rPr>
-              <w:t>P−HR / LGR</w:t>
-            </w:r>
-          </w:p>
-        </w:tc>
-        <w:tc>
-          <w:tcPr>
-            <w:tcW w:type="dxa" w:w="1814"/>
-            <w:vAlign w:val="center"/>
-          </w:tcPr>
-          <w:p>
-            <w:pPr>
-              <w:spacing w:after="0" w:line="240" w:lineRule="auto"/>
-              <w:jc w:val="center"/>
-            </w:pPr>
-            <w:r/>
-            <w:r>
-              <w:rPr>
-                <w:rFonts w:ascii="Malgun Gothic" w:hAnsi="Malgun Gothic" w:eastAsia="Malgun Gothic" w:cs="Malgun Gothic"/>
-                <w:b w:val="0"/>
-                <w:i w:val="0"/>
-                <w:sz w:val="15"/>
-              </w:rPr>
-              <w:t>+0.475 [0.283, 0.667]</w:t>
-            </w:r>
-          </w:p>
-        </w:tc>
-        <w:tc>
-          <w:tcPr>
-            <w:tcW w:type="dxa" w:w="794"/>
-            <w:vAlign w:val="center"/>
-          </w:tcPr>
-          <w:p>
-            <w:pPr>
-              <w:spacing w:after="0" w:line="240" w:lineRule="auto"/>
-              <w:jc w:val="center"/>
-            </w:pPr>
-            <w:r/>
-            <w:r>
-              <w:rPr>
-                <w:rFonts w:ascii="Malgun Gothic" w:hAnsi="Malgun Gothic" w:eastAsia="Malgun Gothic" w:cs="Malgun Gothic"/>
-                <w:b w:val="0"/>
-                <w:i w:val="0"/>
-                <w:sz w:val="15"/>
-              </w:rPr>
-              <w:t>&lt;.001</w:t>
-            </w:r>
-          </w:p>
-        </w:tc>
-        <w:tc>
-          <w:tcPr>
-            <w:tcW w:type="dxa" w:w="850"/>
-            <w:vAlign w:val="center"/>
-          </w:tcPr>
-          <w:p>
-            <w:pPr>
-              <w:spacing w:after="0" w:line="240" w:lineRule="auto"/>
-              <w:jc w:val="center"/>
-            </w:pPr>
-            <w:r/>
-            <w:r>
-              <w:rPr>
-                <w:rFonts w:ascii="Malgun Gothic" w:hAnsi="Malgun Gothic" w:eastAsia="Malgun Gothic" w:cs="Malgun Gothic"/>
-                <w:b w:val="0"/>
-                <w:i w:val="0"/>
-                <w:sz w:val="15"/>
-              </w:rPr>
-              <w:t>20/12</w:t>
-            </w:r>
-          </w:p>
-        </w:tc>
-      </w:tr>
-      <w:tr>
-        <w:trPr>
-          <w:cantSplit/>
-        </w:trPr>
-        <w:tc>
-          <w:tcPr>
-            <w:tcW w:type="dxa" w:w="1361"/>
-            <w:vAlign w:val="center"/>
-          </w:tcPr>
-          <w:p>
-            <w:pPr>
-              <w:spacing w:after="0" w:line="240" w:lineRule="auto"/>
-              <w:jc w:val="left"/>
-            </w:pPr>
-            <w:r/>
-            <w:r>
-              <w:rPr>
-                <w:rFonts w:ascii="Malgun Gothic" w:hAnsi="Malgun Gothic" w:eastAsia="Malgun Gothic" w:cs="Malgun Gothic"/>
-                <w:b w:val="0"/>
-                <w:i w:val="0"/>
-                <w:sz w:val="15"/>
-              </w:rPr>
-              <w:t>P−HR / CP</w:t>
-            </w:r>
-          </w:p>
-        </w:tc>
-        <w:tc>
-          <w:tcPr>
-            <w:tcW w:type="dxa" w:w="1814"/>
-            <w:vAlign w:val="center"/>
-          </w:tcPr>
-          <w:p>
-            <w:pPr>
-              <w:spacing w:after="0" w:line="240" w:lineRule="auto"/>
-              <w:jc w:val="center"/>
-            </w:pPr>
-            <w:r/>
-            <w:r>
-              <w:rPr>
-                <w:rFonts w:ascii="Malgun Gothic" w:hAnsi="Malgun Gothic" w:eastAsia="Malgun Gothic" w:cs="Malgun Gothic"/>
-                <w:b w:val="0"/>
-                <w:i w:val="0"/>
-                <w:sz w:val="15"/>
-              </w:rPr>
-              <w:t>−0.023 [−0.075, 0.031]</w:t>
-            </w:r>
-          </w:p>
-        </w:tc>
-        <w:tc>
-          <w:tcPr>
-            <w:tcW w:type="dxa" w:w="794"/>
-            <w:vAlign w:val="center"/>
-          </w:tcPr>
-          <w:p>
-            <w:pPr>
-              <w:spacing w:after="0" w:line="240" w:lineRule="auto"/>
-              <w:jc w:val="center"/>
-            </w:pPr>
-            <w:r/>
-            <w:r>
-              <w:rPr>
-                <w:rFonts w:ascii="Malgun Gothic" w:hAnsi="Malgun Gothic" w:eastAsia="Malgun Gothic" w:cs="Malgun Gothic"/>
-                <w:b w:val="0"/>
-                <w:i w:val="0"/>
-                <w:sz w:val="15"/>
-              </w:rPr>
-              <w:t>.774</w:t>
-            </w:r>
-          </w:p>
-        </w:tc>
-        <w:tc>
-          <w:tcPr>
-            <w:tcW w:type="dxa" w:w="850"/>
-            <w:vAlign w:val="center"/>
-          </w:tcPr>
-          <w:p>
-            <w:pPr>
-              <w:spacing w:after="0" w:line="240" w:lineRule="auto"/>
-              <w:jc w:val="center"/>
-            </w:pPr>
-            <w:r/>
-            <w:r>
-              <w:rPr>
-                <w:rFonts w:ascii="Malgun Gothic" w:hAnsi="Malgun Gothic" w:eastAsia="Malgun Gothic" w:cs="Malgun Gothic"/>
-                <w:b w:val="0"/>
-                <w:i w:val="0"/>
-                <w:sz w:val="15"/>
-              </w:rPr>
-              <w:t>20/13</w:t>
-            </w:r>
-          </w:p>
-        </w:tc>
-      </w:tr>
-      <w:tr>
-        <w:trPr>
-          <w:cantSplit/>
-        </w:trPr>
-        <w:tc>
-          <w:tcPr>
-            <w:tcW w:type="dxa" w:w="1361"/>
-            <w:vAlign w:val="center"/>
-          </w:tcPr>
-          <w:p>
-            <w:pPr>
-              <w:spacing w:after="0" w:line="240" w:lineRule="auto"/>
-              <w:jc w:val="left"/>
-            </w:pPr>
-            <w:r/>
-            <w:r>
-              <w:rPr>
-                <w:rFonts w:ascii="Malgun Gothic" w:hAnsi="Malgun Gothic" w:eastAsia="Malgun Gothic" w:cs="Malgun Gothic"/>
-                <w:b w:val="0"/>
-                <w:i w:val="0"/>
-                <w:sz w:val="15"/>
-              </w:rPr>
-              <w:t>P−HR / AC</w:t>
-            </w:r>
-          </w:p>
-        </w:tc>
-        <w:tc>
-          <w:tcPr>
-            <w:tcW w:type="dxa" w:w="1814"/>
-            <w:vAlign w:val="center"/>
-          </w:tcPr>
-          <w:p>
-            <w:pPr>
-              <w:spacing w:after="0" w:line="240" w:lineRule="auto"/>
-              <w:jc w:val="center"/>
-            </w:pPr>
-            <w:r/>
-            <w:r>
-              <w:rPr>
-                <w:rFonts w:ascii="Malgun Gothic" w:hAnsi="Malgun Gothic" w:eastAsia="Malgun Gothic" w:cs="Malgun Gothic"/>
-                <w:b w:val="0"/>
-                <w:i w:val="0"/>
-                <w:sz w:val="15"/>
-              </w:rPr>
-              <w:t>+0.011 [−0.034, 0.071]</w:t>
-            </w:r>
-          </w:p>
-        </w:tc>
-        <w:tc>
-          <w:tcPr>
-            <w:tcW w:type="dxa" w:w="794"/>
-            <w:vAlign w:val="center"/>
-          </w:tcPr>
-          <w:p>
-            <w:pPr>
-              <w:spacing w:after="0" w:line="240" w:lineRule="auto"/>
-              <w:jc w:val="center"/>
-            </w:pPr>
-            <w:r/>
-            <w:r>
-              <w:rPr>
-                <w:rFonts w:ascii="Malgun Gothic" w:hAnsi="Malgun Gothic" w:eastAsia="Malgun Gothic" w:cs="Malgun Gothic"/>
-                <w:b w:val="0"/>
-                <w:i w:val="0"/>
-                <w:sz w:val="15"/>
-              </w:rPr>
-              <w:t>.596</w:t>
-            </w:r>
-          </w:p>
-        </w:tc>
-        <w:tc>
-          <w:tcPr>
-            <w:tcW w:type="dxa" w:w="850"/>
-            <w:vAlign w:val="center"/>
-          </w:tcPr>
-          <w:p>
-            <w:pPr>
-              <w:spacing w:after="0" w:line="240" w:lineRule="auto"/>
-              <w:jc w:val="center"/>
-            </w:pPr>
-            <w:r/>
-            <w:r>
-              <w:rPr>
-                <w:rFonts w:ascii="Malgun Gothic" w:hAnsi="Malgun Gothic" w:eastAsia="Malgun Gothic" w:cs="Malgun Gothic"/>
-                <w:b w:val="0"/>
-                <w:i w:val="0"/>
-                <w:sz w:val="15"/>
-              </w:rPr>
-              <w:t>20/20</w:t>
-            </w:r>
-          </w:p>
-        </w:tc>
-      </w:tr>
-      <w:tr>
-        <w:trPr>
-          <w:cantSplit/>
-        </w:trPr>
-        <w:tc>
-          <w:tcPr>
-            <w:tcW w:type="dxa" w:w="1361"/>
-            <w:vAlign w:val="center"/>
-          </w:tcPr>
-          <w:p>
-            <w:pPr>
-              <w:spacing w:after="0" w:line="240" w:lineRule="auto"/>
-              <w:jc w:val="left"/>
-            </w:pPr>
-            <w:r/>
-            <w:r>
-              <w:rPr>
-                <w:rFonts w:ascii="Malgun Gothic" w:hAnsi="Malgun Gothic" w:eastAsia="Malgun Gothic" w:cs="Malgun Gothic"/>
-                <w:b w:val="0"/>
-                <w:i w:val="0"/>
-                <w:sz w:val="15"/>
-              </w:rPr>
-              <w:t>P−LA / R</w:t>
-            </w:r>
-          </w:p>
-        </w:tc>
-        <w:tc>
-          <w:tcPr>
-            <w:tcW w:type="dxa" w:w="1814"/>
-            <w:vAlign w:val="center"/>
-          </w:tcPr>
-          <w:p>
-            <w:pPr>
-              <w:spacing w:after="0" w:line="240" w:lineRule="auto"/>
-              <w:jc w:val="center"/>
-            </w:pPr>
-            <w:r/>
-            <w:r>
-              <w:rPr>
-                <w:rFonts w:ascii="Malgun Gothic" w:hAnsi="Malgun Gothic" w:eastAsia="Malgun Gothic" w:cs="Malgun Gothic"/>
-                <w:b w:val="0"/>
-                <w:i w:val="0"/>
-                <w:sz w:val="15"/>
-              </w:rPr>
-              <w:t>−0.011 [−0.058, 0.025]</w:t>
-            </w:r>
-          </w:p>
-        </w:tc>
-        <w:tc>
-          <w:tcPr>
-            <w:tcW w:type="dxa" w:w="794"/>
-            <w:vAlign w:val="center"/>
-          </w:tcPr>
-          <w:p>
-            <w:pPr>
-              <w:spacing w:after="0" w:line="240" w:lineRule="auto"/>
-              <w:jc w:val="center"/>
-            </w:pPr>
-            <w:r/>
-            <w:r>
-              <w:rPr>
-                <w:rFonts w:ascii="Malgun Gothic" w:hAnsi="Malgun Gothic" w:eastAsia="Malgun Gothic" w:cs="Malgun Gothic"/>
-                <w:b w:val="0"/>
-                <w:i w:val="0"/>
-                <w:sz w:val="15"/>
-              </w:rPr>
-              <w:t>.750</w:t>
-            </w:r>
-          </w:p>
-        </w:tc>
-        <w:tc>
-          <w:tcPr>
-            <w:tcW w:type="dxa" w:w="850"/>
-            <w:vAlign w:val="center"/>
-          </w:tcPr>
-          <w:p>
-            <w:pPr>
-              <w:spacing w:after="0" w:line="240" w:lineRule="auto"/>
-              <w:jc w:val="center"/>
-            </w:pPr>
-            <w:r/>
-            <w:r>
-              <w:rPr>
-                <w:rFonts w:ascii="Malgun Gothic" w:hAnsi="Malgun Gothic" w:eastAsia="Malgun Gothic" w:cs="Malgun Gothic"/>
-                <w:b w:val="0"/>
-                <w:i w:val="0"/>
-                <w:sz w:val="15"/>
-              </w:rPr>
-              <w:t>20/4</w:t>
-            </w:r>
-          </w:p>
-        </w:tc>
-      </w:tr>
-      <w:tr>
-        <w:trPr>
-          <w:cantSplit/>
-        </w:trPr>
-        <w:tc>
-          <w:tcPr>
-            <w:tcW w:type="dxa" w:w="1361"/>
-            <w:vAlign w:val="center"/>
-          </w:tcPr>
-          <w:p>
-            <w:pPr>
-              <w:spacing w:after="0" w:line="240" w:lineRule="auto"/>
-              <w:jc w:val="left"/>
-            </w:pPr>
-            <w:r/>
-            <w:r>
-              <w:rPr>
-                <w:rFonts w:ascii="Malgun Gothic" w:hAnsi="Malgun Gothic" w:eastAsia="Malgun Gothic" w:cs="Malgun Gothic"/>
-                <w:b w:val="0"/>
-                <w:i w:val="0"/>
-                <w:sz w:val="15"/>
-              </w:rPr>
-              <w:t>P−LA / LGR</w:t>
-            </w:r>
-          </w:p>
-        </w:tc>
-        <w:tc>
-          <w:tcPr>
-            <w:tcW w:type="dxa" w:w="1814"/>
-            <w:vAlign w:val="center"/>
-          </w:tcPr>
-          <w:p>
-            <w:pPr>
-              <w:spacing w:after="0" w:line="240" w:lineRule="auto"/>
-              <w:jc w:val="center"/>
-            </w:pPr>
-            <w:r/>
-            <w:r>
-              <w:rPr>
-                <w:rFonts w:ascii="Malgun Gothic" w:hAnsi="Malgun Gothic" w:eastAsia="Malgun Gothic" w:cs="Malgun Gothic"/>
-                <w:b w:val="0"/>
-                <w:i w:val="0"/>
-                <w:sz w:val="15"/>
-              </w:rPr>
-              <w:t>−0.042 [−0.117, 0.017]</w:t>
-            </w:r>
-          </w:p>
-        </w:tc>
-        <w:tc>
-          <w:tcPr>
-            <w:tcW w:type="dxa" w:w="794"/>
-            <w:vAlign w:val="center"/>
-          </w:tcPr>
-          <w:p>
-            <w:pPr>
-              <w:spacing w:after="0" w:line="240" w:lineRule="auto"/>
-              <w:jc w:val="center"/>
-            </w:pPr>
-            <w:r/>
-            <w:r>
-              <w:rPr>
-                <w:rFonts w:ascii="Malgun Gothic" w:hAnsi="Malgun Gothic" w:eastAsia="Malgun Gothic" w:cs="Malgun Gothic"/>
-                <w:b w:val="0"/>
-                <w:i w:val="0"/>
-                <w:sz w:val="15"/>
-              </w:rPr>
-              <w:t>.500</w:t>
-            </w:r>
-          </w:p>
-        </w:tc>
-        <w:tc>
-          <w:tcPr>
-            <w:tcW w:type="dxa" w:w="850"/>
-            <w:vAlign w:val="center"/>
-          </w:tcPr>
-          <w:p>
-            <w:pPr>
-              <w:spacing w:after="0" w:line="240" w:lineRule="auto"/>
-              <w:jc w:val="center"/>
-            </w:pPr>
-            <w:r/>
-            <w:r>
-              <w:rPr>
-                <w:rFonts w:ascii="Malgun Gothic" w:hAnsi="Malgun Gothic" w:eastAsia="Malgun Gothic" w:cs="Malgun Gothic"/>
-                <w:b w:val="0"/>
-                <w:i w:val="0"/>
-                <w:sz w:val="15"/>
-              </w:rPr>
-              <w:t>20/3</w:t>
-            </w:r>
-          </w:p>
-        </w:tc>
-      </w:tr>
-      <w:tr>
-        <w:trPr>
-          <w:cantSplit/>
-        </w:trPr>
-        <w:tc>
-          <w:tcPr>
-            <w:tcW w:type="dxa" w:w="1361"/>
-            <w:vAlign w:val="center"/>
-          </w:tcPr>
-          <w:p>
-            <w:pPr>
-              <w:spacing w:after="0" w:line="240" w:lineRule="auto"/>
-              <w:jc w:val="left"/>
-            </w:pPr>
-            <w:r/>
-            <w:r>
-              <w:rPr>
-                <w:rFonts w:ascii="Malgun Gothic" w:hAnsi="Malgun Gothic" w:eastAsia="Malgun Gothic" w:cs="Malgun Gothic"/>
-                <w:b w:val="0"/>
-                <w:i w:val="0"/>
-                <w:sz w:val="15"/>
-              </w:rPr>
-              <w:t>P−LA / CP</w:t>
-            </w:r>
-          </w:p>
-        </w:tc>
-        <w:tc>
-          <w:tcPr>
-            <w:tcW w:type="dxa" w:w="1814"/>
-            <w:vAlign w:val="center"/>
-          </w:tcPr>
-          <w:p>
-            <w:pPr>
-              <w:spacing w:after="0" w:line="240" w:lineRule="auto"/>
-              <w:jc w:val="center"/>
-            </w:pPr>
-            <w:r/>
-            <w:r>
-              <w:rPr>
-                <w:rFonts w:ascii="Malgun Gothic" w:hAnsi="Malgun Gothic" w:eastAsia="Malgun Gothic" w:cs="Malgun Gothic"/>
-                <w:b w:val="0"/>
-                <w:i w:val="0"/>
-                <w:sz w:val="15"/>
-              </w:rPr>
-              <w:t>+0.046 [0.009, 0.089]</w:t>
-            </w:r>
-          </w:p>
-        </w:tc>
-        <w:tc>
-          <w:tcPr>
-            <w:tcW w:type="dxa" w:w="794"/>
-            <w:vAlign w:val="center"/>
-          </w:tcPr>
-          <w:p>
-            <w:pPr>
-              <w:spacing w:after="0" w:line="240" w:lineRule="auto"/>
-              <w:jc w:val="center"/>
-            </w:pPr>
-            <w:r/>
-            <w:r>
-              <w:rPr>
-                <w:rFonts w:ascii="Malgun Gothic" w:hAnsi="Malgun Gothic" w:eastAsia="Malgun Gothic" w:cs="Malgun Gothic"/>
-                <w:b w:val="0"/>
-                <w:i w:val="0"/>
-                <w:sz w:val="15"/>
-              </w:rPr>
-              <w:t>.067</w:t>
-            </w:r>
-          </w:p>
-        </w:tc>
-        <w:tc>
-          <w:tcPr>
-            <w:tcW w:type="dxa" w:w="850"/>
-            <w:vAlign w:val="center"/>
-          </w:tcPr>
-          <w:p>
-            <w:pPr>
-              <w:spacing w:after="0" w:line="240" w:lineRule="auto"/>
-              <w:jc w:val="center"/>
-            </w:pPr>
-            <w:r/>
-            <w:r>
-              <w:rPr>
-                <w:rFonts w:ascii="Malgun Gothic" w:hAnsi="Malgun Gothic" w:eastAsia="Malgun Gothic" w:cs="Malgun Gothic"/>
-                <w:b w:val="0"/>
-                <w:i w:val="0"/>
-                <w:sz w:val="15"/>
-              </w:rPr>
-              <w:t>20/14</w:t>
-            </w:r>
-          </w:p>
-        </w:tc>
-      </w:tr>
-      <w:tr>
-        <w:trPr>
-          <w:cantSplit/>
-        </w:trPr>
-        <w:tc>
-          <w:tcPr>
-            <w:tcW w:type="dxa" w:w="1361"/>
-            <w:vAlign w:val="center"/>
-          </w:tcPr>
-          <w:p>
-            <w:pPr>
-              <w:spacing w:after="0" w:line="240" w:lineRule="auto"/>
-              <w:jc w:val="left"/>
-            </w:pPr>
-            <w:r/>
-            <w:r>
-              <w:rPr>
-                <w:rFonts w:ascii="Malgun Gothic" w:hAnsi="Malgun Gothic" w:eastAsia="Malgun Gothic" w:cs="Malgun Gothic"/>
-                <w:b w:val="0"/>
-                <w:i w:val="0"/>
-                <w:sz w:val="15"/>
-              </w:rPr>
-              <w:t>P−LA / AC</w:t>
-            </w:r>
-          </w:p>
-        </w:tc>
-        <w:tc>
-          <w:tcPr>
-            <w:tcW w:type="dxa" w:w="1814"/>
-            <w:vAlign w:val="center"/>
-          </w:tcPr>
-          <w:p>
-            <w:pPr>
-              <w:spacing w:after="0" w:line="240" w:lineRule="auto"/>
-              <w:jc w:val="center"/>
-            </w:pPr>
-            <w:r/>
-            <w:r>
-              <w:rPr>
-                <w:rFonts w:ascii="Malgun Gothic" w:hAnsi="Malgun Gothic" w:eastAsia="Malgun Gothic" w:cs="Malgun Gothic"/>
-                <w:b w:val="0"/>
-                <w:i w:val="0"/>
-                <w:sz w:val="15"/>
-              </w:rPr>
-              <w:t>−0.002 [−0.022, 0.021]</w:t>
-            </w:r>
-          </w:p>
-        </w:tc>
-        <w:tc>
-          <w:tcPr>
-            <w:tcW w:type="dxa" w:w="794"/>
-            <w:vAlign w:val="center"/>
-          </w:tcPr>
-          <w:p>
-            <w:pPr>
-              <w:spacing w:after="0" w:line="240" w:lineRule="auto"/>
-              <w:jc w:val="center"/>
-            </w:pPr>
-            <w:r/>
-            <w:r>
-              <w:rPr>
-                <w:rFonts w:ascii="Malgun Gothic" w:hAnsi="Malgun Gothic" w:eastAsia="Malgun Gothic" w:cs="Malgun Gothic"/>
-                <w:b w:val="0"/>
-                <w:i w:val="0"/>
-                <w:sz w:val="15"/>
-              </w:rPr>
-              <w:t>.622</w:t>
-            </w:r>
-          </w:p>
-        </w:tc>
-        <w:tc>
-          <w:tcPr>
-            <w:tcW w:type="dxa" w:w="850"/>
-            <w:vAlign w:val="center"/>
-          </w:tcPr>
-          <w:p>
-            <w:pPr>
-              <w:spacing w:after="0" w:line="240" w:lineRule="auto"/>
-              <w:jc w:val="center"/>
-            </w:pPr>
-            <w:r/>
-            <w:r>
-              <w:rPr>
-                <w:rFonts w:ascii="Malgun Gothic" w:hAnsi="Malgun Gothic" w:eastAsia="Malgun Gothic" w:cs="Malgun Gothic"/>
-                <w:b w:val="0"/>
-                <w:i w:val="0"/>
-                <w:sz w:val="15"/>
-              </w:rPr>
-              <w:t>20/20</w:t>
-            </w:r>
-          </w:p>
-        </w:tc>
-      </w:tr>
-    </w:tbl>
     <w:p>
       <w:pPr>
         <w:spacing w:before="0" w:after="40" w:line="240" w:lineRule="auto"/>
@@ -2940,23 +2139,22 @@
           <w:i w:val="0"/>
           <w:sz w:val="18"/>
         </w:rPr>
-        <w:t>각 사례 점수를 3회 평균한 뒤 짝지었다. CI는 사례를 10,000회 재표집한 percentile bootstrap이고, p는 0 차이를 제외한 양측 exact Wilcoxon이다. p값은 다중 비교 보정 전 탐색값이며 일부 사례가 규정·링크를 공유한다. 개발 그래프 5건에서 hybrid_rerank/link_all/proposed의 Recall은 0.478/0.667/0.689, 링크 정답 Recall은 0.067/0.400/0.433이었다. 별도 신규 15건에서는 각각 0.622/0.911/0.889, 0.289/0.867/0.800이었다. 신규 그래프 15건은 승인 링크 36개 중 서로 다른 링크 15개를 골라 양쪽 원문을 바탕으로 LLM이 작성했고 검색 결과로 조정하지 않았다. 그러나 링크 자체에서 사례를 만들었으므로 링크 방식에 유리할 수 있으며, 신규 라벨은 아직 저자 검수 전이다.</w:t>
+        <w:t>출처별 결과와 군집 구간은 개발 사례와 링크 구성 신규 사례를 나누어 해석해야 함을 보여준다. k3는 부족한 선택을 최소 3개까지 보충하지만 정확한 근거 수를 고정하지 않아, 이 비교는 예산 민감도 분석이지 토큰 예산 통제 실험은 아니다. 링크 구성에 유리한 표본을 배제하지 못하므로 현장 질의 전반에 일반화하지 않는다.</w:t>
       </w:r>
     </w:p>
     <w:p>
       <w:pPr>
-        <w:keepNext/>
         <w:spacing w:before="0" w:after="40" w:line="240" w:lineRule="auto"/>
         <w:jc w:val="left"/>
       </w:pPr>
       <w:r>
         <w:rPr>
           <w:rFonts w:ascii="Malgun Gothic" w:hAnsi="Malgun Gothic" w:eastAsia="Malgun Gothic" w:cs="Malgun Gothic"/>
-          <w:b/>
-          <w:i w:val="0"/>
-          <w:sz w:val="20"/>
-        </w:rPr>
-        <w:t>4. 논의 및 결론</w:t>
+          <w:b w:val="0"/>
+          <w:i w:val="0"/>
+          <w:sz w:val="18"/>
+        </w:rPr>
+        <w:t>스냅샷은 Round 4 평가 시점 상태만 보존하며 과거 상태는 복원하지 못한다. 관리자는 링크 양 끝 구간을 선택하고 승인 상태·담당자·시각을 기록하지만, 의미상 승인 기준과 문서 개정·폐기 규칙은 확인되지 않았다. 승인 상태를 독립 품질 검증으로 해석해서는 안 된다.</w:t>
       </w:r>
     </w:p>
     <w:p>
@@ -2971,52 +2169,7 @@
           <w:i w:val="0"/>
           <w:sz w:val="18"/>
         </w:rPr>
-        <w:t>전체 그래프 사례에서 링크 기반 방식은 `hybrid_rerank`보다 Recall과 링크 정답 Recall을 크게 높였다. 선택 재정렬은 `link_all` 대비 평균 Recall을 0.011 낮추면서 CP를 0.046 높였다. CP의 bootstrap 구간은 양수였지만 exact Wilcoxon p=.067이므로 확정적 차이로 해석하지 않는다. 첫 재정렬도 `hybrid` 대비 Precision을 0.230에서 0.781, CP를 0.759에서 0.946으로 높였다.</w:t>
-      </w:r>
-    </w:p>
-    <w:p>
-      <w:pPr>
-        <w:spacing w:before="0" w:after="40" w:line="240" w:lineRule="auto"/>
-        <w:jc w:val="left"/>
-      </w:pPr>
-      <w:r>
-        <w:rPr>
-          <w:rFonts w:ascii="Malgun Gothic" w:hAnsi="Malgun Gothic" w:eastAsia="Malgun Gothic" w:cs="Malgun Gothic"/>
-          <w:b w:val="0"/>
-          <w:i w:val="0"/>
-          <w:sz w:val="18"/>
-        </w:rPr>
-        <w:t>이 검색 개선은 답변 정확도로 거의 이어지지 않았다: `hybrid_rerank`와 `proposed`의 AC는 0.745와 0.756으로 비슷하다. 생성 모델이 불완전한 근거의 빈틈을 보완했거나 RAGAS AC가 근거 품질 변화를 충분히 구분하지 못했을 수 있다. 같은 모델이 생성과 채점을 수행했으므로, 향후 규정 실무자의 블라인드 답변·근거 검수가 필요하다.</w:t>
-      </w:r>
-    </w:p>
-    <w:p>
-      <w:pPr>
-        <w:spacing w:before="0" w:after="40" w:line="240" w:lineRule="auto"/>
-        <w:jc w:val="left"/>
-      </w:pPr>
-      <w:r>
-        <w:rPr>
-          <w:rFonts w:ascii="Malgun Gothic" w:hAnsi="Malgun Gothic" w:eastAsia="Malgun Gothic" w:cs="Malgun Gothic"/>
-          <w:b w:val="0"/>
-          <w:i w:val="0"/>
-          <w:sz w:val="18"/>
-        </w:rPr>
-        <w:t>이 코퍼스의 그래프 Recall은 BM25(0.592), hybrid(0.521), dense(0.383) 순이었다. Dense 기준선은 조항 단위가 부모 청크의 임베딩을 물려받아 이웃 조항이 같은 점수로 묶이는 표현 한계가 있다. 따라서 관찰된 dense 열세는 이 기준선의 특성이며 일반적인 dense 검색의 한계로 확대하지 않는다.</w:t>
-      </w:r>
-    </w:p>
-    <w:p>
-      <w:pPr>
-        <w:spacing w:before="0" w:after="40" w:line="240" w:lineRule="auto"/>
-        <w:jc w:val="left"/>
-      </w:pPr>
-      <w:r>
-        <w:rPr>
-          <w:rFonts w:ascii="Malgun Gothic" w:hAnsi="Malgun Gothic" w:eastAsia="Malgun Gothic" w:cs="Malgun Gothic"/>
-          <w:b w:val="0"/>
-          <w:i w:val="0"/>
-          <w:sz w:val="18"/>
-        </w:rPr>
-        <w:t>결과는 승인 링크 기반 확장이 이 사례들에서 교차문서 근거 회수를 돕는다는 탐색적 근거다. 15/20 그래프 사례가 링크에서 초안된 점, 미검수 정답, 사례 간 규정·링크 공유, 실행 당시 승인 링크 스냅샷 부재가 일반화를 제한한다. 연결 근거가 누락되어도 현 시스템은 직접 근거로 답할 수 있고 이를 알리는 경고가 없다. 사람 검수, 링크 변경 이력 추적, 불완전 답변 경고를 검증하기 전에는 실제 운전 판단에 사용해서는 안 된다.</w:t>
+        <w:t>이 결과는 승인 링크 기반 확장이 이 평가 사례에서 교차문서 근거 회수를 돕는다는 탐색적 근거다. 전문가 독립 검수와 불일치 조정, 링크를 사전 선택하지 않은 holdout, 답변·인용의 블라인드 평가는 남아 있다. 연결 근거가 빠져도 시스템은 경고 없이 직접 근거만으로 답할 수 있으므로, 사람 검수와 안전성 검증 전에는 실제 운전 판단에 사용해서는 안 된다.</w:t>
       </w:r>
     </w:p>
     <w:p>

</xml_diff>

<commit_message>
paper: record Round 5 expert review
</commit_message>
<xml_diff>
--- a/paper/final/final_draft.docx
+++ b/paper/final/final_draft.docx
@@ -111,7 +111,7 @@
           <w:i w:val="0"/>
           <w:sz w:val="18"/>
         </w:rPr>
-        <w:t>링크에서 초안한 신규 사례의 정답 검수가 남아 있어, 결과는 탐색적 파이프라인 평가로 한정한다.</w:t>
+        <w:t>정답 라벨은 철도 운영기관 현업 전문가 1인의 체크리스트 검수를 거쳤지만, 신규 표본은 링크 구성에 조건부이므로 탐색적으로 해석한다.</w:t>
       </w:r>
     </w:p>
     <w:p>
@@ -287,7 +287,7 @@
           <w:i w:val="0"/>
           <w:sz w:val="18"/>
         </w:rPr>
-        <w:t>평가셋 v3은 existing_v2 17건(문서형 12, 그래프형 5)과 llm_drafted 20건(문서형 5, 그래프형 15)으로 구성된다. 일곱 변형 모두 37건에서 검색을 세 번 실행했다. hybrid_rerank_k3는 r1만 답변·RAGAS 평가를 하고 r2–r3은 검색 평가만 했다. 따라서 검색 평균은 세 반복, 해당 변형의 답변 지표 및 matched 답변 비교는 r1 결과다. 생성·평가 judge는 gpt-5.6-luna, 검색·평가 임베딩은 각각 text-embedding-3-small, text-embedding-3-large였다. 평가 시점 승인 링크 스냅샷에는 36개 행이 있으며 해시는 paper/experiments/provenance.md에 기록했다. task brief의 37개와 한 개 차이가 있다.</w:t>
+        <w:t>평가셋 v3은 existing_v2 17건(문서형 12, 그래프형 5)과 llm_drafted 20건(문서형 5, 그래프형 15)으로 구성된다. llm_drafted 20건은 철도 운영기관 현업 전문가 1인이 질문 현실성, 정답 근거 정확성, 참조 답변 정확성, 링크 필요성을 다루는 체크리스트로 검토해 모두 OK 판정(수정·삭제 0건)을 받았다. 일곱 변형 모두 37건에서 검색을 세 번 실행했다. hybrid_rerank_k3는 r1만 답변·RAGAS 평가를 하고 r2–r3은 검색 평가만 했다. 따라서 검색 평균은 세 반복, 해당 변형의 답변 지표 및 matched 답변 비교는 r1 결과다. 생성·평가 judge는 gpt-5.6-luna, 검색·평가 임베딩은 각각 text-embedding-3-small, text-embedding-3-large였다. 평가 시점 승인 링크 스냅샷에는 36개 행이 있으며 해시는 paper/experiments/provenance.md에 기록했다. task brief의 37개와 한 개 차이가 있다.</w:t>
       </w:r>
     </w:p>
     <w:p>
@@ -1775,7 +1775,7 @@
           <w:i w:val="0"/>
           <w:sz w:val="18"/>
         </w:rPr>
-        <w:t>군집은 같은 via_link 정답 끝점(문서 버전, 조항)을 공유하는 사례의 연결요소로 구성했다. 평가셋에 실제 link ID가 없어 끝점 공유를 군집의 대리 지표로 쓴다. 5개 개발 군집과 6개 신규 군집은 작아 CI를 확증적 추론으로 해석하지 않는다. 신규 그래프 사례 15건은 서로 다른 승인 링크와 양쪽 원문에서 초안되어 링크 조건부 평가일 수 있고, llm_drafted의 20개 정답은 아직 사람 검수 전이다.</w:t>
+        <w:t>군집은 같은 via_link 정답 끝점(문서 버전, 조항)을 공유하는 사례의 연결요소로 묶었으며, link ID가 없어 끝점 공유를 대리 지표로 썼다. 5개 개발·6개 신규 군집은 작아 CI는 확증적 추론이 아니다. 신규 그래프 15건은 승인 링크와 양 끝 원문에서 초안되어 해당 링크에 조건부인 표본이다.</w:t>
       </w:r>
     </w:p>
     <w:p>
@@ -1791,7 +1791,7 @@
           <w:i w:val="0"/>
           <w:sz w:val="18"/>
         </w:rPr>
-        <w:t>표 3. 선택 재정렬(proposed − link_all)의 출처별 문맥·답변 차이. CI는 링크 끝점 군집 bootstrap이며 탐색적이다.</w:t>
+        <w:t>표 3. proposed − link_all의 출처별 문맥·답변·지연 차이 (CI는 링크 끝점 군집 bootstrap이며 탐색적이다).</w:t>
       </w:r>
     </w:p>
     <w:tbl>
@@ -2108,7 +2108,7 @@
           <w:i w:val="0"/>
           <w:sz w:val="18"/>
         </w:rPr>
-        <w:t>proposed−k3의 matched r1 RAGAS 차이는 기존 사례에서 Context Precision −0.266 [−0.478, −0.099], Answer Correctness −0.022 [−0.120, +0.077], 신규 사례에서 각각 +0.020 [−0.047, +0.078], +0.031 [−0.043, +0.136]이었다. k3 답변 지표와 두 matched 차이는 한 반복만 있어 기술적으로 해석한다. 그래프 질의 평균 검색 지연은 k3 1.446초, link_all 2.157초, proposed 2.678초다. 같은 모델이 답변을 만들고 RAGAS를 채점했으며 블라인드 사람 평가는 수행하지 않았다. 토큰 및 금전 비용은 결과에 일관되게 기록되지 않아 비교하지 않았다.</w:t>
+        <w:t>proposed−k3의 matched r1 RAGAS Δ는 기존 사례에서 Context Precision −0.266 [−0.478, −0.099], Answer Correctness −0.022 [−0.120, +0.077], 신규 사례에서 각각 +0.020 [−0.047, +0.078], +0.031 [−0.043, +0.136]이다. k3 답변 지표와 두 matched 차이는 r1만 있어 기술적으로 해석한다. 그래프 질의 평균 지연은 k3/link_all/proposed 순으로 1.446/2.157/2.678초다. 답변 생성과 RAGAS 채점은 같은 모델이며 블라인드 사람 평가는 없었다. 비용은 일관되게 기록되지 않아 비교하지 않았다.</w:t>
       </w:r>
     </w:p>
     <w:p>
@@ -2169,7 +2169,7 @@
           <w:i w:val="0"/>
           <w:sz w:val="18"/>
         </w:rPr>
-        <w:t>이 결과는 승인 링크 기반 확장이 이 평가 사례에서 교차문서 근거 회수를 돕는다는 탐색적 근거다. 전문가 독립 검수와 불일치 조정, 링크를 사전 선택하지 않은 holdout, 답변·인용의 블라인드 평가는 남아 있다. 연결 근거가 빠져도 시스템은 경고 없이 직접 근거만으로 답할 수 있으므로, 사람 검수와 안전성 검증 전에는 실제 운전 판단에 사용해서는 안 된다.</w:t>
+        <w:t>이 결과는 승인 링크 기반 확장이 이 평가 사례에서 교차문서 근거 회수를 돕는다는 탐색적 근거다. 두 출처는 나누어 보고하지만 llm_drafted 사례는 링크에서 구성되어 독립 holdout이 아니므로 설계상 순환성은 남는다. 단일 평가자 검수로 평가자 간 일치도를 산출하지 않았고, 검수자는 링크 구조에 대해 블라인드되지 않았다. 연결 근거가 빠져도 시스템은 경고 없이 직접 근거만으로 답할 수 있으므로, 사람 검수와 안전성 검증 전에는 실제 운전 판단에 사용해서는 안 된다.</w:t>
       </w:r>
     </w:p>
     <w:p>

</xml_diff>